<commit_message>
poco prima di fare banca2
</commit_message>
<xml_diff>
--- a/dati/Manuale Utente.docx
+++ b/dati/Manuale Utente.docx
@@ -1377,15 +1377,7 @@
         <w:t xml:space="preserve"> </w:t>
       </w:r>
       <w:r>
-        <w:t xml:space="preserve">qui ho utilizzato le parentesi quadre </w:t>
-      </w:r>
-      <w:proofErr w:type="gramStart"/>
-      <w:r>
-        <w:t>‘[</w:t>
-      </w:r>
-      <w:proofErr w:type="gramEnd"/>
-      <w:r>
-        <w:t>…]’</w:t>
+        <w:t>qui ho utilizzato le parentesi quadre ‘[…]’</w:t>
       </w:r>
       <w:r>
         <w:t xml:space="preserve"> Quindi il nome del file sarà così costruito:</w:t>
@@ -1396,15 +1388,7 @@
         <w:pStyle w:val="Esempio"/>
       </w:pPr>
       <w:r>
-        <w:t>{prefx_</w:t>
-      </w:r>
-      <w:proofErr w:type="gramStart"/>
-      <w:r>
-        <w:t>std}_</w:t>
-      </w:r>
-      <w:proofErr w:type="gramEnd"/>
-      <w:r>
-        <w:t>{idBanca}_{periodo}_[{cardHolder}].csv</w:t>
+        <w:t>{prefx_std}_{idBanca}_{periodo}_[{cardHolder}].csv</w:t>
       </w:r>
     </w:p>
     <w:p>
@@ -1591,23 +1575,7 @@
         <w:pStyle w:val="Esempio"/>
       </w:pPr>
       <w:r>
-        <w:t xml:space="preserve">Banca </w:t>
-      </w:r>
-      <w:proofErr w:type="spellStart"/>
-      <w:r>
-        <w:t>BSICredit</w:t>
-      </w:r>
-      <w:proofErr w:type="spellEnd"/>
-      <w:r>
-        <w:t>\</w:t>
-      </w:r>
-      <w:proofErr w:type="spellStart"/>
-      <w:r>
-        <w:t>estrattoconto_BSI_Credit</w:t>
-      </w:r>
-      <w:proofErr w:type="spellEnd"/>
-      <w:r>
-        <w:t xml:space="preserve"> 2024-00_cla.csv</w:t>
+        <w:t>Banca BSICredit\estrattoconto_BSI_Credit 2024-00_cla.csv</w:t>
       </w:r>
     </w:p>
     <w:p>
@@ -1631,23 +1599,7 @@
         <w:pStyle w:val="Esempio"/>
       </w:pPr>
       <w:r>
-        <w:t xml:space="preserve">banca </w:t>
-      </w:r>
-      <w:proofErr w:type="spellStart"/>
-      <w:r>
-        <w:t>CarispCredit</w:t>
-      </w:r>
-      <w:proofErr w:type="spellEnd"/>
-      <w:r>
-        <w:t>\</w:t>
-      </w:r>
-      <w:proofErr w:type="spellStart"/>
-      <w:r>
-        <w:t>estrattoconto_TPay</w:t>
-      </w:r>
-      <w:proofErr w:type="spellEnd"/>
-      <w:r>
-        <w:t xml:space="preserve"> 2021-06-26_cla.csv</w:t>
+        <w:t>banca CarispCredit\estrattoconto_TPay 2021-06-26_cla.csv</w:t>
       </w:r>
     </w:p>
     <w:p>
@@ -1655,23 +1607,7 @@
         <w:pStyle w:val="Esempio"/>
       </w:pPr>
       <w:r>
-        <w:t xml:space="preserve">banca </w:t>
-      </w:r>
-      <w:proofErr w:type="spellStart"/>
-      <w:r>
-        <w:t>CarispCredit</w:t>
-      </w:r>
-      <w:proofErr w:type="spellEnd"/>
-      <w:r>
-        <w:t>\</w:t>
-      </w:r>
-      <w:proofErr w:type="spellStart"/>
-      <w:r>
-        <w:t>TPay</w:t>
-      </w:r>
-      <w:proofErr w:type="spellEnd"/>
-      <w:r>
-        <w:t xml:space="preserve"> 20-07-2023_cla.xls</w:t>
+        <w:t>banca CarispCredit\TPay 20-07-2023_cla.xls</w:t>
       </w:r>
     </w:p>
     <w:p>
@@ -1686,13 +1622,8 @@
       <w:pPr>
         <w:pStyle w:val="Esempio"/>
       </w:pPr>
-      <w:proofErr w:type="spellStart"/>
-      <w:r>
-        <w:t>paypal</w:t>
-      </w:r>
-      <w:proofErr w:type="spellEnd"/>
-      <w:r>
-        <w:t>\Estrattoconto_paypal-202401.CSV</w:t>
+      <w:r>
+        <w:t>paypal\Estrattoconto_paypal-202401.CSV</w:t>
       </w:r>
     </w:p>
     <w:p>
@@ -1867,7 +1798,7 @@
               </wp:anchor>
             </w:drawing>
           </mc:Choice>
-          <mc:Fallback xmlns:w16sdtfl="http://schemas.microsoft.com/office/word/2024/wordml/sdtformatlock" xmlns:w16du="http://schemas.microsoft.com/office/word/2023/wordml/word16du">
+          <mc:Fallback xmlns:w16du="http://schemas.microsoft.com/office/word/2023/wordml/word16du" xmlns:w16sdtfl="http://schemas.microsoft.com/office/word/2024/wordml/sdtformatlock">
             <w:pict>
               <v:shapetype w14:anchorId="7E0913A7" id="_x0000_t75" coordsize="21600,21600" o:spt="75" o:preferrelative="t" path="m@4@5l@4@11@9@11@9@5xe" filled="f" stroked="f">
                 <v:stroke joinstyle="miter"/>
@@ -1931,7 +1862,7 @@
               </wp:anchor>
             </w:drawing>
           </mc:Choice>
-          <mc:Fallback xmlns:w16sdtfl="http://schemas.microsoft.com/office/word/2024/wordml/sdtformatlock" xmlns:w16du="http://schemas.microsoft.com/office/word/2023/wordml/word16du">
+          <mc:Fallback xmlns:w16du="http://schemas.microsoft.com/office/word/2023/wordml/word16du" xmlns:w16sdtfl="http://schemas.microsoft.com/office/word/2024/wordml/sdtformatlock">
             <w:pict>
               <v:shape w14:anchorId="64E3F8A9" id="Input penna 4" o:spid="_x0000_s1026" type="#_x0000_t75" style="position:absolute;margin-left:157.35pt;margin-top:45.1pt;width:46.85pt;height:12.5pt;z-index:251663360;visibility:visible;mso-wrap-style:square;mso-wrap-distance-left:9pt;mso-wrap-distance-top:0;mso-wrap-distance-right:9pt;mso-wrap-distance-bottom:0;mso-position-horizontal:absolute;mso-position-horizontal-relative:text;mso-position-vertical:absolute;mso-position-vertical-relative:text" o:gfxdata="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">
                 <v:imagedata r:id="rId12" o:title=""/>
@@ -2026,25 +1957,7 @@
           <w:sz w:val="20"/>
           <w:szCs w:val="20"/>
         </w:rPr>
-        <w:t>Java (TM) SE Development Kit XX.</w:t>
-      </w:r>
-      <w:proofErr w:type="gramStart"/>
-      <w:r>
-        <w:rPr>
-          <w:rFonts w:ascii="Consolas" w:hAnsi="Consolas"/>
-          <w:sz w:val="20"/>
-          <w:szCs w:val="20"/>
-        </w:rPr>
-        <w:t>YY.ZZ</w:t>
-      </w:r>
-      <w:proofErr w:type="gramEnd"/>
-      <w:r>
-        <w:rPr>
-          <w:rFonts w:ascii="Consolas" w:hAnsi="Consolas"/>
-          <w:sz w:val="20"/>
-          <w:szCs w:val="20"/>
-        </w:rPr>
-        <w:t xml:space="preserve"> </w:t>
+        <w:t xml:space="preserve">Java (TM) SE Development Kit XX.YY.ZZ </w:t>
       </w:r>
       <w:r>
         <w:t>“ (chiamato JDK)</w:t>
@@ -2209,18 +2122,9 @@
           <w:b/>
           <w:bCs/>
         </w:rPr>
-        <w:t>xx.</w:t>
-      </w:r>
-      <w:proofErr w:type="gramStart"/>
-      <w:r>
-        <w:rPr>
-          <w:b/>
-          <w:bCs/>
-        </w:rPr>
-        <w:t>yy.zz</w:t>
+        <w:t>xx.yy.zz</w:t>
       </w:r>
       <w:proofErr w:type="spellEnd"/>
-      <w:proofErr w:type="gramEnd"/>
       <w:r>
         <w:rPr>
           <w:b/>
@@ -2578,7 +2482,7 @@
               </wp:anchor>
             </w:drawing>
           </mc:Choice>
-          <mc:Fallback xmlns:w16sdtfl="http://schemas.microsoft.com/office/word/2024/wordml/sdtformatlock" xmlns:w16du="http://schemas.microsoft.com/office/word/2023/wordml/word16du">
+          <mc:Fallback xmlns:w16du="http://schemas.microsoft.com/office/word/2023/wordml/word16du" xmlns:w16sdtfl="http://schemas.microsoft.com/office/word/2024/wordml/sdtformatlock">
             <w:pict>
               <v:shape w14:anchorId="5FF5076F" id="Input penna 3" o:spid="_x0000_s1026" type="#_x0000_t75" style="position:absolute;margin-left:40.45pt;margin-top:33.7pt;width:71.25pt;height:25.6pt;z-index:251662336;visibility:visible;mso-wrap-style:square;mso-wrap-distance-left:9pt;mso-wrap-distance-top:0;mso-wrap-distance-right:9pt;mso-wrap-distance-bottom:0;mso-position-horizontal:absolute;mso-position-horizontal-relative:text;mso-position-vertical:absolute;mso-position-vertical-relative:text" o:gfxdata="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">
                 <v:imagedata r:id="rId18" o:title=""/>
@@ -2902,13 +2806,8 @@
       </w:pPr>
       <w:r>
         <w:tab/>
-        <w:t xml:space="preserve">key = </w:t>
-      </w:r>
-      <w:proofErr w:type="spellStart"/>
-      <w:r>
-        <w:t>value</w:t>
-      </w:r>
-      <w:proofErr w:type="spellEnd"/>
+        <w:t>key = value</w:t>
+      </w:r>
     </w:p>
     <w:p>
       <w:r>
@@ -2919,19 +2818,9 @@
       <w:pPr>
         <w:pStyle w:val="Esempio"/>
       </w:pPr>
-      <w:proofErr w:type="spellStart"/>
-      <w:r>
-        <w:t>DB.Type</w:t>
-      </w:r>
-      <w:proofErr w:type="spellEnd"/>
-      <w:r>
-        <w:t>=</w:t>
-      </w:r>
-      <w:proofErr w:type="spellStart"/>
-      <w:r>
-        <w:t>SQLite</w:t>
-      </w:r>
-      <w:proofErr w:type="spellEnd"/>
+      <w:r>
+        <w:t>DB.Type=SQLite</w:t>
+      </w:r>
     </w:p>
     <w:p>
       <w:r>
@@ -2989,14 +2878,8 @@
     <w:p>
       <w:pPr>
         <w:pStyle w:val="Esempio"/>
-        <w:rPr>
-          <w:lang w:val="pt-PT"/>
-        </w:rPr>
-      </w:pPr>
-      <w:r>
-        <w:rPr>
-          <w:lang w:val="pt-PT"/>
-        </w:rPr>
+      </w:pPr>
+      <w:r>
         <w:t>cardid.assoc.001=84806;</w:t>
       </w:r>
       <w:r>
@@ -3006,14 +2889,8 @@
     <w:p>
       <w:pPr>
         <w:pStyle w:val="Esempio"/>
-        <w:rPr>
-          <w:lang w:val="pt-PT"/>
-        </w:rPr>
-      </w:pPr>
-      <w:r>
-        <w:rPr>
-          <w:lang w:val="pt-PT"/>
-        </w:rPr>
+      </w:pPr>
+      <w:r>
         <w:t>cardid.assoc.002=85928;eug</w:t>
       </w:r>
     </w:p>
@@ -3054,7 +2931,6 @@
       </w:r>
     </w:p>
     <w:p>
-      <w:proofErr w:type="gramStart"/>
       <w:r>
         <w:t xml:space="preserve">Nella </w:t>
       </w:r>
@@ -3065,7 +2941,6 @@
         </w:rPr>
         <w:t>key</w:t>
       </w:r>
-      <w:proofErr w:type="gramEnd"/>
       <w:r>
         <w:t xml:space="preserve"> il “.001”, “.002” è il progressivo di associazione di modo da creare una “key” univoca.</w:t>
       </w:r>
@@ -3687,10 +3562,57 @@
     </w:p>
     <w:p>
       <w:pPr>
+        <w:pStyle w:val="Titolo1"/>
+      </w:pPr>
+      <w:bookmarkStart w:id="11" w:name="_Toc225612085"/>
+      <w:r>
+        <w:lastRenderedPageBreak/>
+        <w:t>Imports dal WEB</w:t>
+      </w:r>
+    </w:p>
+    <w:p>
+      <w:pPr>
         <w:pStyle w:val="Titolo2"/>
       </w:pPr>
-      <w:bookmarkStart w:id="11" w:name="_Toc225612085"/>
-      <w:r>
+      <w:r>
+        <w:t>Import Cassa Risparmio</w:t>
+      </w:r>
+    </w:p>
+    <w:p>
+      <w:r>
+        <w:t xml:space="preserve">Andare sul sito: </w:t>
+      </w:r>
+      <w:hyperlink r:id="rId26" w:history="1">
+        <w:proofErr w:type="spellStart"/>
+        <w:r>
+          <w:rPr>
+            <w:rStyle w:val="Collegamentoipertestuale"/>
+          </w:rPr>
+          <w:t>Welly</w:t>
+        </w:r>
+        <w:proofErr w:type="spellEnd"/>
+      </w:hyperlink>
+    </w:p>
+    <w:p/>
+    <w:p>
+      <w:pPr>
+        <w:pStyle w:val="Titolo1"/>
+        <w:rPr>
+          <w:sz w:val="26"/>
+          <w:szCs w:val="26"/>
+        </w:rPr>
+      </w:pPr>
+      <w:r>
+        <w:lastRenderedPageBreak/>
+        <w:br w:type="page"/>
+      </w:r>
+    </w:p>
+    <w:p>
+      <w:pPr>
+        <w:pStyle w:val="Titolo2"/>
+      </w:pPr>
+      <w:r>
+        <w:lastRenderedPageBreak/>
         <w:t>Comunicazioni di Log</w:t>
       </w:r>
       <w:bookmarkEnd w:id="11"/>
@@ -3716,7 +3638,6 @@
         <w:pStyle w:val="immagine"/>
       </w:pPr>
       <w:r>
-        <w:lastRenderedPageBreak/>
         <w:drawing>
           <wp:inline distT="0" distB="0" distL="0" distR="0" wp14:anchorId="766E4D96" wp14:editId="03E52CE1">
             <wp:extent cx="6120130" cy="2268220"/>
@@ -3733,7 +3654,7 @@
                     <pic:cNvPicPr/>
                   </pic:nvPicPr>
                   <pic:blipFill>
-                    <a:blip r:embed="rId26"/>
+                    <a:blip r:embed="rId27"/>
                     <a:stretch>
                       <a:fillRect/>
                     </a:stretch>
@@ -3949,15 +3870,7 @@
     </w:p>
     <w:p>
       <w:r>
-        <w:t xml:space="preserve">Se siamo all’inizio possiamo costruire </w:t>
-      </w:r>
-      <w:proofErr w:type="gramStart"/>
-      <w:r>
-        <w:t>un fogli</w:t>
-      </w:r>
-      <w:proofErr w:type="gramEnd"/>
-      <w:r>
-        <w:t xml:space="preserve"> Excel che contenga le seguenti colonne:</w:t>
+        <w:t>Se siamo all’inizio possiamo costruire un fogli Excel che contenga le seguenti colonne:</w:t>
       </w:r>
     </w:p>
     <w:p>
@@ -5397,7 +5310,7 @@
                     </pic:cNvPicPr>
                   </pic:nvPicPr>
                   <pic:blipFill>
-                    <a:blip r:embed="rId27">
+                    <a:blip r:embed="rId28">
                       <a:extLst>
                         <a:ext uri="{28A0092B-C50C-407E-A947-70E740481C1C}">
                           <a14:useLocalDpi xmlns:a14="http://schemas.microsoft.com/office/drawing/2010/main" val="0"/>
@@ -5445,15 +5358,7 @@
     </w:p>
     <w:p>
       <w:r>
-        <w:t xml:space="preserve">Verranno emessi dei messaggi di warning se il programma rileva che esistono già delle assegnazioni di codici. </w:t>
-      </w:r>
-      <w:proofErr w:type="gramStart"/>
-      <w:r>
-        <w:t>E’</w:t>
-      </w:r>
-      <w:proofErr w:type="gramEnd"/>
-      <w:r>
-        <w:t xml:space="preserve"> vostra scelta, a questo punto, interrompere oppure proseguire.</w:t>
+        <w:t>Verranno emessi dei messaggi di warning se il programma rileva che esistono già delle assegnazioni di codici. E’ vostra scelta, a questo punto, interrompere oppure proseguire.</w:t>
       </w:r>
     </w:p>
     <w:p>
@@ -5643,7 +5548,7 @@
                     </pic:cNvPicPr>
                   </pic:nvPicPr>
                   <pic:blipFill>
-                    <a:blip r:embed="rId28">
+                    <a:blip r:embed="rId29">
                       <a:extLst>
                         <a:ext uri="{28A0092B-C50C-407E-A947-70E740481C1C}">
                           <a14:useLocalDpi xmlns:a14="http://schemas.microsoft.com/office/drawing/2010/main" val="0"/>
@@ -5727,7 +5632,7 @@
                     <pic:cNvPicPr/>
                   </pic:nvPicPr>
                   <pic:blipFill>
-                    <a:blip r:embed="rId29"/>
+                    <a:blip r:embed="rId30"/>
                     <a:stretch>
                       <a:fillRect/>
                     </a:stretch>
@@ -5786,15 +5691,7 @@
         <w:t>Individuare nella finestra delle registrazioni orfane che appartengono ad un singolo CdSt</w:t>
       </w:r>
       <w:r>
-        <w:t xml:space="preserve"> (</w:t>
-      </w:r>
-      <w:proofErr w:type="gramStart"/>
-      <w:r>
-        <w:t>nel esempio</w:t>
-      </w:r>
-      <w:proofErr w:type="gramEnd"/>
-      <w:r>
-        <w:t xml:space="preserve"> sotto sono le righe evidenziate in azzurro)</w:t>
+        <w:t xml:space="preserve"> (nel esempio sotto sono le righe evidenziate in azzurro)</w:t>
       </w:r>
     </w:p>
     <w:p>
@@ -5818,7 +5715,7 @@
                     <pic:cNvPicPr/>
                   </pic:nvPicPr>
                   <pic:blipFill>
-                    <a:blip r:embed="rId30"/>
+                    <a:blip r:embed="rId31"/>
                     <a:stretch>
                       <a:fillRect/>
                     </a:stretch>
@@ -5874,7 +5771,7 @@
                     </pic:cNvPicPr>
                   </pic:nvPicPr>
                   <pic:blipFill>
-                    <a:blip r:embed="rId31">
+                    <a:blip r:embed="rId32">
                       <a:extLst>
                         <a:ext uri="{28A0092B-C50C-407E-A947-70E740481C1C}">
                           <a14:useLocalDpi xmlns:a14="http://schemas.microsoft.com/office/drawing/2010/main" val="0"/>
@@ -5942,7 +5839,7 @@
                     </pic:cNvPicPr>
                   </pic:nvPicPr>
                   <pic:blipFill>
-                    <a:blip r:embed="rId32">
+                    <a:blip r:embed="rId33">
                       <a:extLst>
                         <a:ext uri="{28A0092B-C50C-407E-A947-70E740481C1C}">
                           <a14:useLocalDpi xmlns:a14="http://schemas.microsoft.com/office/drawing/2010/main" val="0"/>
@@ -6018,7 +5915,7 @@
     <w:p/>
     <w:p/>
     <w:sectPr>
-      <w:footerReference w:type="default" r:id="rId33"/>
+      <w:footerReference w:type="default" r:id="rId34"/>
       <w:pgSz w:w="11906" w:h="16838"/>
       <w:pgMar w:top="1417" w:right="1134" w:bottom="1134" w:left="1134" w:header="708" w:footer="708" w:gutter="0"/>
       <w:cols w:space="708"/>
@@ -6147,14 +6044,12 @@
     <w:r>
       <w:ptab w:relativeTo="margin" w:alignment="right" w:leader="none"/>
     </w:r>
-    <w:proofErr w:type="gramStart"/>
     <w:r>
       <w:t xml:space="preserve">1 </w:t>
     </w:r>
     <w:r>
       <w:t>Febbraio</w:t>
     </w:r>
-    <w:proofErr w:type="gramEnd"/>
     <w:r>
       <w:t xml:space="preserve"> 2025</w:t>
     </w:r>
@@ -8226,6 +8121,18 @@
       <w:color w:val="0A2F40" w:themeColor="accent1" w:themeShade="7F"/>
     </w:rPr>
   </w:style>
+  <w:style w:type="character" w:styleId="Menzionenonrisolta">
+    <w:name w:val="Unresolved Mention"/>
+    <w:basedOn w:val="Carpredefinitoparagrafo"/>
+    <w:uiPriority w:val="99"/>
+    <w:semiHidden/>
+    <w:unhideWhenUsed/>
+    <w:rsid w:val="00AB4308"/>
+    <w:rPr>
+      <w:color w:val="605E5C"/>
+      <w:shd w:val="clear" w:color="auto" w:fill="E1DFDD"/>
+    </w:rPr>
+  </w:style>
 </w:styles>
 </file>
 
@@ -8346,8 +8253,10 @@
   <w:rsids>
     <w:rsidRoot w:val="009D6C4A"/>
     <w:rsid w:val="000309D9"/>
+    <w:rsid w:val="001A749F"/>
     <w:rsid w:val="001E6126"/>
     <w:rsid w:val="002A7640"/>
+    <w:rsid w:val="00511BC8"/>
     <w:rsid w:val="005F05A4"/>
     <w:rsid w:val="006B62CD"/>
     <w:rsid w:val="006F5ECB"/>

</xml_diff>

<commit_message>
primo tentativo di riunificare Banca2 con il main
</commit_message>
<xml_diff>
--- a/dati/Manuale Utente.docx
+++ b/dati/Manuale Utente.docx
@@ -1,6 +1,6 @@
 
 <file path=word/document.xml><?xml version="1.0" encoding="utf-8"?>
-<w:document xmlns:wpc="http://schemas.microsoft.com/office/word/2010/wordprocessingCanvas" xmlns:cx="http://schemas.microsoft.com/office/drawing/2014/chartex" xmlns:cx1="http://schemas.microsoft.com/office/drawing/2015/9/8/chartex" xmlns:cx2="http://schemas.microsoft.com/office/drawing/2015/10/21/chartex" xmlns:cx3="http://schemas.microsoft.com/office/drawing/2016/5/9/chartex" xmlns:cx4="http://schemas.microsoft.com/office/drawing/2016/5/10/chartex" xmlns:cx5="http://schemas.microsoft.com/office/drawing/2016/5/11/chartex" xmlns:cx6="http://schemas.microsoft.com/office/drawing/2016/5/12/chartex" xmlns:cx7="http://schemas.microsoft.com/office/drawing/2016/5/13/chartex" xmlns:cx8="http://schemas.microsoft.com/office/drawing/2016/5/14/chartex" xmlns:mc="http://schemas.openxmlformats.org/markup-compatibility/2006" xmlns:aink="http://schemas.microsoft.com/office/drawing/2016/ink" xmlns:am3d="http://schemas.microsoft.com/office/drawing/2017/model3d" xmlns:o="urn:schemas-microsoft-com:office:office" xmlns:oel="http://schemas.microsoft.com/office/2019/extlst" xmlns:r="http://schemas.openxmlformats.org/officeDocument/2006/relationships" xmlns:m="http://schemas.openxmlformats.org/officeDocument/2006/math" xmlns:v="urn:schemas-microsoft-com:vml" xmlns:wp14="http://schemas.microsoft.com/office/word/2010/wordprocessingDrawing" xmlns:wp="http://schemas.openxmlformats.org/drawingml/2006/wordprocessingDrawing" xmlns:w10="urn:schemas-microsoft-com:office:word" xmlns:w="http://schemas.openxmlformats.org/wordprocessingml/2006/main" xmlns:w14="http://schemas.microsoft.com/office/word/2010/wordml" xmlns:w15="http://schemas.microsoft.com/office/word/2012/wordml" xmlns:w16cex="http://schemas.microsoft.com/office/word/2018/wordml/cex" xmlns:w16cid="http://schemas.microsoft.com/office/word/2016/wordml/cid" xmlns:w16="http://schemas.microsoft.com/office/word/2018/wordml" xmlns:w16du="http://schemas.microsoft.com/office/word/2023/wordml/word16du" xmlns:w16sdtdh="http://schemas.microsoft.com/office/word/2020/wordml/sdtdatahash" xmlns:w16sdtfl="http://schemas.microsoft.com/office/word/2024/wordml/sdtformatlock" xmlns:w16se="http://schemas.microsoft.com/office/word/2015/wordml/symex" xmlns:wpg="http://schemas.microsoft.com/office/word/2010/wordprocessingGroup" xmlns:wpi="http://schemas.microsoft.com/office/word/2010/wordprocessingInk" xmlns:wne="http://schemas.microsoft.com/office/word/2006/wordml" xmlns:wps="http://schemas.microsoft.com/office/word/2010/wordprocessingShape" mc:Ignorable="w14 w15 w16se w16cid w16 w16cex w16sdtdh w16sdtfl w16du wp14">
+<w:document xmlns:wpc="http://schemas.microsoft.com/office/word/2010/wordprocessingCanvas" xmlns:cx="http://schemas.microsoft.com/office/drawing/2014/chartex" xmlns:cx1="http://schemas.microsoft.com/office/drawing/2015/9/8/chartex" xmlns:cx2="http://schemas.microsoft.com/office/drawing/2015/10/21/chartex" xmlns:cx3="http://schemas.microsoft.com/office/drawing/2016/5/9/chartex" xmlns:cx4="http://schemas.microsoft.com/office/drawing/2016/5/10/chartex" xmlns:cx5="http://schemas.microsoft.com/office/drawing/2016/5/11/chartex" xmlns:cx6="http://schemas.microsoft.com/office/drawing/2016/5/12/chartex" xmlns:cx7="http://schemas.microsoft.com/office/drawing/2016/5/13/chartex" xmlns:cx8="http://schemas.microsoft.com/office/drawing/2016/5/14/chartex" xmlns:mc="http://schemas.openxmlformats.org/markup-compatibility/2006" xmlns:aink="http://schemas.microsoft.com/office/drawing/2016/ink" xmlns:am3d="http://schemas.microsoft.com/office/drawing/2017/model3d" xmlns:o="urn:schemas-microsoft-com:office:office" xmlns:oel="http://schemas.microsoft.com/office/2019/extlst" xmlns:r="http://schemas.openxmlformats.org/officeDocument/2006/relationships" xmlns:m="http://schemas.openxmlformats.org/officeDocument/2006/math" xmlns:v="urn:schemas-microsoft-com:vml" xmlns:wp14="http://schemas.microsoft.com/office/word/2010/wordprocessingDrawing" xmlns:wp="http://schemas.openxmlformats.org/drawingml/2006/wordprocessingDrawing" xmlns:w10="urn:schemas-microsoft-com:office:word" xmlns:w="http://schemas.openxmlformats.org/wordprocessingml/2006/main" xmlns:w14="http://schemas.microsoft.com/office/word/2010/wordml" xmlns:w15="http://schemas.microsoft.com/office/word/2012/wordml" xmlns:w16cex="http://schemas.microsoft.com/office/word/2018/wordml/cex" xmlns:w16cid="http://schemas.microsoft.com/office/word/2016/wordml/cid" xmlns:w16="http://schemas.microsoft.com/office/word/2018/wordml" xmlns:w16sdtdh="http://schemas.microsoft.com/office/word/2020/wordml/sdtdatahash" xmlns:w16se="http://schemas.microsoft.com/office/word/2015/wordml/symex" xmlns:wpg="http://schemas.microsoft.com/office/word/2010/wordprocessingGroup" xmlns:wpi="http://schemas.microsoft.com/office/word/2010/wordprocessingInk" xmlns:wne="http://schemas.microsoft.com/office/word/2006/wordml" xmlns:wps="http://schemas.microsoft.com/office/word/2010/wordprocessingShape" mc:Ignorable="w14 w15 w16se w16cid w16 w16cex w16sdtdh wp14">
   <w:body>
     <w:sdt>
       <w:sdtPr>
@@ -56,7 +56,7 @@
           <w:r>
             <w:fldChar w:fldCharType="separate"/>
           </w:r>
-          <w:hyperlink w:anchor="_Toc189322894" w:history="1">
+          <w:hyperlink w:anchor="_Toc225612074" w:history="1">
             <w:r>
               <w:rPr>
                 <w:rStyle w:val="Collegamentoipertestuale"/>
@@ -83,7 +83,7 @@
                 <w:noProof/>
                 <w:webHidden/>
               </w:rPr>
-              <w:instrText xml:space="preserve"> PAGEREF _Toc189322894 \h </w:instrText>
+              <w:instrText xml:space="preserve"> PAGEREF _Toc225612074 \h </w:instrText>
             </w:r>
             <w:r>
               <w:rPr>
@@ -127,7 +127,7 @@
               <w:lang w:eastAsia="it-IT"/>
             </w:rPr>
           </w:pPr>
-          <w:hyperlink w:anchor="_Toc189322895" w:history="1">
+          <w:hyperlink w:anchor="_Toc225612075" w:history="1">
             <w:r>
               <w:rPr>
                 <w:rStyle w:val="Collegamentoipertestuale"/>
@@ -154,7 +154,7 @@
                 <w:noProof/>
                 <w:webHidden/>
               </w:rPr>
-              <w:instrText xml:space="preserve"> PAGEREF _Toc189322895 \h </w:instrText>
+              <w:instrText xml:space="preserve"> PAGEREF _Toc225612075 \h </w:instrText>
             </w:r>
             <w:r>
               <w:rPr>
@@ -198,7 +198,7 @@
               <w:lang w:eastAsia="it-IT"/>
             </w:rPr>
           </w:pPr>
-          <w:hyperlink w:anchor="_Toc189322896" w:history="1">
+          <w:hyperlink w:anchor="_Toc225612076" w:history="1">
             <w:r>
               <w:rPr>
                 <w:rStyle w:val="Collegamentoipertestuale"/>
@@ -225,7 +225,7 @@
                 <w:noProof/>
                 <w:webHidden/>
               </w:rPr>
-              <w:instrText xml:space="preserve"> PAGEREF _Toc189322896 \h </w:instrText>
+              <w:instrText xml:space="preserve"> PAGEREF _Toc225612076 \h </w:instrText>
             </w:r>
             <w:r>
               <w:rPr>
@@ -269,7 +269,7 @@
               <w:lang w:eastAsia="it-IT"/>
             </w:rPr>
           </w:pPr>
-          <w:hyperlink w:anchor="_Toc189322897" w:history="1">
+          <w:hyperlink w:anchor="_Toc225612077" w:history="1">
             <w:r>
               <w:rPr>
                 <w:rStyle w:val="Collegamentoipertestuale"/>
@@ -296,7 +296,7 @@
                 <w:noProof/>
                 <w:webHidden/>
               </w:rPr>
-              <w:instrText xml:space="preserve"> PAGEREF _Toc189322897 \h </w:instrText>
+              <w:instrText xml:space="preserve"> PAGEREF _Toc225612077 \h </w:instrText>
             </w:r>
             <w:r>
               <w:rPr>
@@ -340,7 +340,7 @@
               <w:lang w:eastAsia="it-IT"/>
             </w:rPr>
           </w:pPr>
-          <w:hyperlink w:anchor="_Toc189322898" w:history="1">
+          <w:hyperlink w:anchor="_Toc225612078" w:history="1">
             <w:r>
               <w:rPr>
                 <w:rStyle w:val="Collegamentoipertestuale"/>
@@ -367,7 +367,7 @@
                 <w:noProof/>
                 <w:webHidden/>
               </w:rPr>
-              <w:instrText xml:space="preserve"> PAGEREF _Toc189322898 \h </w:instrText>
+              <w:instrText xml:space="preserve"> PAGEREF _Toc225612078 \h </w:instrText>
             </w:r>
             <w:r>
               <w:rPr>
@@ -411,7 +411,7 @@
               <w:lang w:eastAsia="it-IT"/>
             </w:rPr>
           </w:pPr>
-          <w:hyperlink w:anchor="_Toc189322899" w:history="1">
+          <w:hyperlink w:anchor="_Toc225612079" w:history="1">
             <w:r>
               <w:rPr>
                 <w:rStyle w:val="Collegamentoipertestuale"/>
@@ -438,7 +438,7 @@
                 <w:noProof/>
                 <w:webHidden/>
               </w:rPr>
-              <w:instrText xml:space="preserve"> PAGEREF _Toc189322899 \h </w:instrText>
+              <w:instrText xml:space="preserve"> PAGEREF _Toc225612079 \h </w:instrText>
             </w:r>
             <w:r>
               <w:rPr>
@@ -482,13 +482,13 @@
               <w:lang w:eastAsia="it-IT"/>
             </w:rPr>
           </w:pPr>
-          <w:hyperlink w:anchor="_Toc189322900" w:history="1">
+          <w:hyperlink w:anchor="_Toc225612080" w:history="1">
             <w:r>
               <w:rPr>
                 <w:rStyle w:val="Collegamentoipertestuale"/>
                 <w:noProof/>
               </w:rPr>
-              <w:t>Import dei dati</w:t>
+              <w:t>File properties “Banca.properties”</w:t>
             </w:r>
             <w:r>
               <w:rPr>
@@ -509,7 +509,7 @@
                 <w:noProof/>
                 <w:webHidden/>
               </w:rPr>
-              <w:instrText xml:space="preserve"> PAGEREF _Toc189322900 \h </w:instrText>
+              <w:instrText xml:space="preserve"> PAGEREF _Toc225612080 \h </w:instrText>
             </w:r>
             <w:r>
               <w:rPr>
@@ -553,13 +553,13 @@
               <w:lang w:eastAsia="it-IT"/>
             </w:rPr>
           </w:pPr>
-          <w:hyperlink w:anchor="_Toc189322901" w:history="1">
+          <w:hyperlink w:anchor="_Toc225612081" w:history="1">
             <w:r>
               <w:rPr>
                 <w:rStyle w:val="Collegamentoipertestuale"/>
                 <w:noProof/>
               </w:rPr>
-              <w:t>Struttura direttorio di Backup files CSV</w:t>
+              <w:t>“Cardid” Codici Card Holders</w:t>
             </w:r>
             <w:r>
               <w:rPr>
@@ -580,7 +580,7 @@
                 <w:noProof/>
                 <w:webHidden/>
               </w:rPr>
-              <w:instrText xml:space="preserve"> PAGEREF _Toc189322901 \h </w:instrText>
+              <w:instrText xml:space="preserve"> PAGEREF _Toc225612081 \h </w:instrText>
             </w:r>
             <w:r>
               <w:rPr>
@@ -601,6 +601,77 @@
                 <w:webHidden/>
               </w:rPr>
               <w:t>8</w:t>
+            </w:r>
+            <w:r>
+              <w:rPr>
+                <w:noProof/>
+                <w:webHidden/>
+              </w:rPr>
+              <w:fldChar w:fldCharType="end"/>
+            </w:r>
+          </w:hyperlink>
+        </w:p>
+        <w:p>
+          <w:pPr>
+            <w:pStyle w:val="Sommario1"/>
+            <w:tabs>
+              <w:tab w:val="right" w:leader="dot" w:pos="9628"/>
+            </w:tabs>
+            <w:rPr>
+              <w:rFonts w:asciiTheme="minorHAnsi" w:eastAsiaTheme="minorEastAsia" w:hAnsiTheme="minorHAnsi"/>
+              <w:noProof/>
+              <w:sz w:val="24"/>
+              <w:lang w:eastAsia="it-IT"/>
+            </w:rPr>
+          </w:pPr>
+          <w:hyperlink w:anchor="_Toc225612082" w:history="1">
+            <w:r>
+              <w:rPr>
+                <w:rStyle w:val="Collegamentoipertestuale"/>
+                <w:noProof/>
+              </w:rPr>
+              <w:t>Import dei dati</w:t>
+            </w:r>
+            <w:r>
+              <w:rPr>
+                <w:noProof/>
+                <w:webHidden/>
+              </w:rPr>
+              <w:tab/>
+            </w:r>
+            <w:r>
+              <w:rPr>
+                <w:noProof/>
+                <w:webHidden/>
+              </w:rPr>
+              <w:fldChar w:fldCharType="begin"/>
+            </w:r>
+            <w:r>
+              <w:rPr>
+                <w:noProof/>
+                <w:webHidden/>
+              </w:rPr>
+              <w:instrText xml:space="preserve"> PAGEREF _Toc225612082 \h </w:instrText>
+            </w:r>
+            <w:r>
+              <w:rPr>
+                <w:noProof/>
+                <w:webHidden/>
+              </w:rPr>
+            </w:r>
+            <w:r>
+              <w:rPr>
+                <w:noProof/>
+                <w:webHidden/>
+              </w:rPr>
+              <w:fldChar w:fldCharType="separate"/>
+            </w:r>
+            <w:r>
+              <w:rPr>
+                <w:noProof/>
+                <w:webHidden/>
+              </w:rPr>
+              <w:t>9</w:t>
             </w:r>
             <w:r>
               <w:rPr>
@@ -624,13 +695,13 @@
               <w:lang w:eastAsia="it-IT"/>
             </w:rPr>
           </w:pPr>
-          <w:hyperlink w:anchor="_Toc189322902" w:history="1">
+          <w:hyperlink w:anchor="_Toc225612083" w:history="1">
             <w:r>
               <w:rPr>
                 <w:rStyle w:val="Collegamentoipertestuale"/>
                 <w:noProof/>
               </w:rPr>
-              <w:t>Import dei files</w:t>
+              <w:t>Struttura direttorio di Backup files CSV</w:t>
             </w:r>
             <w:r>
               <w:rPr>
@@ -651,7 +722,7 @@
                 <w:noProof/>
                 <w:webHidden/>
               </w:rPr>
-              <w:instrText xml:space="preserve"> PAGEREF _Toc189322902 \h </w:instrText>
+              <w:instrText xml:space="preserve"> PAGEREF _Toc225612083 \h </w:instrText>
             </w:r>
             <w:r>
               <w:rPr>
@@ -695,12 +766,83 @@
               <w:lang w:eastAsia="it-IT"/>
             </w:rPr>
           </w:pPr>
-          <w:hyperlink w:anchor="_Toc189322903" w:history="1">
+          <w:hyperlink w:anchor="_Toc225612084" w:history="1">
             <w:r>
               <w:rPr>
                 <w:rStyle w:val="Collegamentoipertestuale"/>
                 <w:noProof/>
               </w:rPr>
+              <w:t>Import dei files</w:t>
+            </w:r>
+            <w:r>
+              <w:rPr>
+                <w:noProof/>
+                <w:webHidden/>
+              </w:rPr>
+              <w:tab/>
+            </w:r>
+            <w:r>
+              <w:rPr>
+                <w:noProof/>
+                <w:webHidden/>
+              </w:rPr>
+              <w:fldChar w:fldCharType="begin"/>
+            </w:r>
+            <w:r>
+              <w:rPr>
+                <w:noProof/>
+                <w:webHidden/>
+              </w:rPr>
+              <w:instrText xml:space="preserve"> PAGEREF _Toc225612084 \h </w:instrText>
+            </w:r>
+            <w:r>
+              <w:rPr>
+                <w:noProof/>
+                <w:webHidden/>
+              </w:rPr>
+            </w:r>
+            <w:r>
+              <w:rPr>
+                <w:noProof/>
+                <w:webHidden/>
+              </w:rPr>
+              <w:fldChar w:fldCharType="separate"/>
+            </w:r>
+            <w:r>
+              <w:rPr>
+                <w:noProof/>
+                <w:webHidden/>
+              </w:rPr>
+              <w:t>10</w:t>
+            </w:r>
+            <w:r>
+              <w:rPr>
+                <w:noProof/>
+                <w:webHidden/>
+              </w:rPr>
+              <w:fldChar w:fldCharType="end"/>
+            </w:r>
+          </w:hyperlink>
+        </w:p>
+        <w:p>
+          <w:pPr>
+            <w:pStyle w:val="Sommario2"/>
+            <w:tabs>
+              <w:tab w:val="right" w:leader="dot" w:pos="9628"/>
+            </w:tabs>
+            <w:rPr>
+              <w:rFonts w:asciiTheme="minorHAnsi" w:eastAsiaTheme="minorEastAsia" w:hAnsiTheme="minorHAnsi"/>
+              <w:noProof/>
+              <w:sz w:val="24"/>
+              <w:lang w:eastAsia="it-IT"/>
+            </w:rPr>
+          </w:pPr>
+          <w:hyperlink w:anchor="_Toc225612085" w:history="1">
+            <w:r>
+              <w:rPr>
+                <w:rStyle w:val="Collegamentoipertestuale"/>
+                <w:noProof/>
+              </w:rPr>
               <w:t>Comunicazioni di Log</w:t>
             </w:r>
             <w:r>
@@ -722,7 +864,7 @@
                 <w:noProof/>
                 <w:webHidden/>
               </w:rPr>
-              <w:instrText xml:space="preserve"> PAGEREF _Toc189322903 \h </w:instrText>
+              <w:instrText xml:space="preserve"> PAGEREF _Toc225612085 \h </w:instrText>
             </w:r>
             <w:r>
               <w:rPr>
@@ -742,7 +884,7 @@
                 <w:noProof/>
                 <w:webHidden/>
               </w:rPr>
-              <w:t>9</w:t>
+              <w:t>10</w:t>
             </w:r>
             <w:r>
               <w:rPr>
@@ -766,12 +908,83 @@
               <w:lang w:eastAsia="it-IT"/>
             </w:rPr>
           </w:pPr>
-          <w:hyperlink w:anchor="_Toc189322904" w:history="1">
+          <w:hyperlink w:anchor="_Toc225612086" w:history="1">
             <w:r>
               <w:rPr>
                 <w:rStyle w:val="Collegamentoipertestuale"/>
                 <w:noProof/>
               </w:rPr>
+              <w:t>Import codici Statistici</w:t>
+            </w:r>
+            <w:r>
+              <w:rPr>
+                <w:noProof/>
+                <w:webHidden/>
+              </w:rPr>
+              <w:tab/>
+            </w:r>
+            <w:r>
+              <w:rPr>
+                <w:noProof/>
+                <w:webHidden/>
+              </w:rPr>
+              <w:fldChar w:fldCharType="begin"/>
+            </w:r>
+            <w:r>
+              <w:rPr>
+                <w:noProof/>
+                <w:webHidden/>
+              </w:rPr>
+              <w:instrText xml:space="preserve"> PAGEREF _Toc225612086 \h </w:instrText>
+            </w:r>
+            <w:r>
+              <w:rPr>
+                <w:noProof/>
+                <w:webHidden/>
+              </w:rPr>
+            </w:r>
+            <w:r>
+              <w:rPr>
+                <w:noProof/>
+                <w:webHidden/>
+              </w:rPr>
+              <w:fldChar w:fldCharType="separate"/>
+            </w:r>
+            <w:r>
+              <w:rPr>
+                <w:noProof/>
+                <w:webHidden/>
+              </w:rPr>
+              <w:t>12</w:t>
+            </w:r>
+            <w:r>
+              <w:rPr>
+                <w:noProof/>
+                <w:webHidden/>
+              </w:rPr>
+              <w:fldChar w:fldCharType="end"/>
+            </w:r>
+          </w:hyperlink>
+        </w:p>
+        <w:p>
+          <w:pPr>
+            <w:pStyle w:val="Sommario1"/>
+            <w:tabs>
+              <w:tab w:val="right" w:leader="dot" w:pos="9628"/>
+            </w:tabs>
+            <w:rPr>
+              <w:rFonts w:asciiTheme="minorHAnsi" w:eastAsiaTheme="minorEastAsia" w:hAnsiTheme="minorHAnsi"/>
+              <w:noProof/>
+              <w:sz w:val="24"/>
+              <w:lang w:eastAsia="it-IT"/>
+            </w:rPr>
+          </w:pPr>
+          <w:hyperlink w:anchor="_Toc225612087" w:history="1">
+            <w:r>
+              <w:rPr>
+                <w:rStyle w:val="Collegamentoipertestuale"/>
+                <w:noProof/>
+              </w:rPr>
               <w:t>Indovina Codici Statistici</w:t>
             </w:r>
             <w:r>
@@ -793,7 +1006,7 @@
                 <w:noProof/>
                 <w:webHidden/>
               </w:rPr>
-              <w:instrText xml:space="preserve"> PAGEREF _Toc189322904 \h </w:instrText>
+              <w:instrText xml:space="preserve"> PAGEREF _Toc225612087 \h </w:instrText>
             </w:r>
             <w:r>
               <w:rPr>
@@ -813,7 +1026,7 @@
                 <w:noProof/>
                 <w:webHidden/>
               </w:rPr>
-              <w:t>11</w:t>
+              <w:t>13</w:t>
             </w:r>
             <w:r>
               <w:rPr>
@@ -837,7 +1050,7 @@
               <w:lang w:eastAsia="it-IT"/>
             </w:rPr>
           </w:pPr>
-          <w:hyperlink w:anchor="_Toc189322905" w:history="1">
+          <w:hyperlink w:anchor="_Toc225612088" w:history="1">
             <w:r>
               <w:rPr>
                 <w:rStyle w:val="Collegamentoipertestuale"/>
@@ -864,7 +1077,7 @@
                 <w:noProof/>
                 <w:webHidden/>
               </w:rPr>
-              <w:instrText xml:space="preserve"> PAGEREF _Toc189322905 \h </w:instrText>
+              <w:instrText xml:space="preserve"> PAGEREF _Toc225612088 \h </w:instrText>
             </w:r>
             <w:r>
               <w:rPr>
@@ -884,7 +1097,7 @@
                 <w:noProof/>
                 <w:webHidden/>
               </w:rPr>
-              <w:t>11</w:t>
+              <w:t>13</w:t>
             </w:r>
             <w:r>
               <w:rPr>
@@ -908,7 +1121,7 @@
               <w:lang w:eastAsia="it-IT"/>
             </w:rPr>
           </w:pPr>
-          <w:hyperlink w:anchor="_Toc189322906" w:history="1">
+          <w:hyperlink w:anchor="_Toc225612089" w:history="1">
             <w:r>
               <w:rPr>
                 <w:rStyle w:val="Collegamentoipertestuale"/>
@@ -935,7 +1148,7 @@
                 <w:noProof/>
                 <w:webHidden/>
               </w:rPr>
-              <w:instrText xml:space="preserve"> PAGEREF _Toc189322906 \h </w:instrText>
+              <w:instrText xml:space="preserve"> PAGEREF _Toc225612089 \h </w:instrText>
             </w:r>
             <w:r>
               <w:rPr>
@@ -955,7 +1168,7 @@
                 <w:noProof/>
                 <w:webHidden/>
               </w:rPr>
-              <w:t>12</w:t>
+              <w:t>14</w:t>
             </w:r>
             <w:r>
               <w:rPr>
@@ -994,7 +1207,7 @@
       <w:pPr>
         <w:pStyle w:val="Titolo1"/>
       </w:pPr>
-      <w:bookmarkStart w:id="0" w:name="_Toc189322894"/>
+      <w:bookmarkStart w:id="0" w:name="_Toc225612074"/>
       <w:r>
         <w:lastRenderedPageBreak/>
         <w:t>Preliminari</w:t>
@@ -1005,7 +1218,7 @@
       <w:pPr>
         <w:pStyle w:val="Titolo2"/>
       </w:pPr>
-      <w:bookmarkStart w:id="1" w:name="_Toc189322895"/>
+      <w:bookmarkStart w:id="1" w:name="_Toc225612075"/>
       <w:r>
         <w:t>Convenzione sui nomi dei files CSV</w:t>
       </w:r>
@@ -1032,24 +1245,84 @@
           <w:ilvl w:val="0"/>
           <w:numId w:val="6"/>
         </w:numPr>
-      </w:pPr>
-      <w:r>
-        <w:t xml:space="preserve">Id della sorgente (es: BSI, </w:t>
+        <w:rPr>
+          <w:lang w:val="es-ES"/>
+        </w:rPr>
+      </w:pPr>
+      <w:r>
+        <w:rPr>
+          <w:lang w:val="es-ES"/>
+        </w:rPr>
+        <w:t xml:space="preserve">Id </w:t>
       </w:r>
       <w:proofErr w:type="spellStart"/>
       <w:r>
+        <w:rPr>
+          <w:lang w:val="es-ES"/>
+        </w:rPr>
+        <w:t>della</w:t>
+      </w:r>
+      <w:proofErr w:type="spellEnd"/>
+      <w:r>
+        <w:rPr>
+          <w:lang w:val="es-ES"/>
+        </w:rPr>
+        <w:t xml:space="preserve"> </w:t>
+      </w:r>
+      <w:proofErr w:type="spellStart"/>
+      <w:r>
+        <w:rPr>
+          <w:lang w:val="es-ES"/>
+        </w:rPr>
+        <w:t>sorgente</w:t>
+      </w:r>
+      <w:proofErr w:type="spellEnd"/>
+      <w:r>
+        <w:rPr>
+          <w:lang w:val="es-ES"/>
+        </w:rPr>
+        <w:t xml:space="preserve"> (es: BSI, </w:t>
+      </w:r>
+      <w:proofErr w:type="spellStart"/>
+      <w:r>
+        <w:rPr>
+          <w:lang w:val="es-ES"/>
+        </w:rPr>
         <w:t>carisp</w:t>
       </w:r>
       <w:proofErr w:type="spellEnd"/>
       <w:r>
-        <w:t xml:space="preserve">, wise, </w:t>
+        <w:rPr>
+          <w:lang w:val="es-ES"/>
+        </w:rPr>
+        <w:t xml:space="preserve">, </w:t>
       </w:r>
       <w:proofErr w:type="spellStart"/>
       <w:r>
+        <w:rPr>
+          <w:lang w:val="es-ES"/>
+        </w:rPr>
+        <w:t>wise</w:t>
+      </w:r>
+      <w:proofErr w:type="spellEnd"/>
+      <w:r>
+        <w:rPr>
+          <w:lang w:val="es-ES"/>
+        </w:rPr>
+        <w:t xml:space="preserve">, </w:t>
+      </w:r>
+      <w:proofErr w:type="spellStart"/>
+      <w:r>
+        <w:rPr>
+          <w:lang w:val="es-ES"/>
+        </w:rPr>
         <w:t>etc</w:t>
       </w:r>
       <w:proofErr w:type="spellEnd"/>
       <w:r>
+        <w:rPr>
+          <w:lang w:val="es-ES"/>
+        </w:rPr>
         <w:t xml:space="preserve"> …)</w:t>
       </w:r>
     </w:p>
@@ -1234,6 +1507,38 @@
       <w:r>
         <w:t>) il titolare dell’estratto conto (se esiste)</w:t>
       </w:r>
+      <w:r>
+        <w:br/>
+        <w:t xml:space="preserve">es: </w:t>
+      </w:r>
+      <w:r>
+        <w:tab/>
+      </w:r>
+      <w:r>
+        <w:rPr>
+          <w:rFonts w:ascii="Consolas" w:hAnsi="Consolas"/>
+          <w:sz w:val="20"/>
+          <w:szCs w:val="22"/>
+        </w:rPr>
+        <w:t>SMAC\estrattoconto_SMAC_2522_</w:t>
+      </w:r>
+      <w:r>
+        <w:rPr>
+          <w:rFonts w:ascii="Consolas" w:hAnsi="Consolas"/>
+          <w:sz w:val="20"/>
+          <w:szCs w:val="22"/>
+          <w:highlight w:val="green"/>
+        </w:rPr>
+        <w:t>cla</w:t>
+      </w:r>
+      <w:r>
+        <w:rPr>
+          <w:rFonts w:ascii="Consolas" w:hAnsi="Consolas"/>
+          <w:sz w:val="20"/>
+          <w:szCs w:val="22"/>
+        </w:rPr>
+        <w:t>.csv</w:t>
+      </w:r>
     </w:p>
     <w:p>
       <w:r>
@@ -1270,23 +1575,7 @@
         <w:pStyle w:val="Esempio"/>
       </w:pPr>
       <w:r>
-        <w:t xml:space="preserve">Banca </w:t>
-      </w:r>
-      <w:proofErr w:type="spellStart"/>
-      <w:r>
-        <w:t>BSICredit</w:t>
-      </w:r>
-      <w:proofErr w:type="spellEnd"/>
-      <w:r>
-        <w:t>\</w:t>
-      </w:r>
-      <w:proofErr w:type="spellStart"/>
-      <w:r>
-        <w:t>estrattoconto_BSI_Credit</w:t>
-      </w:r>
-      <w:proofErr w:type="spellEnd"/>
-      <w:r>
-        <w:t xml:space="preserve"> 2024-00_cla.csv</w:t>
+        <w:t>Banca BSICredit\estrattoconto_BSI_Credit 2024-00_cla.csv</w:t>
       </w:r>
     </w:p>
     <w:p>
@@ -1310,23 +1599,7 @@
         <w:pStyle w:val="Esempio"/>
       </w:pPr>
       <w:r>
-        <w:t xml:space="preserve">banca </w:t>
-      </w:r>
-      <w:proofErr w:type="spellStart"/>
-      <w:r>
-        <w:t>CarispCredit</w:t>
-      </w:r>
-      <w:proofErr w:type="spellEnd"/>
-      <w:r>
-        <w:t>\</w:t>
-      </w:r>
-      <w:proofErr w:type="spellStart"/>
-      <w:r>
-        <w:t>estrattoconto_TPay</w:t>
-      </w:r>
-      <w:proofErr w:type="spellEnd"/>
-      <w:r>
-        <w:t xml:space="preserve"> 2021-06-26_cla.csv</w:t>
+        <w:t>banca CarispCredit\estrattoconto_TPay 2021-06-26_cla.csv</w:t>
       </w:r>
     </w:p>
     <w:p>
@@ -1334,23 +1607,7 @@
         <w:pStyle w:val="Esempio"/>
       </w:pPr>
       <w:r>
-        <w:t xml:space="preserve">banca </w:t>
-      </w:r>
-      <w:proofErr w:type="spellStart"/>
-      <w:r>
-        <w:t>CarispCredit</w:t>
-      </w:r>
-      <w:proofErr w:type="spellEnd"/>
-      <w:r>
-        <w:t>\</w:t>
-      </w:r>
-      <w:proofErr w:type="spellStart"/>
-      <w:r>
-        <w:t>TPay</w:t>
-      </w:r>
-      <w:proofErr w:type="spellEnd"/>
-      <w:r>
-        <w:t xml:space="preserve"> 20-07-2023_cla.xls</w:t>
+        <w:t>banca CarispCredit\TPay 20-07-2023_cla.xls</w:t>
       </w:r>
     </w:p>
     <w:p>
@@ -1365,13 +1622,8 @@
       <w:pPr>
         <w:pStyle w:val="Esempio"/>
       </w:pPr>
-      <w:proofErr w:type="spellStart"/>
-      <w:r>
-        <w:t>paypal</w:t>
-      </w:r>
-      <w:proofErr w:type="spellEnd"/>
-      <w:r>
-        <w:t>\Estrattoconto_paypal-202401.CSV</w:t>
+      <w:r>
+        <w:t>paypal\Estrattoconto_paypal-202401.CSV</w:t>
       </w:r>
     </w:p>
     <w:p>
@@ -1402,7 +1654,7 @@
       <w:pPr>
         <w:pStyle w:val="Titolo2"/>
       </w:pPr>
-      <w:bookmarkStart w:id="2" w:name="_Toc189322896"/>
+      <w:bookmarkStart w:id="2" w:name="_Toc225612076"/>
       <w:r>
         <w:lastRenderedPageBreak/>
         <w:t>Come verificare la runtime Java</w:t>
@@ -1546,7 +1798,7 @@
               </wp:anchor>
             </w:drawing>
           </mc:Choice>
-          <mc:Fallback>
+          <mc:Fallback xmlns:w16du="http://schemas.microsoft.com/office/word/2023/wordml/word16du" xmlns:w16sdtfl="http://schemas.microsoft.com/office/word/2024/wordml/sdtformatlock">
             <w:pict>
               <v:shapetype w14:anchorId="7E0913A7" id="_x0000_t75" coordsize="21600,21600" o:spt="75" o:preferrelative="t" path="m@4@5l@4@11@9@11@9@5xe" filled="f" stroked="f">
                 <v:stroke joinstyle="miter"/>
@@ -1610,7 +1862,7 @@
               </wp:anchor>
             </w:drawing>
           </mc:Choice>
-          <mc:Fallback>
+          <mc:Fallback xmlns:w16du="http://schemas.microsoft.com/office/word/2023/wordml/word16du" xmlns:w16sdtfl="http://schemas.microsoft.com/office/word/2024/wordml/sdtformatlock">
             <w:pict>
               <v:shape w14:anchorId="64E3F8A9" id="Input penna 4" o:spid="_x0000_s1026" type="#_x0000_t75" style="position:absolute;margin-left:157.35pt;margin-top:45.1pt;width:46.85pt;height:12.5pt;z-index:251663360;visibility:visible;mso-wrap-style:square;mso-wrap-distance-left:9pt;mso-wrap-distance-top:0;mso-wrap-distance-right:9pt;mso-wrap-distance-bottom:0;mso-position-horizontal:absolute;mso-position-horizontal-relative:text;mso-position-vertical:absolute;mso-position-vertical-relative:text" o:gfxdata="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">
                 <v:imagedata r:id="rId12" o:title=""/>
@@ -1749,7 +2001,7 @@
       <w:pPr>
         <w:pStyle w:val="Titolo2"/>
       </w:pPr>
-      <w:bookmarkStart w:id="3" w:name="_Toc189322897"/>
+      <w:bookmarkStart w:id="3" w:name="_Toc225612077"/>
       <w:r>
         <w:lastRenderedPageBreak/>
         <w:t>Verifica installazione di JavaFX</w:t>
@@ -1899,7 +2151,7 @@
       <w:pPr>
         <w:pStyle w:val="Titolo2"/>
       </w:pPr>
-      <w:bookmarkStart w:id="4" w:name="_Toc189322898"/>
+      <w:bookmarkStart w:id="4" w:name="_Toc225612078"/>
       <w:r>
         <w:t>Verifica delle variabili d’ambiente</w:t>
       </w:r>
@@ -2102,7 +2354,7 @@
       <w:pPr>
         <w:pStyle w:val="Titolo2"/>
       </w:pPr>
-      <w:bookmarkStart w:id="5" w:name="_Toc189322899"/>
+      <w:bookmarkStart w:id="5" w:name="_Toc225612079"/>
       <w:r>
         <w:t>Impostazione variabili d’ambiente</w:t>
       </w:r>
@@ -2230,7 +2482,7 @@
               </wp:anchor>
             </w:drawing>
           </mc:Choice>
-          <mc:Fallback>
+          <mc:Fallback xmlns:w16du="http://schemas.microsoft.com/office/word/2023/wordml/word16du" xmlns:w16sdtfl="http://schemas.microsoft.com/office/word/2024/wordml/sdtformatlock">
             <w:pict>
               <v:shape w14:anchorId="5FF5076F" id="Input penna 3" o:spid="_x0000_s1026" type="#_x0000_t75" style="position:absolute;margin-left:40.45pt;margin-top:33.7pt;width:71.25pt;height:25.6pt;z-index:251662336;visibility:visible;mso-wrap-style:square;mso-wrap-distance-left:9pt;mso-wrap-distance-top:0;mso-wrap-distance-right:9pt;mso-wrap-distance-bottom:0;mso-position-horizontal:absolute;mso-position-horizontal-relative:text;mso-position-vertical:absolute;mso-position-vertical-relative:text" o:gfxdata="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">
                 <v:imagedata r:id="rId18" o:title=""/>
@@ -2464,12 +2716,15 @@
     <w:p>
       <w:pPr>
         <w:pStyle w:val="Esempio"/>
-      </w:pPr>
-      <w:r>
-        <w:t xml:space="preserve">“JAVAFX_HOME” = </w:t>
-      </w:r>
-      <w:r>
-        <w:t>"C:\Program Files\Java\javafx-sdk-23.0.1"</w:t>
+        <w:rPr>
+          <w:lang w:val="fr-FR"/>
+        </w:rPr>
+      </w:pPr>
+      <w:r>
+        <w:rPr>
+          <w:lang w:val="fr-FR"/>
+        </w:rPr>
+        <w:t>“JAVAFX_HOME” = "C:\Program Files\Java\javafx-sdk-23.0.1"</w:t>
       </w:r>
     </w:p>
     <w:p>
@@ -2513,27 +2768,204 @@
         <w:t>Verifica delle variabili d’ambiente”</w:t>
       </w:r>
     </w:p>
+    <w:p>
+      <w:pPr>
+        <w:pStyle w:val="Titolo1"/>
+      </w:pPr>
+      <w:bookmarkStart w:id="6" w:name="_Toc225612080"/>
+      <w:r>
+        <w:lastRenderedPageBreak/>
+        <w:t>File properties “</w:t>
+      </w:r>
+      <w:proofErr w:type="spellStart"/>
+      <w:r>
+        <w:t>Banca.properties</w:t>
+      </w:r>
+      <w:proofErr w:type="spellEnd"/>
+      <w:r>
+        <w:t>”</w:t>
+      </w:r>
+      <w:bookmarkEnd w:id="6"/>
+    </w:p>
+    <w:p>
+      <w:r>
+        <w:t>Il file di properties “</w:t>
+      </w:r>
+      <w:proofErr w:type="spellStart"/>
+      <w:r>
+        <w:t>Banca.properties</w:t>
+      </w:r>
+      <w:proofErr w:type="spellEnd"/>
+      <w:r>
+        <w:t>” contiene varie categorie di valori della serie:</w:t>
+      </w:r>
+    </w:p>
+    <w:p>
+      <w:pPr>
+        <w:pStyle w:val="Esempio"/>
+      </w:pPr>
+      <w:r>
+        <w:tab/>
+        <w:t>key = value</w:t>
+      </w:r>
+    </w:p>
+    <w:p>
+      <w:r>
+        <w:t>esempio per la categoria “DB”:</w:t>
+      </w:r>
+    </w:p>
+    <w:p>
+      <w:pPr>
+        <w:pStyle w:val="Esempio"/>
+      </w:pPr>
+      <w:r>
+        <w:t>DB.Type=SQLite</w:t>
+      </w:r>
+    </w:p>
+    <w:p>
+      <w:r>
+        <w:t xml:space="preserve">Qui si specifica che per la categoria del </w:t>
+      </w:r>
+      <w:proofErr w:type="spellStart"/>
+      <w:r>
+        <w:rPr>
+          <w:i/>
+          <w:iCs/>
+        </w:rPr>
+        <w:t>DataBase</w:t>
+      </w:r>
+      <w:proofErr w:type="spellEnd"/>
+      <w:r>
+        <w:rPr>
+          <w:i/>
+          <w:iCs/>
+        </w:rPr>
+        <w:t xml:space="preserve"> </w:t>
+      </w:r>
+      <w:r>
+        <w:t>il tipo di motore è “</w:t>
+      </w:r>
+      <w:proofErr w:type="spellStart"/>
+      <w:r>
+        <w:t>SQLite</w:t>
+      </w:r>
+      <w:proofErr w:type="spellEnd"/>
+      <w:r>
+        <w:t>”. Vedi elenco categorie completo qui di seguito</w:t>
+      </w:r>
+    </w:p>
+    <w:p>
+      <w:pPr>
+        <w:pStyle w:val="Titolo2"/>
+      </w:pPr>
+      <w:bookmarkStart w:id="7" w:name="_Toc225612081"/>
+      <w:r>
+        <w:t>“Cardid” Codici Card Holders</w:t>
+      </w:r>
+      <w:bookmarkEnd w:id="7"/>
+    </w:p>
+    <w:p>
+      <w:r>
+        <w:t xml:space="preserve">Con questi valori si associa i codici forniti dagli enti </w:t>
+      </w:r>
+      <w:r>
+        <w:t>all’Holder</w:t>
+      </w:r>
+      <w:r>
+        <w:t xml:space="preserve"> fisico (persona fisica) a cui appartiene l’eventuale Carta di Credito/Debito. Esempio:</w:t>
+      </w:r>
+    </w:p>
+    <w:p>
+      <w:pPr>
+        <w:pStyle w:val="Esempio"/>
+      </w:pPr>
+      <w:r>
+        <w:t>cardid.assoc.001=84806;</w:t>
+      </w:r>
+      <w:r>
+        <w:t>cla</w:t>
+      </w:r>
+    </w:p>
+    <w:p>
+      <w:pPr>
+        <w:pStyle w:val="Esempio"/>
+      </w:pPr>
+      <w:r>
+        <w:t>cardid.assoc.002=85928;eug</w:t>
+      </w:r>
+    </w:p>
+    <w:p>
+      <w:r>
+        <w:t>Qui viene specificato che se trovo il codice “</w:t>
+      </w:r>
+      <w:r>
+        <w:t>84806</w:t>
+      </w:r>
+      <w:r>
+        <w:t>” allora la carta è di “</w:t>
+      </w:r>
+      <w:proofErr w:type="spellStart"/>
+      <w:r>
+        <w:t>cla</w:t>
+      </w:r>
+      <w:proofErr w:type="spellEnd"/>
+      <w:r>
+        <w:t>”, se trovo “</w:t>
+      </w:r>
+      <w:r>
+        <w:t>85928</w:t>
+      </w:r>
+      <w:r>
+        <w:t>” allora è di “</w:t>
+      </w:r>
+      <w:proofErr w:type="spellStart"/>
+      <w:r>
+        <w:t>eug</w:t>
+      </w:r>
+      <w:proofErr w:type="spellEnd"/>
+      <w:r>
+        <w:t>”</w:t>
+      </w:r>
+      <w:r>
+        <w:t>.</w:t>
+      </w:r>
+    </w:p>
+    <w:p>
+      <w:r>
+        <w:t xml:space="preserve">Nella </w:t>
+      </w:r>
+      <w:r>
+        <w:rPr>
+          <w:i/>
+          <w:iCs/>
+        </w:rPr>
+        <w:t>key</w:t>
+      </w:r>
+      <w:r>
+        <w:t xml:space="preserve"> il “.001”, “.002” è il progressivo di associazione di modo da creare una “key” univoca.</w:t>
+      </w:r>
+    </w:p>
     <w:p/>
     <w:p>
       <w:pPr>
         <w:pStyle w:val="Titolo1"/>
       </w:pPr>
-      <w:bookmarkStart w:id="6" w:name="_Toc189322900"/>
+      <w:bookmarkStart w:id="8" w:name="_Toc225612082"/>
       <w:r>
         <w:lastRenderedPageBreak/>
         <w:t>Import dei dati</w:t>
       </w:r>
-      <w:bookmarkEnd w:id="6"/>
+      <w:bookmarkEnd w:id="8"/>
     </w:p>
     <w:p>
       <w:pPr>
         <w:pStyle w:val="Titolo2"/>
       </w:pPr>
-      <w:bookmarkStart w:id="7" w:name="_Toc189322901"/>
+      <w:bookmarkStart w:id="9" w:name="_Toc225612083"/>
       <w:r>
         <w:t>Struttura direttorio di Backup files CSV</w:t>
       </w:r>
-      <w:bookmarkEnd w:id="7"/>
+      <w:bookmarkEnd w:id="9"/>
     </w:p>
     <w:p>
       <w:r>
@@ -2722,11 +3154,11 @@
       <w:pPr>
         <w:pStyle w:val="Titolo2"/>
       </w:pPr>
-      <w:bookmarkStart w:id="8" w:name="_Toc189322902"/>
+      <w:bookmarkStart w:id="10" w:name="_Toc225612084"/>
       <w:r>
         <w:t>Import dei files</w:t>
       </w:r>
-      <w:bookmarkEnd w:id="8"/>
+      <w:bookmarkEnd w:id="10"/>
     </w:p>
     <w:p>
       <w:r>
@@ -3130,13 +3562,60 @@
     </w:p>
     <w:p>
       <w:pPr>
+        <w:pStyle w:val="Titolo1"/>
+      </w:pPr>
+      <w:bookmarkStart w:id="11" w:name="_Toc225612085"/>
+      <w:r>
+        <w:lastRenderedPageBreak/>
+        <w:t>Imports dal WEB</w:t>
+      </w:r>
+    </w:p>
+    <w:p>
+      <w:pPr>
         <w:pStyle w:val="Titolo2"/>
       </w:pPr>
-      <w:bookmarkStart w:id="9" w:name="_Toc189322903"/>
-      <w:r>
+      <w:r>
+        <w:t>Import Cassa Risparmio</w:t>
+      </w:r>
+    </w:p>
+    <w:p>
+      <w:r>
+        <w:t xml:space="preserve">Andare sul sito: </w:t>
+      </w:r>
+      <w:hyperlink r:id="rId26" w:history="1">
+        <w:proofErr w:type="spellStart"/>
+        <w:r>
+          <w:rPr>
+            <w:rStyle w:val="Collegamentoipertestuale"/>
+          </w:rPr>
+          <w:t>Welly</w:t>
+        </w:r>
+        <w:proofErr w:type="spellEnd"/>
+      </w:hyperlink>
+    </w:p>
+    <w:p/>
+    <w:p>
+      <w:pPr>
+        <w:pStyle w:val="Titolo1"/>
+        <w:rPr>
+          <w:sz w:val="26"/>
+          <w:szCs w:val="26"/>
+        </w:rPr>
+      </w:pPr>
+      <w:r>
+        <w:lastRenderedPageBreak/>
+        <w:br w:type="page"/>
+      </w:r>
+    </w:p>
+    <w:p>
+      <w:pPr>
+        <w:pStyle w:val="Titolo2"/>
+      </w:pPr>
+      <w:r>
+        <w:lastRenderedPageBreak/>
         <w:t>Comunicazioni di Log</w:t>
       </w:r>
-      <w:bookmarkEnd w:id="9"/>
+      <w:bookmarkEnd w:id="11"/>
     </w:p>
     <w:p>
       <w:r>
@@ -3159,7 +3638,6 @@
         <w:pStyle w:val="immagine"/>
       </w:pPr>
       <w:r>
-        <w:lastRenderedPageBreak/>
         <w:drawing>
           <wp:inline distT="0" distB="0" distL="0" distR="0" wp14:anchorId="766E4D96" wp14:editId="03E52CE1">
             <wp:extent cx="6120130" cy="2268220"/>
@@ -3176,7 +3654,7 @@
                     <pic:cNvPicPr/>
                   </pic:nvPicPr>
                   <pic:blipFill>
-                    <a:blip r:embed="rId26"/>
+                    <a:blip r:embed="rId27"/>
                     <a:stretch>
                       <a:fillRect/>
                     </a:stretch>
@@ -3334,22 +3812,1575 @@
       <w:pPr>
         <w:pStyle w:val="Titolo1"/>
       </w:pPr>
-      <w:bookmarkStart w:id="10" w:name="_Toc189322904"/>
+      <w:bookmarkStart w:id="12" w:name="_Toc225612086"/>
+      <w:r>
+        <w:lastRenderedPageBreak/>
+        <w:t>Import codici Statistici</w:t>
+      </w:r>
+      <w:bookmarkEnd w:id="12"/>
+    </w:p>
+    <w:p>
+      <w:r>
+        <w:t xml:space="preserve">In fase iniziale è possibile importare i codici statistici costruiti a proprio piacere. Ovvio che quest’operazione è valida </w:t>
+      </w:r>
+      <w:r>
+        <w:rPr>
+          <w:b/>
+        </w:rPr>
+        <w:t>*SOLO*</w:t>
+      </w:r>
+      <w:r>
+        <w:t xml:space="preserve"> all’inizio della gestione con BANCA.</w:t>
+      </w:r>
+    </w:p>
+    <w:p>
+      <w:r>
+        <w:t xml:space="preserve">Infatti l’import dei codici Statistici </w:t>
+      </w:r>
+      <w:r>
+        <w:rPr>
+          <w:b/>
+        </w:rPr>
+        <w:t>implica l’azzeramento</w:t>
+      </w:r>
+      <w:r>
+        <w:t xml:space="preserve"> di classificazione statistica di tutti i movimenti</w:t>
+      </w:r>
+      <w:r>
+        <w:t xml:space="preserve"> già</w:t>
+      </w:r>
+      <w:r>
+        <w:t xml:space="preserve"> presenti! </w:t>
+      </w:r>
+      <w:r>
+        <w:br/>
+      </w:r>
+      <w:r>
+        <w:t xml:space="preserve">Dopo di questa operazione occorre ricominciare l’assegnazione </w:t>
+      </w:r>
+      <w:r>
+        <w:rPr>
+          <w:b/>
+        </w:rPr>
+        <w:t>da capo</w:t>
+      </w:r>
+      <w:r>
+        <w:t>!</w:t>
+      </w:r>
+    </w:p>
+    <w:p>
+      <w:r>
+        <w:t>Se siamo all’inizio possiamo costruire un fogli Excel che contenga le seguenti colonne:</w:t>
+      </w:r>
+    </w:p>
+    <w:p>
+      <w:pPr>
+        <w:pStyle w:val="Paragrafoelenco"/>
+        <w:numPr>
+          <w:ilvl w:val="0"/>
+          <w:numId w:val="13"/>
+        </w:numPr>
+      </w:pPr>
+      <w:r>
+        <w:rPr>
+          <w:b/>
+          <w:bCs/>
+        </w:rPr>
+        <w:t>cat1</w:t>
+      </w:r>
+      <w:r>
+        <w:t>: categoria con 1 solo codice</w:t>
+      </w:r>
+    </w:p>
+    <w:p>
+      <w:pPr>
+        <w:pStyle w:val="Paragrafoelenco"/>
+        <w:numPr>
+          <w:ilvl w:val="0"/>
+          <w:numId w:val="13"/>
+        </w:numPr>
+      </w:pPr>
+      <w:r>
+        <w:rPr>
+          <w:b/>
+          <w:bCs/>
+        </w:rPr>
+        <w:t>cat2</w:t>
+      </w:r>
+      <w:r>
+        <w:t>: categoria con 2 codici separato da punto</w:t>
+      </w:r>
+    </w:p>
+    <w:p>
+      <w:pPr>
+        <w:pStyle w:val="Paragrafoelenco"/>
+        <w:numPr>
+          <w:ilvl w:val="0"/>
+          <w:numId w:val="13"/>
+        </w:numPr>
+      </w:pPr>
+      <w:r>
+        <w:rPr>
+          <w:b/>
+          <w:bCs/>
+        </w:rPr>
+        <w:t>cat3</w:t>
+      </w:r>
+      <w:r>
+        <w:t>: categoria con 3 codici separato da 2 punti</w:t>
+      </w:r>
+    </w:p>
+    <w:p>
+      <w:pPr>
+        <w:pStyle w:val="Paragrafoelenco"/>
+        <w:numPr>
+          <w:ilvl w:val="0"/>
+          <w:numId w:val="13"/>
+        </w:numPr>
+      </w:pPr>
+      <w:r>
+        <w:rPr>
+          <w:b/>
+          <w:bCs/>
+        </w:rPr>
+        <w:t>Descrizione</w:t>
+      </w:r>
+      <w:r>
+        <w:t>: descrizione estesa del significato del codice statistico</w:t>
+      </w:r>
+    </w:p>
+    <w:p>
+      <w:r>
+        <w:t>Esempio</w:t>
+      </w:r>
+      <w:r>
+        <w:t xml:space="preserve"> di classificazione delle spese con codici</w:t>
+      </w:r>
+      <w:r>
+        <w:t>:</w:t>
+      </w:r>
+    </w:p>
+    <w:p/>
+    <w:tbl>
+      <w:tblPr>
+        <w:tblW w:w="8080" w:type="dxa"/>
+        <w:tblBorders>
+          <w:top w:val="single" w:sz="4" w:space="0" w:color="auto"/>
+          <w:left w:val="single" w:sz="4" w:space="0" w:color="auto"/>
+          <w:bottom w:val="single" w:sz="4" w:space="0" w:color="auto"/>
+          <w:right w:val="single" w:sz="4" w:space="0" w:color="auto"/>
+        </w:tblBorders>
+        <w:tblCellMar>
+          <w:left w:w="70" w:type="dxa"/>
+          <w:right w:w="70" w:type="dxa"/>
+        </w:tblCellMar>
+        <w:tblLook w:val="04A0" w:firstRow="1" w:lastRow="0" w:firstColumn="1" w:lastColumn="0" w:noHBand="0" w:noVBand="1"/>
+      </w:tblPr>
+      <w:tblGrid>
+        <w:gridCol w:w="529"/>
+        <w:gridCol w:w="642"/>
+        <w:gridCol w:w="921"/>
+        <w:gridCol w:w="6160"/>
+      </w:tblGrid>
+      <w:tr>
+        <w:trPr>
+          <w:trHeight w:val="300"/>
+        </w:trPr>
+        <w:tc>
+          <w:tcPr>
+            <w:tcW w:w="480" w:type="dxa"/>
+            <w:tcBorders>
+              <w:top w:val="single" w:sz="4" w:space="0" w:color="auto"/>
+              <w:bottom w:val="single" w:sz="4" w:space="0" w:color="auto"/>
+              <w:right w:val="single" w:sz="4" w:space="0" w:color="auto"/>
+            </w:tcBorders>
+            <w:noWrap/>
+            <w:vAlign w:val="bottom"/>
+            <w:hideMark/>
+          </w:tcPr>
+          <w:p>
+            <w:pPr>
+              <w:spacing w:before="0" w:after="0"/>
+              <w:contextualSpacing w:val="0"/>
+              <w:rPr>
+                <w:rFonts w:ascii="Calibri" w:eastAsia="Times New Roman" w:hAnsi="Calibri" w:cs="Calibri"/>
+                <w:b/>
+                <w:bCs/>
+                <w:color w:val="000000"/>
+                <w:kern w:val="0"/>
+                <w:szCs w:val="22"/>
+                <w:highlight w:val="lightGray"/>
+                <w:lang w:eastAsia="it-IT"/>
+                <w14:ligatures w14:val="none"/>
+              </w:rPr>
+            </w:pPr>
+            <w:r>
+              <w:rPr>
+                <w:rFonts w:ascii="Calibri" w:eastAsia="Times New Roman" w:hAnsi="Calibri" w:cs="Calibri"/>
+                <w:b/>
+                <w:bCs/>
+                <w:color w:val="000000"/>
+                <w:kern w:val="0"/>
+                <w:szCs w:val="22"/>
+                <w:highlight w:val="lightGray"/>
+                <w:lang w:eastAsia="it-IT"/>
+                <w14:ligatures w14:val="none"/>
+              </w:rPr>
+              <w:t>cat1</w:t>
+            </w:r>
+          </w:p>
+        </w:tc>
+        <w:tc>
+          <w:tcPr>
+            <w:tcW w:w="580" w:type="dxa"/>
+            <w:tcBorders>
+              <w:top w:val="single" w:sz="4" w:space="0" w:color="auto"/>
+              <w:left w:val="single" w:sz="4" w:space="0" w:color="auto"/>
+              <w:bottom w:val="single" w:sz="4" w:space="0" w:color="auto"/>
+              <w:right w:val="single" w:sz="4" w:space="0" w:color="auto"/>
+            </w:tcBorders>
+            <w:noWrap/>
+            <w:vAlign w:val="bottom"/>
+            <w:hideMark/>
+          </w:tcPr>
+          <w:p>
+            <w:pPr>
+              <w:spacing w:before="0" w:after="0"/>
+              <w:contextualSpacing w:val="0"/>
+              <w:rPr>
+                <w:rFonts w:ascii="Calibri" w:eastAsia="Times New Roman" w:hAnsi="Calibri" w:cs="Calibri"/>
+                <w:b/>
+                <w:bCs/>
+                <w:color w:val="000000"/>
+                <w:kern w:val="0"/>
+                <w:szCs w:val="22"/>
+                <w:highlight w:val="lightGray"/>
+                <w:lang w:eastAsia="it-IT"/>
+                <w14:ligatures w14:val="none"/>
+              </w:rPr>
+            </w:pPr>
+            <w:r>
+              <w:rPr>
+                <w:rFonts w:ascii="Calibri" w:eastAsia="Times New Roman" w:hAnsi="Calibri" w:cs="Calibri"/>
+                <w:b/>
+                <w:bCs/>
+                <w:color w:val="000000"/>
+                <w:kern w:val="0"/>
+                <w:szCs w:val="22"/>
+                <w:highlight w:val="lightGray"/>
+                <w:lang w:eastAsia="it-IT"/>
+                <w14:ligatures w14:val="none"/>
+              </w:rPr>
+              <w:t>cat2</w:t>
+            </w:r>
+          </w:p>
+        </w:tc>
+        <w:tc>
+          <w:tcPr>
+            <w:tcW w:w="860" w:type="dxa"/>
+            <w:tcBorders>
+              <w:top w:val="single" w:sz="4" w:space="0" w:color="auto"/>
+              <w:left w:val="single" w:sz="4" w:space="0" w:color="auto"/>
+              <w:bottom w:val="single" w:sz="4" w:space="0" w:color="auto"/>
+              <w:right w:val="single" w:sz="4" w:space="0" w:color="auto"/>
+            </w:tcBorders>
+            <w:noWrap/>
+            <w:vAlign w:val="bottom"/>
+            <w:hideMark/>
+          </w:tcPr>
+          <w:p>
+            <w:pPr>
+              <w:spacing w:before="0" w:after="0"/>
+              <w:contextualSpacing w:val="0"/>
+              <w:rPr>
+                <w:rFonts w:ascii="Calibri" w:eastAsia="Times New Roman" w:hAnsi="Calibri" w:cs="Calibri"/>
+                <w:b/>
+                <w:bCs/>
+                <w:color w:val="000000"/>
+                <w:kern w:val="0"/>
+                <w:szCs w:val="22"/>
+                <w:highlight w:val="lightGray"/>
+                <w:lang w:eastAsia="it-IT"/>
+                <w14:ligatures w14:val="none"/>
+              </w:rPr>
+            </w:pPr>
+            <w:r>
+              <w:rPr>
+                <w:rFonts w:ascii="Calibri" w:eastAsia="Times New Roman" w:hAnsi="Calibri" w:cs="Calibri"/>
+                <w:b/>
+                <w:bCs/>
+                <w:color w:val="000000"/>
+                <w:kern w:val="0"/>
+                <w:szCs w:val="22"/>
+                <w:highlight w:val="lightGray"/>
+                <w:lang w:eastAsia="it-IT"/>
+                <w14:ligatures w14:val="none"/>
+              </w:rPr>
+              <w:t>cat3</w:t>
+            </w:r>
+          </w:p>
+        </w:tc>
+        <w:tc>
+          <w:tcPr>
+            <w:tcW w:w="6160" w:type="dxa"/>
+            <w:tcBorders>
+              <w:top w:val="single" w:sz="4" w:space="0" w:color="auto"/>
+              <w:left w:val="single" w:sz="4" w:space="0" w:color="auto"/>
+              <w:bottom w:val="single" w:sz="4" w:space="0" w:color="auto"/>
+            </w:tcBorders>
+            <w:noWrap/>
+            <w:vAlign w:val="bottom"/>
+            <w:hideMark/>
+          </w:tcPr>
+          <w:p>
+            <w:pPr>
+              <w:spacing w:before="0" w:after="0"/>
+              <w:contextualSpacing w:val="0"/>
+              <w:rPr>
+                <w:rFonts w:ascii="Calibri" w:eastAsia="Times New Roman" w:hAnsi="Calibri" w:cs="Calibri"/>
+                <w:b/>
+                <w:bCs/>
+                <w:color w:val="000000"/>
+                <w:kern w:val="0"/>
+                <w:szCs w:val="22"/>
+                <w:highlight w:val="lightGray"/>
+                <w:lang w:eastAsia="it-IT"/>
+                <w14:ligatures w14:val="none"/>
+              </w:rPr>
+            </w:pPr>
+            <w:r>
+              <w:rPr>
+                <w:rFonts w:ascii="Calibri" w:eastAsia="Times New Roman" w:hAnsi="Calibri" w:cs="Calibri"/>
+                <w:b/>
+                <w:bCs/>
+                <w:color w:val="000000"/>
+                <w:kern w:val="0"/>
+                <w:szCs w:val="22"/>
+                <w:highlight w:val="lightGray"/>
+                <w:lang w:eastAsia="it-IT"/>
+                <w14:ligatures w14:val="none"/>
+              </w:rPr>
+              <w:t>Descrizione</w:t>
+            </w:r>
+          </w:p>
+        </w:tc>
+      </w:tr>
+      <w:tr>
+        <w:trPr>
+          <w:trHeight w:val="300"/>
+        </w:trPr>
+        <w:tc>
+          <w:tcPr>
+            <w:tcW w:w="480" w:type="dxa"/>
+            <w:tcBorders>
+              <w:top w:val="single" w:sz="4" w:space="0" w:color="auto"/>
+              <w:bottom w:val="nil"/>
+              <w:right w:val="single" w:sz="4" w:space="0" w:color="auto"/>
+            </w:tcBorders>
+            <w:noWrap/>
+            <w:vAlign w:val="bottom"/>
+            <w:hideMark/>
+          </w:tcPr>
+          <w:p>
+            <w:pPr>
+              <w:spacing w:before="0" w:after="0"/>
+              <w:contextualSpacing w:val="0"/>
+              <w:jc w:val="right"/>
+              <w:rPr>
+                <w:rFonts w:ascii="Calibri" w:eastAsia="Times New Roman" w:hAnsi="Calibri" w:cs="Calibri"/>
+                <w:color w:val="000000"/>
+                <w:kern w:val="0"/>
+                <w:szCs w:val="22"/>
+                <w:lang w:eastAsia="it-IT"/>
+                <w14:ligatures w14:val="none"/>
+              </w:rPr>
+            </w:pPr>
+            <w:r>
+              <w:rPr>
+                <w:rFonts w:ascii="Calibri" w:eastAsia="Times New Roman" w:hAnsi="Calibri" w:cs="Calibri"/>
+                <w:color w:val="000000"/>
+                <w:kern w:val="0"/>
+                <w:szCs w:val="22"/>
+                <w:lang w:eastAsia="it-IT"/>
+                <w14:ligatures w14:val="none"/>
+              </w:rPr>
+              <w:t>1</w:t>
+            </w:r>
+          </w:p>
+        </w:tc>
+        <w:tc>
+          <w:tcPr>
+            <w:tcW w:w="580" w:type="dxa"/>
+            <w:tcBorders>
+              <w:top w:val="single" w:sz="4" w:space="0" w:color="auto"/>
+              <w:left w:val="single" w:sz="4" w:space="0" w:color="auto"/>
+              <w:bottom w:val="nil"/>
+              <w:right w:val="single" w:sz="4" w:space="0" w:color="auto"/>
+            </w:tcBorders>
+            <w:noWrap/>
+            <w:vAlign w:val="bottom"/>
+            <w:hideMark/>
+          </w:tcPr>
+          <w:p>
+            <w:pPr>
+              <w:spacing w:before="0" w:after="0"/>
+              <w:contextualSpacing w:val="0"/>
+              <w:jc w:val="right"/>
+              <w:rPr>
+                <w:rFonts w:ascii="Calibri" w:eastAsia="Times New Roman" w:hAnsi="Calibri" w:cs="Calibri"/>
+                <w:color w:val="000000"/>
+                <w:kern w:val="0"/>
+                <w:szCs w:val="22"/>
+                <w:lang w:eastAsia="it-IT"/>
+                <w14:ligatures w14:val="none"/>
+              </w:rPr>
+            </w:pPr>
+          </w:p>
+        </w:tc>
+        <w:tc>
+          <w:tcPr>
+            <w:tcW w:w="860" w:type="dxa"/>
+            <w:tcBorders>
+              <w:top w:val="single" w:sz="4" w:space="0" w:color="auto"/>
+              <w:left w:val="single" w:sz="4" w:space="0" w:color="auto"/>
+              <w:bottom w:val="nil"/>
+              <w:right w:val="single" w:sz="4" w:space="0" w:color="auto"/>
+            </w:tcBorders>
+            <w:noWrap/>
+            <w:vAlign w:val="bottom"/>
+            <w:hideMark/>
+          </w:tcPr>
+          <w:p>
+            <w:pPr>
+              <w:spacing w:before="0" w:after="0"/>
+              <w:contextualSpacing w:val="0"/>
+              <w:rPr>
+                <w:rFonts w:ascii="Times New Roman" w:eastAsia="Times New Roman" w:hAnsi="Times New Roman" w:cs="Times New Roman"/>
+                <w:kern w:val="0"/>
+                <w:sz w:val="20"/>
+                <w:szCs w:val="20"/>
+                <w:lang w:eastAsia="it-IT"/>
+                <w14:ligatures w14:val="none"/>
+              </w:rPr>
+            </w:pPr>
+          </w:p>
+        </w:tc>
+        <w:tc>
+          <w:tcPr>
+            <w:tcW w:w="6160" w:type="dxa"/>
+            <w:tcBorders>
+              <w:top w:val="single" w:sz="4" w:space="0" w:color="auto"/>
+              <w:left w:val="single" w:sz="4" w:space="0" w:color="auto"/>
+            </w:tcBorders>
+            <w:noWrap/>
+            <w:vAlign w:val="bottom"/>
+            <w:hideMark/>
+          </w:tcPr>
+          <w:p>
+            <w:pPr>
+              <w:spacing w:before="0" w:after="0"/>
+              <w:contextualSpacing w:val="0"/>
+              <w:rPr>
+                <w:rFonts w:ascii="Calibri" w:eastAsia="Times New Roman" w:hAnsi="Calibri" w:cs="Calibri"/>
+                <w:color w:val="000000"/>
+                <w:kern w:val="0"/>
+                <w:szCs w:val="22"/>
+                <w:lang w:eastAsia="it-IT"/>
+                <w14:ligatures w14:val="none"/>
+              </w:rPr>
+            </w:pPr>
+            <w:r>
+              <w:rPr>
+                <w:rFonts w:ascii="Calibri" w:eastAsia="Times New Roman" w:hAnsi="Calibri" w:cs="Calibri"/>
+                <w:color w:val="000000"/>
+                <w:kern w:val="0"/>
+                <w:szCs w:val="22"/>
+                <w:lang w:eastAsia="it-IT"/>
+                <w14:ligatures w14:val="none"/>
+              </w:rPr>
+              <w:t>Alimentare</w:t>
+            </w:r>
+          </w:p>
+        </w:tc>
+      </w:tr>
+      <w:tr>
+        <w:trPr>
+          <w:trHeight w:val="300"/>
+        </w:trPr>
+        <w:tc>
+          <w:tcPr>
+            <w:tcW w:w="480" w:type="dxa"/>
+            <w:tcBorders>
+              <w:top w:val="nil"/>
+              <w:bottom w:val="nil"/>
+              <w:right w:val="single" w:sz="4" w:space="0" w:color="auto"/>
+            </w:tcBorders>
+            <w:noWrap/>
+            <w:vAlign w:val="bottom"/>
+            <w:hideMark/>
+          </w:tcPr>
+          <w:p>
+            <w:pPr>
+              <w:spacing w:before="0" w:after="0"/>
+              <w:contextualSpacing w:val="0"/>
+              <w:rPr>
+                <w:rFonts w:ascii="Calibri" w:eastAsia="Times New Roman" w:hAnsi="Calibri" w:cs="Calibri"/>
+                <w:color w:val="000000"/>
+                <w:kern w:val="0"/>
+                <w:szCs w:val="22"/>
+                <w:lang w:eastAsia="it-IT"/>
+                <w14:ligatures w14:val="none"/>
+              </w:rPr>
+            </w:pPr>
+          </w:p>
+        </w:tc>
+        <w:tc>
+          <w:tcPr>
+            <w:tcW w:w="580" w:type="dxa"/>
+            <w:tcBorders>
+              <w:top w:val="nil"/>
+              <w:left w:val="single" w:sz="4" w:space="0" w:color="auto"/>
+              <w:bottom w:val="nil"/>
+              <w:right w:val="single" w:sz="4" w:space="0" w:color="auto"/>
+            </w:tcBorders>
+            <w:noWrap/>
+            <w:vAlign w:val="bottom"/>
+            <w:hideMark/>
+          </w:tcPr>
+          <w:p>
+            <w:pPr>
+              <w:spacing w:before="0" w:after="0"/>
+              <w:contextualSpacing w:val="0"/>
+              <w:rPr>
+                <w:rFonts w:ascii="Calibri" w:eastAsia="Times New Roman" w:hAnsi="Calibri" w:cs="Calibri"/>
+                <w:color w:val="000000"/>
+                <w:kern w:val="0"/>
+                <w:szCs w:val="22"/>
+                <w:lang w:eastAsia="it-IT"/>
+                <w14:ligatures w14:val="none"/>
+              </w:rPr>
+            </w:pPr>
+            <w:r>
+              <w:rPr>
+                <w:rFonts w:ascii="Calibri" w:eastAsia="Times New Roman" w:hAnsi="Calibri" w:cs="Calibri"/>
+                <w:color w:val="000000"/>
+                <w:kern w:val="0"/>
+                <w:szCs w:val="22"/>
+                <w:lang w:eastAsia="it-IT"/>
+                <w14:ligatures w14:val="none"/>
+              </w:rPr>
+              <w:t>01.01</w:t>
+            </w:r>
+          </w:p>
+        </w:tc>
+        <w:tc>
+          <w:tcPr>
+            <w:tcW w:w="860" w:type="dxa"/>
+            <w:tcBorders>
+              <w:top w:val="nil"/>
+              <w:left w:val="single" w:sz="4" w:space="0" w:color="auto"/>
+              <w:bottom w:val="nil"/>
+              <w:right w:val="single" w:sz="4" w:space="0" w:color="auto"/>
+            </w:tcBorders>
+            <w:noWrap/>
+            <w:vAlign w:val="bottom"/>
+            <w:hideMark/>
+          </w:tcPr>
+          <w:p>
+            <w:pPr>
+              <w:spacing w:before="0" w:after="0"/>
+              <w:contextualSpacing w:val="0"/>
+              <w:rPr>
+                <w:rFonts w:ascii="Calibri" w:eastAsia="Times New Roman" w:hAnsi="Calibri" w:cs="Calibri"/>
+                <w:color w:val="000000"/>
+                <w:kern w:val="0"/>
+                <w:szCs w:val="22"/>
+                <w:lang w:eastAsia="it-IT"/>
+                <w14:ligatures w14:val="none"/>
+              </w:rPr>
+            </w:pPr>
+          </w:p>
+        </w:tc>
+        <w:tc>
+          <w:tcPr>
+            <w:tcW w:w="6160" w:type="dxa"/>
+            <w:tcBorders>
+              <w:left w:val="single" w:sz="4" w:space="0" w:color="auto"/>
+            </w:tcBorders>
+            <w:noWrap/>
+            <w:vAlign w:val="bottom"/>
+            <w:hideMark/>
+          </w:tcPr>
+          <w:p>
+            <w:pPr>
+              <w:spacing w:before="0" w:after="0"/>
+              <w:contextualSpacing w:val="0"/>
+              <w:rPr>
+                <w:rFonts w:ascii="Calibri" w:eastAsia="Times New Roman" w:hAnsi="Calibri" w:cs="Calibri"/>
+                <w:color w:val="000000"/>
+                <w:kern w:val="0"/>
+                <w:szCs w:val="22"/>
+                <w:lang w:eastAsia="it-IT"/>
+                <w14:ligatures w14:val="none"/>
+              </w:rPr>
+            </w:pPr>
+            <w:r>
+              <w:rPr>
+                <w:rFonts w:ascii="Calibri" w:eastAsia="Times New Roman" w:hAnsi="Calibri" w:cs="Calibri"/>
+                <w:color w:val="000000"/>
+                <w:kern w:val="0"/>
+                <w:szCs w:val="22"/>
+                <w:lang w:eastAsia="it-IT"/>
+                <w14:ligatures w14:val="none"/>
+              </w:rPr>
+              <w:t>Spese alimentari (</w:t>
+            </w:r>
+            <w:proofErr w:type="spellStart"/>
+            <w:r>
+              <w:rPr>
+                <w:rFonts w:ascii="Calibri" w:eastAsia="Times New Roman" w:hAnsi="Calibri" w:cs="Calibri"/>
+                <w:color w:val="000000"/>
+                <w:kern w:val="0"/>
+                <w:szCs w:val="22"/>
+                <w:lang w:eastAsia="it-IT"/>
+                <w14:ligatures w14:val="none"/>
+              </w:rPr>
+              <w:t>titancoop</w:t>
+            </w:r>
+            <w:proofErr w:type="spellEnd"/>
+            <w:r>
+              <w:rPr>
+                <w:rFonts w:ascii="Calibri" w:eastAsia="Times New Roman" w:hAnsi="Calibri" w:cs="Calibri"/>
+                <w:color w:val="000000"/>
+                <w:kern w:val="0"/>
+                <w:szCs w:val="22"/>
+                <w:lang w:eastAsia="it-IT"/>
+                <w14:ligatures w14:val="none"/>
+              </w:rPr>
+              <w:t>, Baguette, etc..)</w:t>
+            </w:r>
+          </w:p>
+        </w:tc>
+      </w:tr>
+      <w:tr>
+        <w:trPr>
+          <w:trHeight w:val="300"/>
+        </w:trPr>
+        <w:tc>
+          <w:tcPr>
+            <w:tcW w:w="480" w:type="dxa"/>
+            <w:tcBorders>
+              <w:top w:val="nil"/>
+              <w:bottom w:val="nil"/>
+              <w:right w:val="single" w:sz="4" w:space="0" w:color="auto"/>
+            </w:tcBorders>
+            <w:noWrap/>
+            <w:vAlign w:val="bottom"/>
+            <w:hideMark/>
+          </w:tcPr>
+          <w:p>
+            <w:pPr>
+              <w:spacing w:before="0" w:after="0"/>
+              <w:contextualSpacing w:val="0"/>
+              <w:rPr>
+                <w:rFonts w:ascii="Calibri" w:eastAsia="Times New Roman" w:hAnsi="Calibri" w:cs="Calibri"/>
+                <w:color w:val="000000"/>
+                <w:kern w:val="0"/>
+                <w:szCs w:val="22"/>
+                <w:lang w:eastAsia="it-IT"/>
+                <w14:ligatures w14:val="none"/>
+              </w:rPr>
+            </w:pPr>
+          </w:p>
+        </w:tc>
+        <w:tc>
+          <w:tcPr>
+            <w:tcW w:w="580" w:type="dxa"/>
+            <w:tcBorders>
+              <w:top w:val="nil"/>
+              <w:left w:val="single" w:sz="4" w:space="0" w:color="auto"/>
+              <w:bottom w:val="nil"/>
+              <w:right w:val="single" w:sz="4" w:space="0" w:color="auto"/>
+            </w:tcBorders>
+            <w:noWrap/>
+            <w:vAlign w:val="bottom"/>
+            <w:hideMark/>
+          </w:tcPr>
+          <w:p>
+            <w:pPr>
+              <w:spacing w:before="0" w:after="0"/>
+              <w:contextualSpacing w:val="0"/>
+              <w:rPr>
+                <w:rFonts w:ascii="Calibri" w:eastAsia="Times New Roman" w:hAnsi="Calibri" w:cs="Calibri"/>
+                <w:color w:val="000000"/>
+                <w:kern w:val="0"/>
+                <w:szCs w:val="22"/>
+                <w:lang w:eastAsia="it-IT"/>
+                <w14:ligatures w14:val="none"/>
+              </w:rPr>
+            </w:pPr>
+            <w:r>
+              <w:rPr>
+                <w:rFonts w:ascii="Calibri" w:eastAsia="Times New Roman" w:hAnsi="Calibri" w:cs="Calibri"/>
+                <w:color w:val="000000"/>
+                <w:kern w:val="0"/>
+                <w:szCs w:val="22"/>
+                <w:lang w:eastAsia="it-IT"/>
+                <w14:ligatures w14:val="none"/>
+              </w:rPr>
+              <w:t>01.02</w:t>
+            </w:r>
+          </w:p>
+        </w:tc>
+        <w:tc>
+          <w:tcPr>
+            <w:tcW w:w="860" w:type="dxa"/>
+            <w:tcBorders>
+              <w:top w:val="nil"/>
+              <w:left w:val="single" w:sz="4" w:space="0" w:color="auto"/>
+              <w:bottom w:val="nil"/>
+              <w:right w:val="single" w:sz="4" w:space="0" w:color="auto"/>
+            </w:tcBorders>
+            <w:noWrap/>
+            <w:vAlign w:val="bottom"/>
+            <w:hideMark/>
+          </w:tcPr>
+          <w:p>
+            <w:pPr>
+              <w:spacing w:before="0" w:after="0"/>
+              <w:contextualSpacing w:val="0"/>
+              <w:rPr>
+                <w:rFonts w:ascii="Calibri" w:eastAsia="Times New Roman" w:hAnsi="Calibri" w:cs="Calibri"/>
+                <w:color w:val="000000"/>
+                <w:kern w:val="0"/>
+                <w:szCs w:val="22"/>
+                <w:lang w:eastAsia="it-IT"/>
+                <w14:ligatures w14:val="none"/>
+              </w:rPr>
+            </w:pPr>
+          </w:p>
+        </w:tc>
+        <w:tc>
+          <w:tcPr>
+            <w:tcW w:w="6160" w:type="dxa"/>
+            <w:tcBorders>
+              <w:left w:val="single" w:sz="4" w:space="0" w:color="auto"/>
+            </w:tcBorders>
+            <w:noWrap/>
+            <w:vAlign w:val="bottom"/>
+            <w:hideMark/>
+          </w:tcPr>
+          <w:p>
+            <w:pPr>
+              <w:spacing w:before="0" w:after="0"/>
+              <w:contextualSpacing w:val="0"/>
+              <w:rPr>
+                <w:rFonts w:ascii="Calibri" w:eastAsia="Times New Roman" w:hAnsi="Calibri" w:cs="Calibri"/>
+                <w:color w:val="000000"/>
+                <w:kern w:val="0"/>
+                <w:szCs w:val="22"/>
+                <w:lang w:eastAsia="it-IT"/>
+                <w14:ligatures w14:val="none"/>
+              </w:rPr>
+            </w:pPr>
+            <w:r>
+              <w:rPr>
+                <w:rFonts w:ascii="Calibri" w:eastAsia="Times New Roman" w:hAnsi="Calibri" w:cs="Calibri"/>
+                <w:color w:val="000000"/>
+                <w:kern w:val="0"/>
+                <w:szCs w:val="22"/>
+                <w:lang w:eastAsia="it-IT"/>
+                <w14:ligatures w14:val="none"/>
+              </w:rPr>
+              <w:t>cene e ristoranti</w:t>
+            </w:r>
+          </w:p>
+        </w:tc>
+      </w:tr>
+      <w:tr>
+        <w:trPr>
+          <w:trHeight w:val="300"/>
+        </w:trPr>
+        <w:tc>
+          <w:tcPr>
+            <w:tcW w:w="480" w:type="dxa"/>
+            <w:tcBorders>
+              <w:top w:val="nil"/>
+              <w:bottom w:val="nil"/>
+              <w:right w:val="single" w:sz="4" w:space="0" w:color="auto"/>
+            </w:tcBorders>
+            <w:noWrap/>
+            <w:vAlign w:val="bottom"/>
+            <w:hideMark/>
+          </w:tcPr>
+          <w:p>
+            <w:pPr>
+              <w:spacing w:before="0" w:after="0"/>
+              <w:contextualSpacing w:val="0"/>
+              <w:jc w:val="right"/>
+              <w:rPr>
+                <w:rFonts w:ascii="Calibri" w:eastAsia="Times New Roman" w:hAnsi="Calibri" w:cs="Calibri"/>
+                <w:color w:val="000000"/>
+                <w:kern w:val="0"/>
+                <w:szCs w:val="22"/>
+                <w:lang w:eastAsia="it-IT"/>
+                <w14:ligatures w14:val="none"/>
+              </w:rPr>
+            </w:pPr>
+            <w:r>
+              <w:rPr>
+                <w:rFonts w:ascii="Calibri" w:eastAsia="Times New Roman" w:hAnsi="Calibri" w:cs="Calibri"/>
+                <w:color w:val="000000"/>
+                <w:kern w:val="0"/>
+                <w:szCs w:val="22"/>
+                <w:lang w:eastAsia="it-IT"/>
+                <w14:ligatures w14:val="none"/>
+              </w:rPr>
+              <w:t>2</w:t>
+            </w:r>
+          </w:p>
+        </w:tc>
+        <w:tc>
+          <w:tcPr>
+            <w:tcW w:w="580" w:type="dxa"/>
+            <w:tcBorders>
+              <w:top w:val="nil"/>
+              <w:left w:val="single" w:sz="4" w:space="0" w:color="auto"/>
+              <w:bottom w:val="nil"/>
+              <w:right w:val="single" w:sz="4" w:space="0" w:color="auto"/>
+            </w:tcBorders>
+            <w:noWrap/>
+            <w:vAlign w:val="bottom"/>
+            <w:hideMark/>
+          </w:tcPr>
+          <w:p>
+            <w:pPr>
+              <w:spacing w:before="0" w:after="0"/>
+              <w:contextualSpacing w:val="0"/>
+              <w:jc w:val="right"/>
+              <w:rPr>
+                <w:rFonts w:ascii="Calibri" w:eastAsia="Times New Roman" w:hAnsi="Calibri" w:cs="Calibri"/>
+                <w:color w:val="000000"/>
+                <w:kern w:val="0"/>
+                <w:szCs w:val="22"/>
+                <w:lang w:eastAsia="it-IT"/>
+                <w14:ligatures w14:val="none"/>
+              </w:rPr>
+            </w:pPr>
+          </w:p>
+        </w:tc>
+        <w:tc>
+          <w:tcPr>
+            <w:tcW w:w="860" w:type="dxa"/>
+            <w:tcBorders>
+              <w:top w:val="nil"/>
+              <w:left w:val="single" w:sz="4" w:space="0" w:color="auto"/>
+              <w:bottom w:val="nil"/>
+              <w:right w:val="single" w:sz="4" w:space="0" w:color="auto"/>
+            </w:tcBorders>
+            <w:noWrap/>
+            <w:vAlign w:val="bottom"/>
+            <w:hideMark/>
+          </w:tcPr>
+          <w:p>
+            <w:pPr>
+              <w:spacing w:before="0" w:after="0"/>
+              <w:contextualSpacing w:val="0"/>
+              <w:rPr>
+                <w:rFonts w:ascii="Times New Roman" w:eastAsia="Times New Roman" w:hAnsi="Times New Roman" w:cs="Times New Roman"/>
+                <w:kern w:val="0"/>
+                <w:sz w:val="20"/>
+                <w:szCs w:val="20"/>
+                <w:lang w:eastAsia="it-IT"/>
+                <w14:ligatures w14:val="none"/>
+              </w:rPr>
+            </w:pPr>
+          </w:p>
+        </w:tc>
+        <w:tc>
+          <w:tcPr>
+            <w:tcW w:w="6160" w:type="dxa"/>
+            <w:tcBorders>
+              <w:left w:val="single" w:sz="4" w:space="0" w:color="auto"/>
+            </w:tcBorders>
+            <w:noWrap/>
+            <w:vAlign w:val="bottom"/>
+            <w:hideMark/>
+          </w:tcPr>
+          <w:p>
+            <w:pPr>
+              <w:spacing w:before="0" w:after="0"/>
+              <w:contextualSpacing w:val="0"/>
+              <w:rPr>
+                <w:rFonts w:ascii="Calibri" w:eastAsia="Times New Roman" w:hAnsi="Calibri" w:cs="Calibri"/>
+                <w:color w:val="000000"/>
+                <w:kern w:val="0"/>
+                <w:szCs w:val="22"/>
+                <w:lang w:eastAsia="it-IT"/>
+                <w14:ligatures w14:val="none"/>
+              </w:rPr>
+            </w:pPr>
+            <w:r>
+              <w:rPr>
+                <w:rFonts w:ascii="Calibri" w:eastAsia="Times New Roman" w:hAnsi="Calibri" w:cs="Calibri"/>
+                <w:color w:val="000000"/>
+                <w:kern w:val="0"/>
+                <w:szCs w:val="22"/>
+                <w:lang w:eastAsia="it-IT"/>
+                <w14:ligatures w14:val="none"/>
+              </w:rPr>
+              <w:t>Automezzi</w:t>
+            </w:r>
+          </w:p>
+        </w:tc>
+      </w:tr>
+      <w:tr>
+        <w:trPr>
+          <w:trHeight w:val="300"/>
+        </w:trPr>
+        <w:tc>
+          <w:tcPr>
+            <w:tcW w:w="480" w:type="dxa"/>
+            <w:tcBorders>
+              <w:top w:val="nil"/>
+              <w:bottom w:val="nil"/>
+              <w:right w:val="single" w:sz="4" w:space="0" w:color="auto"/>
+            </w:tcBorders>
+            <w:noWrap/>
+            <w:vAlign w:val="bottom"/>
+            <w:hideMark/>
+          </w:tcPr>
+          <w:p>
+            <w:pPr>
+              <w:spacing w:before="0" w:after="0"/>
+              <w:contextualSpacing w:val="0"/>
+              <w:rPr>
+                <w:rFonts w:ascii="Calibri" w:eastAsia="Times New Roman" w:hAnsi="Calibri" w:cs="Calibri"/>
+                <w:color w:val="000000"/>
+                <w:kern w:val="0"/>
+                <w:szCs w:val="22"/>
+                <w:lang w:eastAsia="it-IT"/>
+                <w14:ligatures w14:val="none"/>
+              </w:rPr>
+            </w:pPr>
+          </w:p>
+        </w:tc>
+        <w:tc>
+          <w:tcPr>
+            <w:tcW w:w="580" w:type="dxa"/>
+            <w:tcBorders>
+              <w:top w:val="nil"/>
+              <w:left w:val="single" w:sz="4" w:space="0" w:color="auto"/>
+              <w:bottom w:val="nil"/>
+              <w:right w:val="single" w:sz="4" w:space="0" w:color="auto"/>
+            </w:tcBorders>
+            <w:noWrap/>
+            <w:vAlign w:val="bottom"/>
+            <w:hideMark/>
+          </w:tcPr>
+          <w:p>
+            <w:pPr>
+              <w:spacing w:before="0" w:after="0"/>
+              <w:contextualSpacing w:val="0"/>
+              <w:rPr>
+                <w:rFonts w:ascii="Calibri" w:eastAsia="Times New Roman" w:hAnsi="Calibri" w:cs="Calibri"/>
+                <w:color w:val="000000"/>
+                <w:kern w:val="0"/>
+                <w:szCs w:val="22"/>
+                <w:lang w:eastAsia="it-IT"/>
+                <w14:ligatures w14:val="none"/>
+              </w:rPr>
+            </w:pPr>
+            <w:r>
+              <w:rPr>
+                <w:rFonts w:ascii="Calibri" w:eastAsia="Times New Roman" w:hAnsi="Calibri" w:cs="Calibri"/>
+                <w:color w:val="000000"/>
+                <w:kern w:val="0"/>
+                <w:szCs w:val="22"/>
+                <w:lang w:eastAsia="it-IT"/>
+                <w14:ligatures w14:val="none"/>
+              </w:rPr>
+              <w:t>02.01</w:t>
+            </w:r>
+          </w:p>
+        </w:tc>
+        <w:tc>
+          <w:tcPr>
+            <w:tcW w:w="860" w:type="dxa"/>
+            <w:tcBorders>
+              <w:top w:val="nil"/>
+              <w:left w:val="single" w:sz="4" w:space="0" w:color="auto"/>
+              <w:bottom w:val="nil"/>
+              <w:right w:val="single" w:sz="4" w:space="0" w:color="auto"/>
+            </w:tcBorders>
+            <w:noWrap/>
+            <w:vAlign w:val="bottom"/>
+            <w:hideMark/>
+          </w:tcPr>
+          <w:p>
+            <w:pPr>
+              <w:spacing w:before="0" w:after="0"/>
+              <w:contextualSpacing w:val="0"/>
+              <w:rPr>
+                <w:rFonts w:ascii="Calibri" w:eastAsia="Times New Roman" w:hAnsi="Calibri" w:cs="Calibri"/>
+                <w:color w:val="000000"/>
+                <w:kern w:val="0"/>
+                <w:szCs w:val="22"/>
+                <w:lang w:eastAsia="it-IT"/>
+                <w14:ligatures w14:val="none"/>
+              </w:rPr>
+            </w:pPr>
+          </w:p>
+        </w:tc>
+        <w:tc>
+          <w:tcPr>
+            <w:tcW w:w="6160" w:type="dxa"/>
+            <w:tcBorders>
+              <w:left w:val="single" w:sz="4" w:space="0" w:color="auto"/>
+            </w:tcBorders>
+            <w:noWrap/>
+            <w:vAlign w:val="bottom"/>
+            <w:hideMark/>
+          </w:tcPr>
+          <w:p>
+            <w:pPr>
+              <w:spacing w:before="0" w:after="0"/>
+              <w:contextualSpacing w:val="0"/>
+              <w:rPr>
+                <w:rFonts w:ascii="Calibri" w:eastAsia="Times New Roman" w:hAnsi="Calibri" w:cs="Calibri"/>
+                <w:color w:val="000000"/>
+                <w:kern w:val="0"/>
+                <w:szCs w:val="22"/>
+                <w:lang w:eastAsia="it-IT"/>
+                <w14:ligatures w14:val="none"/>
+              </w:rPr>
+            </w:pPr>
+            <w:r>
+              <w:rPr>
+                <w:rFonts w:ascii="Calibri" w:eastAsia="Times New Roman" w:hAnsi="Calibri" w:cs="Calibri"/>
+                <w:color w:val="000000"/>
+                <w:kern w:val="0"/>
+                <w:szCs w:val="22"/>
+                <w:lang w:eastAsia="it-IT"/>
+                <w14:ligatures w14:val="none"/>
+              </w:rPr>
+              <w:t>Auto AUDI</w:t>
+            </w:r>
+          </w:p>
+        </w:tc>
+      </w:tr>
+      <w:tr>
+        <w:trPr>
+          <w:trHeight w:val="300"/>
+        </w:trPr>
+        <w:tc>
+          <w:tcPr>
+            <w:tcW w:w="480" w:type="dxa"/>
+            <w:tcBorders>
+              <w:top w:val="nil"/>
+              <w:bottom w:val="nil"/>
+              <w:right w:val="single" w:sz="4" w:space="0" w:color="auto"/>
+            </w:tcBorders>
+            <w:noWrap/>
+            <w:vAlign w:val="bottom"/>
+            <w:hideMark/>
+          </w:tcPr>
+          <w:p>
+            <w:pPr>
+              <w:spacing w:before="0" w:after="0"/>
+              <w:contextualSpacing w:val="0"/>
+              <w:rPr>
+                <w:rFonts w:ascii="Calibri" w:eastAsia="Times New Roman" w:hAnsi="Calibri" w:cs="Calibri"/>
+                <w:color w:val="000000"/>
+                <w:kern w:val="0"/>
+                <w:szCs w:val="22"/>
+                <w:lang w:eastAsia="it-IT"/>
+                <w14:ligatures w14:val="none"/>
+              </w:rPr>
+            </w:pPr>
+          </w:p>
+        </w:tc>
+        <w:tc>
+          <w:tcPr>
+            <w:tcW w:w="580" w:type="dxa"/>
+            <w:tcBorders>
+              <w:top w:val="nil"/>
+              <w:left w:val="single" w:sz="4" w:space="0" w:color="auto"/>
+              <w:bottom w:val="nil"/>
+              <w:right w:val="single" w:sz="4" w:space="0" w:color="auto"/>
+            </w:tcBorders>
+            <w:noWrap/>
+            <w:vAlign w:val="bottom"/>
+            <w:hideMark/>
+          </w:tcPr>
+          <w:p>
+            <w:pPr>
+              <w:spacing w:before="0" w:after="0"/>
+              <w:contextualSpacing w:val="0"/>
+              <w:rPr>
+                <w:rFonts w:ascii="Times New Roman" w:eastAsia="Times New Roman" w:hAnsi="Times New Roman" w:cs="Times New Roman"/>
+                <w:kern w:val="0"/>
+                <w:sz w:val="20"/>
+                <w:szCs w:val="20"/>
+                <w:lang w:eastAsia="it-IT"/>
+                <w14:ligatures w14:val="none"/>
+              </w:rPr>
+            </w:pPr>
+          </w:p>
+        </w:tc>
+        <w:tc>
+          <w:tcPr>
+            <w:tcW w:w="860" w:type="dxa"/>
+            <w:tcBorders>
+              <w:top w:val="nil"/>
+              <w:left w:val="single" w:sz="4" w:space="0" w:color="auto"/>
+              <w:bottom w:val="nil"/>
+              <w:right w:val="single" w:sz="4" w:space="0" w:color="auto"/>
+            </w:tcBorders>
+            <w:noWrap/>
+            <w:vAlign w:val="bottom"/>
+            <w:hideMark/>
+          </w:tcPr>
+          <w:p>
+            <w:pPr>
+              <w:spacing w:before="0" w:after="0"/>
+              <w:contextualSpacing w:val="0"/>
+              <w:rPr>
+                <w:rFonts w:ascii="Calibri" w:eastAsia="Times New Roman" w:hAnsi="Calibri" w:cs="Calibri"/>
+                <w:color w:val="000000"/>
+                <w:kern w:val="0"/>
+                <w:szCs w:val="22"/>
+                <w:lang w:eastAsia="it-IT"/>
+                <w14:ligatures w14:val="none"/>
+              </w:rPr>
+            </w:pPr>
+            <w:r>
+              <w:rPr>
+                <w:rFonts w:ascii="Calibri" w:eastAsia="Times New Roman" w:hAnsi="Calibri" w:cs="Calibri"/>
+                <w:color w:val="000000"/>
+                <w:kern w:val="0"/>
+                <w:szCs w:val="22"/>
+                <w:lang w:eastAsia="it-IT"/>
+                <w14:ligatures w14:val="none"/>
+              </w:rPr>
+              <w:t>02.01.01</w:t>
+            </w:r>
+          </w:p>
+        </w:tc>
+        <w:tc>
+          <w:tcPr>
+            <w:tcW w:w="6160" w:type="dxa"/>
+            <w:tcBorders>
+              <w:left w:val="single" w:sz="4" w:space="0" w:color="auto"/>
+            </w:tcBorders>
+            <w:noWrap/>
+            <w:vAlign w:val="bottom"/>
+            <w:hideMark/>
+          </w:tcPr>
+          <w:p>
+            <w:pPr>
+              <w:spacing w:before="0" w:after="0"/>
+              <w:contextualSpacing w:val="0"/>
+              <w:rPr>
+                <w:rFonts w:ascii="Calibri" w:eastAsia="Times New Roman" w:hAnsi="Calibri" w:cs="Calibri"/>
+                <w:color w:val="000000"/>
+                <w:kern w:val="0"/>
+                <w:szCs w:val="22"/>
+                <w:lang w:eastAsia="it-IT"/>
+                <w14:ligatures w14:val="none"/>
+              </w:rPr>
+            </w:pPr>
+            <w:r>
+              <w:rPr>
+                <w:rFonts w:ascii="Calibri" w:eastAsia="Times New Roman" w:hAnsi="Calibri" w:cs="Calibri"/>
+                <w:color w:val="000000"/>
+                <w:kern w:val="0"/>
+                <w:szCs w:val="22"/>
+                <w:lang w:eastAsia="it-IT"/>
+                <w14:ligatures w14:val="none"/>
+              </w:rPr>
+              <w:t>Benzina e/o gasolio</w:t>
+            </w:r>
+          </w:p>
+        </w:tc>
+      </w:tr>
+      <w:tr>
+        <w:trPr>
+          <w:trHeight w:val="300"/>
+        </w:trPr>
+        <w:tc>
+          <w:tcPr>
+            <w:tcW w:w="480" w:type="dxa"/>
+            <w:tcBorders>
+              <w:top w:val="nil"/>
+              <w:bottom w:val="nil"/>
+              <w:right w:val="single" w:sz="4" w:space="0" w:color="auto"/>
+            </w:tcBorders>
+            <w:noWrap/>
+            <w:vAlign w:val="bottom"/>
+            <w:hideMark/>
+          </w:tcPr>
+          <w:p>
+            <w:pPr>
+              <w:spacing w:before="0" w:after="0"/>
+              <w:contextualSpacing w:val="0"/>
+              <w:rPr>
+                <w:rFonts w:ascii="Calibri" w:eastAsia="Times New Roman" w:hAnsi="Calibri" w:cs="Calibri"/>
+                <w:color w:val="000000"/>
+                <w:kern w:val="0"/>
+                <w:szCs w:val="22"/>
+                <w:lang w:eastAsia="it-IT"/>
+                <w14:ligatures w14:val="none"/>
+              </w:rPr>
+            </w:pPr>
+          </w:p>
+        </w:tc>
+        <w:tc>
+          <w:tcPr>
+            <w:tcW w:w="580" w:type="dxa"/>
+            <w:tcBorders>
+              <w:top w:val="nil"/>
+              <w:left w:val="single" w:sz="4" w:space="0" w:color="auto"/>
+              <w:bottom w:val="nil"/>
+              <w:right w:val="single" w:sz="4" w:space="0" w:color="auto"/>
+            </w:tcBorders>
+            <w:noWrap/>
+            <w:vAlign w:val="bottom"/>
+            <w:hideMark/>
+          </w:tcPr>
+          <w:p>
+            <w:pPr>
+              <w:spacing w:before="0" w:after="0"/>
+              <w:contextualSpacing w:val="0"/>
+              <w:rPr>
+                <w:rFonts w:ascii="Times New Roman" w:eastAsia="Times New Roman" w:hAnsi="Times New Roman" w:cs="Times New Roman"/>
+                <w:kern w:val="0"/>
+                <w:sz w:val="20"/>
+                <w:szCs w:val="20"/>
+                <w:lang w:eastAsia="it-IT"/>
+                <w14:ligatures w14:val="none"/>
+              </w:rPr>
+            </w:pPr>
+          </w:p>
+        </w:tc>
+        <w:tc>
+          <w:tcPr>
+            <w:tcW w:w="860" w:type="dxa"/>
+            <w:tcBorders>
+              <w:top w:val="nil"/>
+              <w:left w:val="single" w:sz="4" w:space="0" w:color="auto"/>
+              <w:bottom w:val="nil"/>
+              <w:right w:val="single" w:sz="4" w:space="0" w:color="auto"/>
+            </w:tcBorders>
+            <w:noWrap/>
+            <w:vAlign w:val="bottom"/>
+            <w:hideMark/>
+          </w:tcPr>
+          <w:p>
+            <w:pPr>
+              <w:spacing w:before="0" w:after="0"/>
+              <w:contextualSpacing w:val="0"/>
+              <w:rPr>
+                <w:rFonts w:ascii="Calibri" w:eastAsia="Times New Roman" w:hAnsi="Calibri" w:cs="Calibri"/>
+                <w:color w:val="000000"/>
+                <w:kern w:val="0"/>
+                <w:szCs w:val="22"/>
+                <w:lang w:eastAsia="it-IT"/>
+                <w14:ligatures w14:val="none"/>
+              </w:rPr>
+            </w:pPr>
+            <w:r>
+              <w:rPr>
+                <w:rFonts w:ascii="Calibri" w:eastAsia="Times New Roman" w:hAnsi="Calibri" w:cs="Calibri"/>
+                <w:color w:val="000000"/>
+                <w:kern w:val="0"/>
+                <w:szCs w:val="22"/>
+                <w:lang w:eastAsia="it-IT"/>
+                <w14:ligatures w14:val="none"/>
+              </w:rPr>
+              <w:t>02.01.03</w:t>
+            </w:r>
+          </w:p>
+        </w:tc>
+        <w:tc>
+          <w:tcPr>
+            <w:tcW w:w="6160" w:type="dxa"/>
+            <w:tcBorders>
+              <w:left w:val="single" w:sz="4" w:space="0" w:color="auto"/>
+            </w:tcBorders>
+            <w:noWrap/>
+            <w:vAlign w:val="bottom"/>
+            <w:hideMark/>
+          </w:tcPr>
+          <w:p>
+            <w:pPr>
+              <w:spacing w:before="0" w:after="0"/>
+              <w:contextualSpacing w:val="0"/>
+              <w:rPr>
+                <w:rFonts w:ascii="Calibri" w:eastAsia="Times New Roman" w:hAnsi="Calibri" w:cs="Calibri"/>
+                <w:color w:val="000000"/>
+                <w:kern w:val="0"/>
+                <w:szCs w:val="22"/>
+                <w:lang w:eastAsia="it-IT"/>
+                <w14:ligatures w14:val="none"/>
+              </w:rPr>
+            </w:pPr>
+            <w:r>
+              <w:rPr>
+                <w:rFonts w:ascii="Calibri" w:eastAsia="Times New Roman" w:hAnsi="Calibri" w:cs="Calibri"/>
+                <w:color w:val="000000"/>
+                <w:kern w:val="0"/>
+                <w:szCs w:val="22"/>
+                <w:lang w:eastAsia="it-IT"/>
+                <w14:ligatures w14:val="none"/>
+              </w:rPr>
+              <w:t>Revisione e/o bollo</w:t>
+            </w:r>
+          </w:p>
+        </w:tc>
+      </w:tr>
+      <w:tr>
+        <w:trPr>
+          <w:trHeight w:val="300"/>
+        </w:trPr>
+        <w:tc>
+          <w:tcPr>
+            <w:tcW w:w="480" w:type="dxa"/>
+            <w:tcBorders>
+              <w:top w:val="nil"/>
+              <w:bottom w:val="single" w:sz="4" w:space="0" w:color="auto"/>
+              <w:right w:val="single" w:sz="4" w:space="0" w:color="auto"/>
+            </w:tcBorders>
+            <w:noWrap/>
+            <w:vAlign w:val="bottom"/>
+            <w:hideMark/>
+          </w:tcPr>
+          <w:p>
+            <w:pPr>
+              <w:spacing w:before="0" w:after="0"/>
+              <w:contextualSpacing w:val="0"/>
+              <w:rPr>
+                <w:rFonts w:ascii="Calibri" w:eastAsia="Times New Roman" w:hAnsi="Calibri" w:cs="Calibri"/>
+                <w:color w:val="000000"/>
+                <w:kern w:val="0"/>
+                <w:szCs w:val="22"/>
+                <w:lang w:eastAsia="it-IT"/>
+                <w14:ligatures w14:val="none"/>
+              </w:rPr>
+            </w:pPr>
+          </w:p>
+        </w:tc>
+        <w:tc>
+          <w:tcPr>
+            <w:tcW w:w="580" w:type="dxa"/>
+            <w:tcBorders>
+              <w:top w:val="nil"/>
+              <w:left w:val="single" w:sz="4" w:space="0" w:color="auto"/>
+              <w:bottom w:val="single" w:sz="4" w:space="0" w:color="auto"/>
+              <w:right w:val="single" w:sz="4" w:space="0" w:color="auto"/>
+            </w:tcBorders>
+            <w:noWrap/>
+            <w:vAlign w:val="bottom"/>
+            <w:hideMark/>
+          </w:tcPr>
+          <w:p>
+            <w:pPr>
+              <w:spacing w:before="0" w:after="0"/>
+              <w:contextualSpacing w:val="0"/>
+              <w:rPr>
+                <w:rFonts w:ascii="Times New Roman" w:eastAsia="Times New Roman" w:hAnsi="Times New Roman" w:cs="Times New Roman"/>
+                <w:kern w:val="0"/>
+                <w:sz w:val="20"/>
+                <w:szCs w:val="20"/>
+                <w:lang w:eastAsia="it-IT"/>
+                <w14:ligatures w14:val="none"/>
+              </w:rPr>
+            </w:pPr>
+          </w:p>
+        </w:tc>
+        <w:tc>
+          <w:tcPr>
+            <w:tcW w:w="860" w:type="dxa"/>
+            <w:tcBorders>
+              <w:top w:val="nil"/>
+              <w:left w:val="single" w:sz="4" w:space="0" w:color="auto"/>
+              <w:bottom w:val="single" w:sz="4" w:space="0" w:color="auto"/>
+              <w:right w:val="single" w:sz="4" w:space="0" w:color="auto"/>
+            </w:tcBorders>
+            <w:noWrap/>
+            <w:vAlign w:val="bottom"/>
+            <w:hideMark/>
+          </w:tcPr>
+          <w:p>
+            <w:pPr>
+              <w:spacing w:before="0" w:after="0"/>
+              <w:contextualSpacing w:val="0"/>
+              <w:rPr>
+                <w:rFonts w:ascii="Calibri" w:eastAsia="Times New Roman" w:hAnsi="Calibri" w:cs="Calibri"/>
+                <w:color w:val="000000"/>
+                <w:kern w:val="0"/>
+                <w:szCs w:val="22"/>
+                <w:lang w:eastAsia="it-IT"/>
+                <w14:ligatures w14:val="none"/>
+              </w:rPr>
+            </w:pPr>
+            <w:r>
+              <w:rPr>
+                <w:rFonts w:ascii="Calibri" w:eastAsia="Times New Roman" w:hAnsi="Calibri" w:cs="Calibri"/>
+                <w:color w:val="000000"/>
+                <w:kern w:val="0"/>
+                <w:szCs w:val="22"/>
+                <w:lang w:eastAsia="it-IT"/>
+                <w14:ligatures w14:val="none"/>
+              </w:rPr>
+              <w:t>02.01.04</w:t>
+            </w:r>
+          </w:p>
+        </w:tc>
+        <w:tc>
+          <w:tcPr>
+            <w:tcW w:w="6160" w:type="dxa"/>
+            <w:tcBorders>
+              <w:left w:val="single" w:sz="4" w:space="0" w:color="auto"/>
+            </w:tcBorders>
+            <w:noWrap/>
+            <w:vAlign w:val="bottom"/>
+            <w:hideMark/>
+          </w:tcPr>
+          <w:p>
+            <w:pPr>
+              <w:spacing w:before="0" w:after="0"/>
+              <w:contextualSpacing w:val="0"/>
+              <w:rPr>
+                <w:rFonts w:ascii="Calibri" w:eastAsia="Times New Roman" w:hAnsi="Calibri" w:cs="Calibri"/>
+                <w:color w:val="000000"/>
+                <w:kern w:val="0"/>
+                <w:szCs w:val="22"/>
+                <w:lang w:eastAsia="it-IT"/>
+                <w14:ligatures w14:val="none"/>
+              </w:rPr>
+            </w:pPr>
+            <w:r>
+              <w:rPr>
+                <w:rFonts w:ascii="Calibri" w:eastAsia="Times New Roman" w:hAnsi="Calibri" w:cs="Calibri"/>
+                <w:color w:val="000000"/>
+                <w:kern w:val="0"/>
+                <w:szCs w:val="22"/>
+                <w:lang w:eastAsia="it-IT"/>
+                <w14:ligatures w14:val="none"/>
+              </w:rPr>
+              <w:t>tagliando</w:t>
+            </w:r>
+          </w:p>
+        </w:tc>
+      </w:tr>
+    </w:tbl>
+    <w:p>
+      <w:r>
+        <w:tab/>
+        <w:t>Etc …</w:t>
+      </w:r>
+    </w:p>
+    <w:p/>
+    <w:p>
+      <w:r>
+        <w:t>Questa funzione è presente all’interno del visualizzatore di codici statistici cliccando sul Tab (1) “Import”, vedi esempio:</w:t>
+      </w:r>
+    </w:p>
+    <w:p>
+      <w:pPr>
+        <w:pStyle w:val="immagine"/>
+      </w:pPr>
+      <w:r>
+        <w:drawing>
+          <wp:inline distT="0" distB="0" distL="0" distR="0" wp14:anchorId="56B64A87" wp14:editId="461E6448">
+            <wp:extent cx="6115050" cy="2105025"/>
+            <wp:effectExtent l="0" t="0" r="0" b="9525"/>
+            <wp:docPr id="950925996" name="Immagine 1"/>
+            <wp:cNvGraphicFramePr>
+              <a:graphicFrameLocks xmlns:a="http://schemas.openxmlformats.org/drawingml/2006/main" noChangeAspect="1"/>
+            </wp:cNvGraphicFramePr>
+            <a:graphic xmlns:a="http://schemas.openxmlformats.org/drawingml/2006/main">
+              <a:graphicData uri="http://schemas.openxmlformats.org/drawingml/2006/picture">
+                <pic:pic xmlns:pic="http://schemas.openxmlformats.org/drawingml/2006/picture">
+                  <pic:nvPicPr>
+                    <pic:cNvPr id="0" name="Picture 1"/>
+                    <pic:cNvPicPr>
+                      <a:picLocks noChangeAspect="1" noChangeArrowheads="1"/>
+                    </pic:cNvPicPr>
+                  </pic:nvPicPr>
+                  <pic:blipFill>
+                    <a:blip r:embed="rId28">
+                      <a:extLst>
+                        <a:ext uri="{28A0092B-C50C-407E-A947-70E740481C1C}">
+                          <a14:useLocalDpi xmlns:a14="http://schemas.microsoft.com/office/drawing/2010/main" val="0"/>
+                        </a:ext>
+                      </a:extLst>
+                    </a:blip>
+                    <a:srcRect/>
+                    <a:stretch>
+                      <a:fillRect/>
+                    </a:stretch>
+                  </pic:blipFill>
+                  <pic:spPr bwMode="auto">
+                    <a:xfrm>
+                      <a:off x="0" y="0"/>
+                      <a:ext cx="6115050" cy="2105025"/>
+                    </a:xfrm>
+                    <a:prstGeom prst="rect">
+                      <a:avLst/>
+                    </a:prstGeom>
+                    <a:noFill/>
+                    <a:ln>
+                      <a:noFill/>
+                    </a:ln>
+                  </pic:spPr>
+                </pic:pic>
+              </a:graphicData>
+            </a:graphic>
+          </wp:inline>
+        </w:drawing>
+      </w:r>
+    </w:p>
+    <w:p>
+      <w:r>
+        <w:t>Dopo aver completato la redazione dei nostri codici statistici e salvato il foglio Excel in un direttorio a piacere: possiamo selezionarlo con BANCA cliccando sul bottone “Cerca…” dopo di ché possiamo eseguire l’</w:t>
+      </w:r>
+      <w:r>
+        <w:rPr>
+          <w:b/>
+        </w:rPr>
+        <w:t>import</w:t>
+      </w:r>
+      <w:r>
+        <w:t xml:space="preserve"> cliccando sul bottone (2) “import” (che diventerà abilitato dopo aver selezionato il file).</w:t>
+      </w:r>
+    </w:p>
+    <w:p>
+      <w:r>
+        <w:t>Verranno emessi dei messaggi di warning se il programma rileva che esistono già delle assegnazioni di codici. E’ vostra scelta, a questo punto, interrompere oppure proseguire.</w:t>
+      </w:r>
+    </w:p>
+    <w:p>
+      <w:pPr>
+        <w:pStyle w:val="Titolo1"/>
+      </w:pPr>
+      <w:bookmarkStart w:id="13" w:name="_Toc225612087"/>
       <w:r>
         <w:lastRenderedPageBreak/>
         <w:t>Indovina Codici Statistici</w:t>
       </w:r>
-      <w:bookmarkEnd w:id="10"/>
+      <w:bookmarkEnd w:id="13"/>
     </w:p>
     <w:p>
       <w:pPr>
         <w:pStyle w:val="Titolo2"/>
       </w:pPr>
-      <w:bookmarkStart w:id="11" w:name="_Toc189322905"/>
+      <w:bookmarkStart w:id="14" w:name="_Toc225612088"/>
       <w:r>
         <w:t>Ricerca Codici Statistici in base alla descrizione</w:t>
       </w:r>
-      <w:bookmarkEnd w:id="11"/>
+      <w:bookmarkEnd w:id="14"/>
     </w:p>
     <w:p>
       <w:r>
@@ -3365,11 +5396,11 @@
       <w:r>
         <w:t xml:space="preserve"> (</w:t>
       </w:r>
-      <w:bookmarkStart w:id="12" w:name="_Hlk189320140"/>
+      <w:bookmarkStart w:id="15" w:name="_Hlk189320140"/>
       <w:r>
         <w:t>CdSt</w:t>
       </w:r>
-      <w:bookmarkEnd w:id="12"/>
+      <w:bookmarkEnd w:id="15"/>
       <w:r>
         <w:t xml:space="preserve">) utilizza algoritmi dell’intelligenza artificiale (AI) della branca specifica della LLM (Large Language Model). In particolare, qui, viene utilizzato per </w:t>
       </w:r>
@@ -3517,7 +5548,7 @@
                     </pic:cNvPicPr>
                   </pic:nvPicPr>
                   <pic:blipFill>
-                    <a:blip r:embed="rId27">
+                    <a:blip r:embed="rId29">
                       <a:extLst>
                         <a:ext uri="{28A0092B-C50C-407E-A947-70E740481C1C}">
                           <a14:useLocalDpi xmlns:a14="http://schemas.microsoft.com/office/drawing/2010/main" val="0"/>
@@ -3601,7 +5632,7 @@
                     <pic:cNvPicPr/>
                   </pic:nvPicPr>
                   <pic:blipFill>
-                    <a:blip r:embed="rId28"/>
+                    <a:blip r:embed="rId30"/>
                     <a:stretch>
                       <a:fillRect/>
                     </a:stretch>
@@ -3631,12 +5662,12 @@
       <w:pPr>
         <w:pStyle w:val="Titolo2"/>
       </w:pPr>
-      <w:bookmarkStart w:id="13" w:name="_Toc189322906"/>
+      <w:bookmarkStart w:id="16" w:name="_Toc225612089"/>
       <w:r>
         <w:lastRenderedPageBreak/>
         <w:t>Assegnazioni particolari</w:t>
       </w:r>
-      <w:bookmarkEnd w:id="13"/>
+      <w:bookmarkEnd w:id="16"/>
     </w:p>
     <w:p>
       <w:r>
@@ -3684,7 +5715,7 @@
                     <pic:cNvPicPr/>
                   </pic:nvPicPr>
                   <pic:blipFill>
-                    <a:blip r:embed="rId29"/>
+                    <a:blip r:embed="rId31"/>
                     <a:stretch>
                       <a:fillRect/>
                     </a:stretch>
@@ -3740,7 +5771,7 @@
                     </pic:cNvPicPr>
                   </pic:nvPicPr>
                   <pic:blipFill>
-                    <a:blip r:embed="rId30">
+                    <a:blip r:embed="rId32">
                       <a:extLst>
                         <a:ext uri="{28A0092B-C50C-407E-A947-70E740481C1C}">
                           <a14:useLocalDpi xmlns:a14="http://schemas.microsoft.com/office/drawing/2010/main" val="0"/>
@@ -3808,7 +5839,7 @@
                     </pic:cNvPicPr>
                   </pic:nvPicPr>
                   <pic:blipFill>
-                    <a:blip r:embed="rId31">
+                    <a:blip r:embed="rId33">
                       <a:extLst>
                         <a:ext uri="{28A0092B-C50C-407E-A947-70E740481C1C}">
                           <a14:useLocalDpi xmlns:a14="http://schemas.microsoft.com/office/drawing/2010/main" val="0"/>
@@ -3884,7 +5915,7 @@
     <w:p/>
     <w:p/>
     <w:sectPr>
-      <w:footerReference w:type="default" r:id="rId32"/>
+      <w:footerReference w:type="default" r:id="rId34"/>
       <w:pgSz w:w="11906" w:h="16838"/>
       <w:pgMar w:top="1417" w:right="1134" w:bottom="1134" w:left="1134" w:header="708" w:footer="708" w:gutter="0"/>
       <w:cols w:space="708"/>
@@ -3895,7 +5926,7 @@
 </file>
 
 <file path=word/endnotes.xml><?xml version="1.0" encoding="utf-8"?>
-<w:endnotes xmlns:wpc="http://schemas.microsoft.com/office/word/2010/wordprocessingCanvas" xmlns:cx="http://schemas.microsoft.com/office/drawing/2014/chartex" xmlns:cx1="http://schemas.microsoft.com/office/drawing/2015/9/8/chartex" xmlns:cx2="http://schemas.microsoft.com/office/drawing/2015/10/21/chartex" xmlns:cx3="http://schemas.microsoft.com/office/drawing/2016/5/9/chartex" xmlns:cx4="http://schemas.microsoft.com/office/drawing/2016/5/10/chartex" xmlns:cx5="http://schemas.microsoft.com/office/drawing/2016/5/11/chartex" xmlns:cx6="http://schemas.microsoft.com/office/drawing/2016/5/12/chartex" xmlns:cx7="http://schemas.microsoft.com/office/drawing/2016/5/13/chartex" xmlns:cx8="http://schemas.microsoft.com/office/drawing/2016/5/14/chartex" xmlns:mc="http://schemas.openxmlformats.org/markup-compatibility/2006" xmlns:aink="http://schemas.microsoft.com/office/drawing/2016/ink" xmlns:am3d="http://schemas.microsoft.com/office/drawing/2017/model3d" xmlns:o="urn:schemas-microsoft-com:office:office" xmlns:oel="http://schemas.microsoft.com/office/2019/extlst" xmlns:r="http://schemas.openxmlformats.org/officeDocument/2006/relationships" xmlns:m="http://schemas.openxmlformats.org/officeDocument/2006/math" xmlns:v="urn:schemas-microsoft-com:vml" xmlns:wp14="http://schemas.microsoft.com/office/word/2010/wordprocessingDrawing" xmlns:wp="http://schemas.openxmlformats.org/drawingml/2006/wordprocessingDrawing" xmlns:w10="urn:schemas-microsoft-com:office:word" xmlns:w="http://schemas.openxmlformats.org/wordprocessingml/2006/main" xmlns:w14="http://schemas.microsoft.com/office/word/2010/wordml" xmlns:w15="http://schemas.microsoft.com/office/word/2012/wordml" xmlns:w16cex="http://schemas.microsoft.com/office/word/2018/wordml/cex" xmlns:w16cid="http://schemas.microsoft.com/office/word/2016/wordml/cid" xmlns:w16="http://schemas.microsoft.com/office/word/2018/wordml" xmlns:w16du="http://schemas.microsoft.com/office/word/2023/wordml/word16du" xmlns:w16sdtdh="http://schemas.microsoft.com/office/word/2020/wordml/sdtdatahash" xmlns:w16sdtfl="http://schemas.microsoft.com/office/word/2024/wordml/sdtformatlock" xmlns:w16se="http://schemas.microsoft.com/office/word/2015/wordml/symex" xmlns:wpg="http://schemas.microsoft.com/office/word/2010/wordprocessingGroup" xmlns:wpi="http://schemas.microsoft.com/office/word/2010/wordprocessingInk" xmlns:wne="http://schemas.microsoft.com/office/word/2006/wordml" xmlns:wps="http://schemas.microsoft.com/office/word/2010/wordprocessingShape" mc:Ignorable="w14 w15 w16se w16cid w16 w16cex w16sdtdh w16sdtfl w16du wp14">
+<w:endnotes xmlns:wpc="http://schemas.microsoft.com/office/word/2010/wordprocessingCanvas" xmlns:cx="http://schemas.microsoft.com/office/drawing/2014/chartex" xmlns:cx1="http://schemas.microsoft.com/office/drawing/2015/9/8/chartex" xmlns:cx2="http://schemas.microsoft.com/office/drawing/2015/10/21/chartex" xmlns:cx3="http://schemas.microsoft.com/office/drawing/2016/5/9/chartex" xmlns:cx4="http://schemas.microsoft.com/office/drawing/2016/5/10/chartex" xmlns:cx5="http://schemas.microsoft.com/office/drawing/2016/5/11/chartex" xmlns:cx6="http://schemas.microsoft.com/office/drawing/2016/5/12/chartex" xmlns:cx7="http://schemas.microsoft.com/office/drawing/2016/5/13/chartex" xmlns:cx8="http://schemas.microsoft.com/office/drawing/2016/5/14/chartex" xmlns:mc="http://schemas.openxmlformats.org/markup-compatibility/2006" xmlns:aink="http://schemas.microsoft.com/office/drawing/2016/ink" xmlns:am3d="http://schemas.microsoft.com/office/drawing/2017/model3d" xmlns:o="urn:schemas-microsoft-com:office:office" xmlns:oel="http://schemas.microsoft.com/office/2019/extlst" xmlns:r="http://schemas.openxmlformats.org/officeDocument/2006/relationships" xmlns:m="http://schemas.openxmlformats.org/officeDocument/2006/math" xmlns:v="urn:schemas-microsoft-com:vml" xmlns:wp14="http://schemas.microsoft.com/office/word/2010/wordprocessingDrawing" xmlns:wp="http://schemas.openxmlformats.org/drawingml/2006/wordprocessingDrawing" xmlns:w10="urn:schemas-microsoft-com:office:word" xmlns:w="http://schemas.openxmlformats.org/wordprocessingml/2006/main" xmlns:w14="http://schemas.microsoft.com/office/word/2010/wordml" xmlns:w15="http://schemas.microsoft.com/office/word/2012/wordml" xmlns:w16cex="http://schemas.microsoft.com/office/word/2018/wordml/cex" xmlns:w16cid="http://schemas.microsoft.com/office/word/2016/wordml/cid" xmlns:w16="http://schemas.microsoft.com/office/word/2018/wordml" xmlns:w16sdtdh="http://schemas.microsoft.com/office/word/2020/wordml/sdtdatahash" xmlns:w16se="http://schemas.microsoft.com/office/word/2015/wordml/symex" xmlns:wpg="http://schemas.microsoft.com/office/word/2010/wordprocessingGroup" xmlns:wpi="http://schemas.microsoft.com/office/word/2010/wordprocessingInk" xmlns:wne="http://schemas.microsoft.com/office/word/2006/wordml" xmlns:wps="http://schemas.microsoft.com/office/word/2010/wordprocessingShape" mc:Ignorable="w14 w15 w16se w16cid w16 w16cex w16sdtdh wp14">
   <w:endnote w:type="separator" w:id="-1">
     <w:p>
       <w:pPr>
@@ -3920,7 +5951,7 @@
 </file>
 
 <file path=word/footer1.xml><?xml version="1.0" encoding="utf-8"?>
-<w:ftr xmlns:wpc="http://schemas.microsoft.com/office/word/2010/wordprocessingCanvas" xmlns:cx="http://schemas.microsoft.com/office/drawing/2014/chartex" xmlns:cx1="http://schemas.microsoft.com/office/drawing/2015/9/8/chartex" xmlns:cx2="http://schemas.microsoft.com/office/drawing/2015/10/21/chartex" xmlns:cx3="http://schemas.microsoft.com/office/drawing/2016/5/9/chartex" xmlns:cx4="http://schemas.microsoft.com/office/drawing/2016/5/10/chartex" xmlns:cx5="http://schemas.microsoft.com/office/drawing/2016/5/11/chartex" xmlns:cx6="http://schemas.microsoft.com/office/drawing/2016/5/12/chartex" xmlns:cx7="http://schemas.microsoft.com/office/drawing/2016/5/13/chartex" xmlns:cx8="http://schemas.microsoft.com/office/drawing/2016/5/14/chartex" xmlns:mc="http://schemas.openxmlformats.org/markup-compatibility/2006" xmlns:aink="http://schemas.microsoft.com/office/drawing/2016/ink" xmlns:am3d="http://schemas.microsoft.com/office/drawing/2017/model3d" xmlns:o="urn:schemas-microsoft-com:office:office" xmlns:oel="http://schemas.microsoft.com/office/2019/extlst" xmlns:r="http://schemas.openxmlformats.org/officeDocument/2006/relationships" xmlns:m="http://schemas.openxmlformats.org/officeDocument/2006/math" xmlns:v="urn:schemas-microsoft-com:vml" xmlns:wp14="http://schemas.microsoft.com/office/word/2010/wordprocessingDrawing" xmlns:wp="http://schemas.openxmlformats.org/drawingml/2006/wordprocessingDrawing" xmlns:w10="urn:schemas-microsoft-com:office:word" xmlns:w="http://schemas.openxmlformats.org/wordprocessingml/2006/main" xmlns:w14="http://schemas.microsoft.com/office/word/2010/wordml" xmlns:w15="http://schemas.microsoft.com/office/word/2012/wordml" xmlns:w16cex="http://schemas.microsoft.com/office/word/2018/wordml/cex" xmlns:w16cid="http://schemas.microsoft.com/office/word/2016/wordml/cid" xmlns:w16="http://schemas.microsoft.com/office/word/2018/wordml" xmlns:w16du="http://schemas.microsoft.com/office/word/2023/wordml/word16du" xmlns:w16sdtdh="http://schemas.microsoft.com/office/word/2020/wordml/sdtdatahash" xmlns:w16sdtfl="http://schemas.microsoft.com/office/word/2024/wordml/sdtformatlock" xmlns:w16se="http://schemas.microsoft.com/office/word/2015/wordml/symex" xmlns:wpg="http://schemas.microsoft.com/office/word/2010/wordprocessingGroup" xmlns:wpi="http://schemas.microsoft.com/office/word/2010/wordprocessingInk" xmlns:wne="http://schemas.microsoft.com/office/word/2006/wordml" xmlns:wps="http://schemas.microsoft.com/office/word/2010/wordprocessingShape" mc:Ignorable="w14 w15 w16se w16cid w16 w16cex w16sdtdh w16sdtfl w16du wp14">
+<w:ftr xmlns:wpc="http://schemas.microsoft.com/office/word/2010/wordprocessingCanvas" xmlns:cx="http://schemas.microsoft.com/office/drawing/2014/chartex" xmlns:cx1="http://schemas.microsoft.com/office/drawing/2015/9/8/chartex" xmlns:cx2="http://schemas.microsoft.com/office/drawing/2015/10/21/chartex" xmlns:cx3="http://schemas.microsoft.com/office/drawing/2016/5/9/chartex" xmlns:cx4="http://schemas.microsoft.com/office/drawing/2016/5/10/chartex" xmlns:cx5="http://schemas.microsoft.com/office/drawing/2016/5/11/chartex" xmlns:cx6="http://schemas.microsoft.com/office/drawing/2016/5/12/chartex" xmlns:cx7="http://schemas.microsoft.com/office/drawing/2016/5/13/chartex" xmlns:cx8="http://schemas.microsoft.com/office/drawing/2016/5/14/chartex" xmlns:mc="http://schemas.openxmlformats.org/markup-compatibility/2006" xmlns:aink="http://schemas.microsoft.com/office/drawing/2016/ink" xmlns:am3d="http://schemas.microsoft.com/office/drawing/2017/model3d" xmlns:o="urn:schemas-microsoft-com:office:office" xmlns:oel="http://schemas.microsoft.com/office/2019/extlst" xmlns:r="http://schemas.openxmlformats.org/officeDocument/2006/relationships" xmlns:m="http://schemas.openxmlformats.org/officeDocument/2006/math" xmlns:v="urn:schemas-microsoft-com:vml" xmlns:wp14="http://schemas.microsoft.com/office/word/2010/wordprocessingDrawing" xmlns:wp="http://schemas.openxmlformats.org/drawingml/2006/wordprocessingDrawing" xmlns:w10="urn:schemas-microsoft-com:office:word" xmlns:w="http://schemas.openxmlformats.org/wordprocessingml/2006/main" xmlns:w14="http://schemas.microsoft.com/office/word/2010/wordml" xmlns:w15="http://schemas.microsoft.com/office/word/2012/wordml" xmlns:w16cex="http://schemas.microsoft.com/office/word/2018/wordml/cex" xmlns:w16cid="http://schemas.microsoft.com/office/word/2016/wordml/cid" xmlns:w16="http://schemas.microsoft.com/office/word/2018/wordml" xmlns:w16sdtdh="http://schemas.microsoft.com/office/word/2020/wordml/sdtdatahash" xmlns:w16se="http://schemas.microsoft.com/office/word/2015/wordml/symex" xmlns:wpg="http://schemas.microsoft.com/office/word/2010/wordprocessingGroup" xmlns:wpi="http://schemas.microsoft.com/office/word/2010/wordprocessingInk" xmlns:wne="http://schemas.microsoft.com/office/word/2006/wordml" xmlns:wps="http://schemas.microsoft.com/office/word/2010/wordprocessingShape" mc:Ignorable="w14 w15 w16se w16cid w16 w16cex w16sdtdh wp14">
   <w:p>
     <w:pPr>
       <w:rPr>
@@ -4027,7 +6058,7 @@
 </file>
 
 <file path=word/footnotes.xml><?xml version="1.0" encoding="utf-8"?>
-<w:footnotes xmlns:wpc="http://schemas.microsoft.com/office/word/2010/wordprocessingCanvas" xmlns:cx="http://schemas.microsoft.com/office/drawing/2014/chartex" xmlns:cx1="http://schemas.microsoft.com/office/drawing/2015/9/8/chartex" xmlns:cx2="http://schemas.microsoft.com/office/drawing/2015/10/21/chartex" xmlns:cx3="http://schemas.microsoft.com/office/drawing/2016/5/9/chartex" xmlns:cx4="http://schemas.microsoft.com/office/drawing/2016/5/10/chartex" xmlns:cx5="http://schemas.microsoft.com/office/drawing/2016/5/11/chartex" xmlns:cx6="http://schemas.microsoft.com/office/drawing/2016/5/12/chartex" xmlns:cx7="http://schemas.microsoft.com/office/drawing/2016/5/13/chartex" xmlns:cx8="http://schemas.microsoft.com/office/drawing/2016/5/14/chartex" xmlns:mc="http://schemas.openxmlformats.org/markup-compatibility/2006" xmlns:aink="http://schemas.microsoft.com/office/drawing/2016/ink" xmlns:am3d="http://schemas.microsoft.com/office/drawing/2017/model3d" xmlns:o="urn:schemas-microsoft-com:office:office" xmlns:oel="http://schemas.microsoft.com/office/2019/extlst" xmlns:r="http://schemas.openxmlformats.org/officeDocument/2006/relationships" xmlns:m="http://schemas.openxmlformats.org/officeDocument/2006/math" xmlns:v="urn:schemas-microsoft-com:vml" xmlns:wp14="http://schemas.microsoft.com/office/word/2010/wordprocessingDrawing" xmlns:wp="http://schemas.openxmlformats.org/drawingml/2006/wordprocessingDrawing" xmlns:w10="urn:schemas-microsoft-com:office:word" xmlns:w="http://schemas.openxmlformats.org/wordprocessingml/2006/main" xmlns:w14="http://schemas.microsoft.com/office/word/2010/wordml" xmlns:w15="http://schemas.microsoft.com/office/word/2012/wordml" xmlns:w16cex="http://schemas.microsoft.com/office/word/2018/wordml/cex" xmlns:w16cid="http://schemas.microsoft.com/office/word/2016/wordml/cid" xmlns:w16="http://schemas.microsoft.com/office/word/2018/wordml" xmlns:w16du="http://schemas.microsoft.com/office/word/2023/wordml/word16du" xmlns:w16sdtdh="http://schemas.microsoft.com/office/word/2020/wordml/sdtdatahash" xmlns:w16sdtfl="http://schemas.microsoft.com/office/word/2024/wordml/sdtformatlock" xmlns:w16se="http://schemas.microsoft.com/office/word/2015/wordml/symex" xmlns:wpg="http://schemas.microsoft.com/office/word/2010/wordprocessingGroup" xmlns:wpi="http://schemas.microsoft.com/office/word/2010/wordprocessingInk" xmlns:wne="http://schemas.microsoft.com/office/word/2006/wordml" xmlns:wps="http://schemas.microsoft.com/office/word/2010/wordprocessingShape" mc:Ignorable="w14 w15 w16se w16cid w16 w16cex w16sdtdh w16sdtfl w16du wp14">
+<w:footnotes xmlns:wpc="http://schemas.microsoft.com/office/word/2010/wordprocessingCanvas" xmlns:cx="http://schemas.microsoft.com/office/drawing/2014/chartex" xmlns:cx1="http://schemas.microsoft.com/office/drawing/2015/9/8/chartex" xmlns:cx2="http://schemas.microsoft.com/office/drawing/2015/10/21/chartex" xmlns:cx3="http://schemas.microsoft.com/office/drawing/2016/5/9/chartex" xmlns:cx4="http://schemas.microsoft.com/office/drawing/2016/5/10/chartex" xmlns:cx5="http://schemas.microsoft.com/office/drawing/2016/5/11/chartex" xmlns:cx6="http://schemas.microsoft.com/office/drawing/2016/5/12/chartex" xmlns:cx7="http://schemas.microsoft.com/office/drawing/2016/5/13/chartex" xmlns:cx8="http://schemas.microsoft.com/office/drawing/2016/5/14/chartex" xmlns:mc="http://schemas.openxmlformats.org/markup-compatibility/2006" xmlns:aink="http://schemas.microsoft.com/office/drawing/2016/ink" xmlns:am3d="http://schemas.microsoft.com/office/drawing/2017/model3d" xmlns:o="urn:schemas-microsoft-com:office:office" xmlns:oel="http://schemas.microsoft.com/office/2019/extlst" xmlns:r="http://schemas.openxmlformats.org/officeDocument/2006/relationships" xmlns:m="http://schemas.openxmlformats.org/officeDocument/2006/math" xmlns:v="urn:schemas-microsoft-com:vml" xmlns:wp14="http://schemas.microsoft.com/office/word/2010/wordprocessingDrawing" xmlns:wp="http://schemas.openxmlformats.org/drawingml/2006/wordprocessingDrawing" xmlns:w10="urn:schemas-microsoft-com:office:word" xmlns:w="http://schemas.openxmlformats.org/wordprocessingml/2006/main" xmlns:w14="http://schemas.microsoft.com/office/word/2010/wordml" xmlns:w15="http://schemas.microsoft.com/office/word/2012/wordml" xmlns:w16cex="http://schemas.microsoft.com/office/word/2018/wordml/cex" xmlns:w16cid="http://schemas.microsoft.com/office/word/2016/wordml/cid" xmlns:w16="http://schemas.microsoft.com/office/word/2018/wordml" xmlns:w16sdtdh="http://schemas.microsoft.com/office/word/2020/wordml/sdtdatahash" xmlns:w16se="http://schemas.microsoft.com/office/word/2015/wordml/symex" xmlns:wpg="http://schemas.microsoft.com/office/word/2010/wordprocessingGroup" xmlns:wpi="http://schemas.microsoft.com/office/word/2010/wordprocessingInk" xmlns:wne="http://schemas.microsoft.com/office/word/2006/wordml" xmlns:wps="http://schemas.microsoft.com/office/word/2010/wordprocessingShape" mc:Ignorable="w14 w15 w16se w16cid w16 w16cex w16sdtdh wp14">
   <w:footnote w:type="separator" w:id="-1">
     <w:p>
       <w:pPr>
@@ -4052,7 +6083,7 @@
 </file>
 
 <file path=word/numbering.xml><?xml version="1.0" encoding="utf-8"?>
-<w:numbering xmlns:wpc="http://schemas.microsoft.com/office/word/2010/wordprocessingCanvas" xmlns:cx="http://schemas.microsoft.com/office/drawing/2014/chartex" xmlns:cx1="http://schemas.microsoft.com/office/drawing/2015/9/8/chartex" xmlns:cx2="http://schemas.microsoft.com/office/drawing/2015/10/21/chartex" xmlns:cx3="http://schemas.microsoft.com/office/drawing/2016/5/9/chartex" xmlns:cx4="http://schemas.microsoft.com/office/drawing/2016/5/10/chartex" xmlns:cx5="http://schemas.microsoft.com/office/drawing/2016/5/11/chartex" xmlns:cx6="http://schemas.microsoft.com/office/drawing/2016/5/12/chartex" xmlns:cx7="http://schemas.microsoft.com/office/drawing/2016/5/13/chartex" xmlns:cx8="http://schemas.microsoft.com/office/drawing/2016/5/14/chartex" xmlns:mc="http://schemas.openxmlformats.org/markup-compatibility/2006" xmlns:aink="http://schemas.microsoft.com/office/drawing/2016/ink" xmlns:am3d="http://schemas.microsoft.com/office/drawing/2017/model3d" xmlns:o="urn:schemas-microsoft-com:office:office" xmlns:oel="http://schemas.microsoft.com/office/2019/extlst" xmlns:r="http://schemas.openxmlformats.org/officeDocument/2006/relationships" xmlns:m="http://schemas.openxmlformats.org/officeDocument/2006/math" xmlns:v="urn:schemas-microsoft-com:vml" xmlns:wp14="http://schemas.microsoft.com/office/word/2010/wordprocessingDrawing" xmlns:wp="http://schemas.openxmlformats.org/drawingml/2006/wordprocessingDrawing" xmlns:w10="urn:schemas-microsoft-com:office:word" xmlns:w="http://schemas.openxmlformats.org/wordprocessingml/2006/main" xmlns:w14="http://schemas.microsoft.com/office/word/2010/wordml" xmlns:w15="http://schemas.microsoft.com/office/word/2012/wordml" xmlns:w16cex="http://schemas.microsoft.com/office/word/2018/wordml/cex" xmlns:w16cid="http://schemas.microsoft.com/office/word/2016/wordml/cid" xmlns:w16="http://schemas.microsoft.com/office/word/2018/wordml" xmlns:w16du="http://schemas.microsoft.com/office/word/2023/wordml/word16du" xmlns:w16sdtdh="http://schemas.microsoft.com/office/word/2020/wordml/sdtdatahash" xmlns:w16sdtfl="http://schemas.microsoft.com/office/word/2024/wordml/sdtformatlock" xmlns:w16se="http://schemas.microsoft.com/office/word/2015/wordml/symex" xmlns:wpg="http://schemas.microsoft.com/office/word/2010/wordprocessingGroup" xmlns:wpi="http://schemas.microsoft.com/office/word/2010/wordprocessingInk" xmlns:wne="http://schemas.microsoft.com/office/word/2006/wordml" xmlns:wps="http://schemas.microsoft.com/office/word/2010/wordprocessingShape" mc:Ignorable="w14 w15 w16se w16cid w16 w16cex w16sdtdh w16sdtfl w16du wp14">
+<w:numbering xmlns:wpc="http://schemas.microsoft.com/office/word/2010/wordprocessingCanvas" xmlns:cx="http://schemas.microsoft.com/office/drawing/2014/chartex" xmlns:cx1="http://schemas.microsoft.com/office/drawing/2015/9/8/chartex" xmlns:cx2="http://schemas.microsoft.com/office/drawing/2015/10/21/chartex" xmlns:cx3="http://schemas.microsoft.com/office/drawing/2016/5/9/chartex" xmlns:cx4="http://schemas.microsoft.com/office/drawing/2016/5/10/chartex" xmlns:cx5="http://schemas.microsoft.com/office/drawing/2016/5/11/chartex" xmlns:cx6="http://schemas.microsoft.com/office/drawing/2016/5/12/chartex" xmlns:cx7="http://schemas.microsoft.com/office/drawing/2016/5/13/chartex" xmlns:cx8="http://schemas.microsoft.com/office/drawing/2016/5/14/chartex" xmlns:mc="http://schemas.openxmlformats.org/markup-compatibility/2006" xmlns:aink="http://schemas.microsoft.com/office/drawing/2016/ink" xmlns:am3d="http://schemas.microsoft.com/office/drawing/2017/model3d" xmlns:o="urn:schemas-microsoft-com:office:office" xmlns:oel="http://schemas.microsoft.com/office/2019/extlst" xmlns:r="http://schemas.openxmlformats.org/officeDocument/2006/relationships" xmlns:m="http://schemas.openxmlformats.org/officeDocument/2006/math" xmlns:v="urn:schemas-microsoft-com:vml" xmlns:wp14="http://schemas.microsoft.com/office/word/2010/wordprocessingDrawing" xmlns:wp="http://schemas.openxmlformats.org/drawingml/2006/wordprocessingDrawing" xmlns:w10="urn:schemas-microsoft-com:office:word" xmlns:w="http://schemas.openxmlformats.org/wordprocessingml/2006/main" xmlns:w14="http://schemas.microsoft.com/office/word/2010/wordml" xmlns:w15="http://schemas.microsoft.com/office/word/2012/wordml" xmlns:w16cex="http://schemas.microsoft.com/office/word/2018/wordml/cex" xmlns:w16cid="http://schemas.microsoft.com/office/word/2016/wordml/cid" xmlns:w16="http://schemas.microsoft.com/office/word/2018/wordml" xmlns:w16sdtdh="http://schemas.microsoft.com/office/word/2020/wordml/sdtdatahash" xmlns:w16se="http://schemas.microsoft.com/office/word/2015/wordml/symex" xmlns:wpg="http://schemas.microsoft.com/office/word/2010/wordprocessingGroup" xmlns:wpi="http://schemas.microsoft.com/office/word/2010/wordprocessingInk" xmlns:wne="http://schemas.microsoft.com/office/word/2006/wordml" xmlns:wps="http://schemas.microsoft.com/office/word/2010/wordprocessingShape" mc:Ignorable="w14 w15 w16se w16cid w16 w16cex w16sdtdh wp14">
   <w:abstractNum w:abstractNumId="0" w15:restartNumberingAfterBreak="0">
     <w:nsid w:val="09134145"/>
     <w:multiLevelType w:val="hybridMultilevel"/>
@@ -4366,6 +6397,119 @@
     </w:lvl>
   </w:abstractNum>
   <w:abstractNum w:abstractNumId="3" w15:restartNumberingAfterBreak="0">
+    <w:nsid w:val="0EC54157"/>
+    <w:multiLevelType w:val="hybridMultilevel"/>
+    <w:tmpl w:val="DC6EEAD8"/>
+    <w:lvl w:ilvl="0" w:tplc="04100001">
+      <w:start w:val="1"/>
+      <w:numFmt w:val="bullet"/>
+      <w:lvlText w:val=""/>
+      <w:lvlJc w:val="left"/>
+      <w:pPr>
+        <w:ind w:left="720" w:hanging="360"/>
+      </w:pPr>
+      <w:rPr>
+        <w:rFonts w:ascii="Symbol" w:hAnsi="Symbol" w:hint="default"/>
+      </w:rPr>
+    </w:lvl>
+    <w:lvl w:ilvl="1" w:tplc="04100003" w:tentative="1">
+      <w:start w:val="1"/>
+      <w:numFmt w:val="bullet"/>
+      <w:lvlText w:val="o"/>
+      <w:lvlJc w:val="left"/>
+      <w:pPr>
+        <w:ind w:left="1440" w:hanging="360"/>
+      </w:pPr>
+      <w:rPr>
+        <w:rFonts w:ascii="Courier New" w:hAnsi="Courier New" w:cs="Courier New" w:hint="default"/>
+      </w:rPr>
+    </w:lvl>
+    <w:lvl w:ilvl="2" w:tplc="04100005" w:tentative="1">
+      <w:start w:val="1"/>
+      <w:numFmt w:val="bullet"/>
+      <w:lvlText w:val=""/>
+      <w:lvlJc w:val="left"/>
+      <w:pPr>
+        <w:ind w:left="2160" w:hanging="360"/>
+      </w:pPr>
+      <w:rPr>
+        <w:rFonts w:ascii="Wingdings" w:hAnsi="Wingdings" w:hint="default"/>
+      </w:rPr>
+    </w:lvl>
+    <w:lvl w:ilvl="3" w:tplc="04100001" w:tentative="1">
+      <w:start w:val="1"/>
+      <w:numFmt w:val="bullet"/>
+      <w:lvlText w:val=""/>
+      <w:lvlJc w:val="left"/>
+      <w:pPr>
+        <w:ind w:left="2880" w:hanging="360"/>
+      </w:pPr>
+      <w:rPr>
+        <w:rFonts w:ascii="Symbol" w:hAnsi="Symbol" w:hint="default"/>
+      </w:rPr>
+    </w:lvl>
+    <w:lvl w:ilvl="4" w:tplc="04100003" w:tentative="1">
+      <w:start w:val="1"/>
+      <w:numFmt w:val="bullet"/>
+      <w:lvlText w:val="o"/>
+      <w:lvlJc w:val="left"/>
+      <w:pPr>
+        <w:ind w:left="3600" w:hanging="360"/>
+      </w:pPr>
+      <w:rPr>
+        <w:rFonts w:ascii="Courier New" w:hAnsi="Courier New" w:cs="Courier New" w:hint="default"/>
+      </w:rPr>
+    </w:lvl>
+    <w:lvl w:ilvl="5" w:tplc="04100005" w:tentative="1">
+      <w:start w:val="1"/>
+      <w:numFmt w:val="bullet"/>
+      <w:lvlText w:val=""/>
+      <w:lvlJc w:val="left"/>
+      <w:pPr>
+        <w:ind w:left="4320" w:hanging="360"/>
+      </w:pPr>
+      <w:rPr>
+        <w:rFonts w:ascii="Wingdings" w:hAnsi="Wingdings" w:hint="default"/>
+      </w:rPr>
+    </w:lvl>
+    <w:lvl w:ilvl="6" w:tplc="04100001" w:tentative="1">
+      <w:start w:val="1"/>
+      <w:numFmt w:val="bullet"/>
+      <w:lvlText w:val=""/>
+      <w:lvlJc w:val="left"/>
+      <w:pPr>
+        <w:ind w:left="5040" w:hanging="360"/>
+      </w:pPr>
+      <w:rPr>
+        <w:rFonts w:ascii="Symbol" w:hAnsi="Symbol" w:hint="default"/>
+      </w:rPr>
+    </w:lvl>
+    <w:lvl w:ilvl="7" w:tplc="04100003" w:tentative="1">
+      <w:start w:val="1"/>
+      <w:numFmt w:val="bullet"/>
+      <w:lvlText w:val="o"/>
+      <w:lvlJc w:val="left"/>
+      <w:pPr>
+        <w:ind w:left="5760" w:hanging="360"/>
+      </w:pPr>
+      <w:rPr>
+        <w:rFonts w:ascii="Courier New" w:hAnsi="Courier New" w:cs="Courier New" w:hint="default"/>
+      </w:rPr>
+    </w:lvl>
+    <w:lvl w:ilvl="8" w:tplc="04100005" w:tentative="1">
+      <w:start w:val="1"/>
+      <w:numFmt w:val="bullet"/>
+      <w:lvlText w:val=""/>
+      <w:lvlJc w:val="left"/>
+      <w:pPr>
+        <w:ind w:left="6480" w:hanging="360"/>
+      </w:pPr>
+      <w:rPr>
+        <w:rFonts w:ascii="Wingdings" w:hAnsi="Wingdings" w:hint="default"/>
+      </w:rPr>
+    </w:lvl>
+  </w:abstractNum>
+  <w:abstractNum w:abstractNumId="4" w15:restartNumberingAfterBreak="0">
     <w:nsid w:val="11342EAF"/>
     <w:multiLevelType w:val="hybridMultilevel"/>
     <w:tmpl w:val="5FC8D1C8"/>
@@ -4478,7 +6622,7 @@
       </w:rPr>
     </w:lvl>
   </w:abstractNum>
-  <w:abstractNum w:abstractNumId="4" w15:restartNumberingAfterBreak="0">
+  <w:abstractNum w:abstractNumId="5" w15:restartNumberingAfterBreak="0">
     <w:nsid w:val="12A7350F"/>
     <w:multiLevelType w:val="hybridMultilevel"/>
     <w:tmpl w:val="756E8FD4"/>
@@ -4564,7 +6708,7 @@
       </w:pPr>
     </w:lvl>
   </w:abstractNum>
-  <w:abstractNum w:abstractNumId="5" w15:restartNumberingAfterBreak="0">
+  <w:abstractNum w:abstractNumId="6" w15:restartNumberingAfterBreak="0">
     <w:nsid w:val="1613185D"/>
     <w:multiLevelType w:val="hybridMultilevel"/>
     <w:tmpl w:val="4ECC7E7C"/>
@@ -4650,7 +6794,7 @@
       </w:pPr>
     </w:lvl>
   </w:abstractNum>
-  <w:abstractNum w:abstractNumId="6" w15:restartNumberingAfterBreak="0">
+  <w:abstractNum w:abstractNumId="7" w15:restartNumberingAfterBreak="0">
     <w:nsid w:val="26681B65"/>
     <w:multiLevelType w:val="hybridMultilevel"/>
     <w:tmpl w:val="4E40627E"/>
@@ -4736,7 +6880,7 @@
       </w:pPr>
     </w:lvl>
   </w:abstractNum>
-  <w:abstractNum w:abstractNumId="7" w15:restartNumberingAfterBreak="0">
+  <w:abstractNum w:abstractNumId="8" w15:restartNumberingAfterBreak="0">
     <w:nsid w:val="48C0307B"/>
     <w:multiLevelType w:val="multilevel"/>
     <w:tmpl w:val="0410001F"/>
@@ -4849,7 +6993,7 @@
       </w:rPr>
     </w:lvl>
   </w:abstractNum>
-  <w:abstractNum w:abstractNumId="8" w15:restartNumberingAfterBreak="0">
+  <w:abstractNum w:abstractNumId="9" w15:restartNumberingAfterBreak="0">
     <w:nsid w:val="584774CD"/>
     <w:multiLevelType w:val="hybridMultilevel"/>
     <w:tmpl w:val="565A52C6"/>
@@ -4962,7 +7106,7 @@
       </w:rPr>
     </w:lvl>
   </w:abstractNum>
-  <w:abstractNum w:abstractNumId="9" w15:restartNumberingAfterBreak="0">
+  <w:abstractNum w:abstractNumId="10" w15:restartNumberingAfterBreak="0">
     <w:nsid w:val="6A4937C0"/>
     <w:multiLevelType w:val="hybridMultilevel"/>
     <w:tmpl w:val="0644C842"/>
@@ -5048,7 +7192,7 @@
       </w:pPr>
     </w:lvl>
   </w:abstractNum>
-  <w:abstractNum w:abstractNumId="10" w15:restartNumberingAfterBreak="0">
+  <w:abstractNum w:abstractNumId="11" w15:restartNumberingAfterBreak="0">
     <w:nsid w:val="6DB20639"/>
     <w:multiLevelType w:val="hybridMultilevel"/>
     <w:tmpl w:val="F0441AB8"/>
@@ -5161,7 +7305,7 @@
       </w:rPr>
     </w:lvl>
   </w:abstractNum>
-  <w:abstractNum w:abstractNumId="11" w15:restartNumberingAfterBreak="0">
+  <w:abstractNum w:abstractNumId="12" w15:restartNumberingAfterBreak="0">
     <w:nsid w:val="73735300"/>
     <w:multiLevelType w:val="hybridMultilevel"/>
     <w:tmpl w:val="C39838EA"/>
@@ -5248,13 +7392,13 @@
     </w:lvl>
   </w:abstractNum>
   <w:num w:numId="1" w16cid:durableId="1729955839">
-    <w:abstractNumId w:val="9"/>
+    <w:abstractNumId w:val="10"/>
   </w:num>
   <w:num w:numId="2" w16cid:durableId="882208912">
-    <w:abstractNumId w:val="4"/>
+    <w:abstractNumId w:val="5"/>
   </w:num>
   <w:num w:numId="3" w16cid:durableId="2118325385">
-    <w:abstractNumId w:val="11"/>
+    <w:abstractNumId w:val="12"/>
   </w:num>
   <w:num w:numId="4" w16cid:durableId="1805810936">
     <w:abstractNumId w:val="0"/>
@@ -5263,31 +7407,34 @@
     <w:abstractNumId w:val="2"/>
   </w:num>
   <w:num w:numId="6" w16cid:durableId="72164194">
-    <w:abstractNumId w:val="6"/>
+    <w:abstractNumId w:val="7"/>
   </w:num>
   <w:num w:numId="7" w16cid:durableId="696850630">
-    <w:abstractNumId w:val="3"/>
+    <w:abstractNumId w:val="4"/>
   </w:num>
   <w:num w:numId="8" w16cid:durableId="633408106">
-    <w:abstractNumId w:val="7"/>
+    <w:abstractNumId w:val="8"/>
   </w:num>
   <w:num w:numId="9" w16cid:durableId="907686083">
-    <w:abstractNumId w:val="10"/>
+    <w:abstractNumId w:val="11"/>
   </w:num>
   <w:num w:numId="10" w16cid:durableId="1810248850">
     <w:abstractNumId w:val="1"/>
   </w:num>
   <w:num w:numId="11" w16cid:durableId="1048803791">
-    <w:abstractNumId w:val="8"/>
+    <w:abstractNumId w:val="9"/>
   </w:num>
   <w:num w:numId="12" w16cid:durableId="636256198">
-    <w:abstractNumId w:val="5"/>
+    <w:abstractNumId w:val="6"/>
+  </w:num>
+  <w:num w:numId="13" w16cid:durableId="1321613549">
+    <w:abstractNumId w:val="3"/>
   </w:num>
 </w:numbering>
 </file>
 
 <file path=word/styles.xml><?xml version="1.0" encoding="utf-8"?>
-<w:styles xmlns:mc="http://schemas.openxmlformats.org/markup-compatibility/2006" xmlns:r="http://schemas.openxmlformats.org/officeDocument/2006/relationships" xmlns:w="http://schemas.openxmlformats.org/wordprocessingml/2006/main" xmlns:w14="http://schemas.microsoft.com/office/word/2010/wordml" xmlns:w15="http://schemas.microsoft.com/office/word/2012/wordml" xmlns:w16cex="http://schemas.microsoft.com/office/word/2018/wordml/cex" xmlns:w16cid="http://schemas.microsoft.com/office/word/2016/wordml/cid" xmlns:w16="http://schemas.microsoft.com/office/word/2018/wordml" xmlns:w16du="http://schemas.microsoft.com/office/word/2023/wordml/word16du" xmlns:w16sdtdh="http://schemas.microsoft.com/office/word/2020/wordml/sdtdatahash" xmlns:w16sdtfl="http://schemas.microsoft.com/office/word/2024/wordml/sdtformatlock" xmlns:w16se="http://schemas.microsoft.com/office/word/2015/wordml/symex" mc:Ignorable="w14 w15 w16se w16cid w16 w16cex w16sdtdh w16sdtfl w16du">
+<w:styles xmlns:mc="http://schemas.openxmlformats.org/markup-compatibility/2006" xmlns:r="http://schemas.openxmlformats.org/officeDocument/2006/relationships" xmlns:w="http://schemas.openxmlformats.org/wordprocessingml/2006/main" xmlns:w14="http://schemas.microsoft.com/office/word/2010/wordml" xmlns:w15="http://schemas.microsoft.com/office/word/2012/wordml" xmlns:w16cex="http://schemas.microsoft.com/office/word/2018/wordml/cex" xmlns:w16cid="http://schemas.microsoft.com/office/word/2016/wordml/cid" xmlns:w16="http://schemas.microsoft.com/office/word/2018/wordml" xmlns:w16sdtdh="http://schemas.microsoft.com/office/word/2020/wordml/sdtdatahash" xmlns:w16se="http://schemas.microsoft.com/office/word/2015/wordml/symex" mc:Ignorable="w14 w15 w16se w16cid w16 w16cex w16sdtdh">
   <w:docDefaults>
     <w:rPrDefault>
       <w:rPr>
@@ -5740,6 +7887,27 @@
       <w:szCs w:val="26"/>
     </w:rPr>
   </w:style>
+  <w:style w:type="paragraph" w:styleId="Titolo3">
+    <w:name w:val="heading 3"/>
+    <w:basedOn w:val="Normale"/>
+    <w:next w:val="Normale"/>
+    <w:link w:val="Titolo3Carattere"/>
+    <w:uiPriority w:val="9"/>
+    <w:unhideWhenUsed/>
+    <w:qFormat/>
+    <w:rsid w:val="0076072E"/>
+    <w:pPr>
+      <w:keepNext/>
+      <w:keepLines/>
+      <w:spacing w:before="40" w:after="0"/>
+      <w:outlineLvl w:val="2"/>
+    </w:pPr>
+    <w:rPr>
+      <w:rFonts w:asciiTheme="majorHAnsi" w:eastAsiaTheme="majorEastAsia" w:hAnsiTheme="majorHAnsi" w:cstheme="majorBidi"/>
+      <w:color w:val="0A2F40" w:themeColor="accent1" w:themeShade="7F"/>
+      <w:sz w:val="24"/>
+    </w:rPr>
+  </w:style>
   <w:style w:type="character" w:default="1" w:styleId="Carpredefinitoparagrafo">
     <w:name w:val="Default Paragraph Font"/>
     <w:uiPriority w:val="1"/>
@@ -5861,7 +8029,7 @@
     <w:name w:val="Esempio"/>
     <w:basedOn w:val="Normale"/>
     <w:qFormat/>
-    <w:rsid w:val="00401727"/>
+    <w:rsid w:val="009D0033"/>
     <w:pPr>
       <w:pBdr>
         <w:top w:val="single" w:sz="4" w:space="1" w:color="auto" w:shadow="1"/>
@@ -5873,6 +8041,7 @@
     </w:pPr>
     <w:rPr>
       <w:rFonts w:ascii="Courier New" w:hAnsi="Courier New"/>
+      <w:noProof/>
       <w:sz w:val="20"/>
     </w:rPr>
   </w:style>
@@ -5941,11 +8110,34 @@
       <w:sz w:val="22"/>
     </w:rPr>
   </w:style>
+  <w:style w:type="character" w:customStyle="1" w:styleId="Titolo3Carattere">
+    <w:name w:val="Titolo 3 Carattere"/>
+    <w:basedOn w:val="Carpredefinitoparagrafo"/>
+    <w:link w:val="Titolo3"/>
+    <w:uiPriority w:val="9"/>
+    <w:rsid w:val="0076072E"/>
+    <w:rPr>
+      <w:rFonts w:asciiTheme="majorHAnsi" w:eastAsiaTheme="majorEastAsia" w:hAnsiTheme="majorHAnsi" w:cstheme="majorBidi"/>
+      <w:color w:val="0A2F40" w:themeColor="accent1" w:themeShade="7F"/>
+    </w:rPr>
+  </w:style>
+  <w:style w:type="character" w:styleId="Menzionenonrisolta">
+    <w:name w:val="Unresolved Mention"/>
+    <w:basedOn w:val="Carpredefinitoparagrafo"/>
+    <w:uiPriority w:val="99"/>
+    <w:semiHidden/>
+    <w:unhideWhenUsed/>
+    <w:rsid w:val="00AB4308"/>
+    <w:rPr>
+      <w:color w:val="605E5C"/>
+      <w:shd w:val="clear" w:color="auto" w:fill="E1DFDD"/>
+    </w:rPr>
+  </w:style>
 </w:styles>
 </file>
 
 <file path=word/glossary/document.xml><?xml version="1.0" encoding="utf-8"?>
-<w:glossaryDocument xmlns:wpc="http://schemas.microsoft.com/office/word/2010/wordprocessingCanvas" xmlns:cx="http://schemas.microsoft.com/office/drawing/2014/chartex" xmlns:cx1="http://schemas.microsoft.com/office/drawing/2015/9/8/chartex" xmlns:cx2="http://schemas.microsoft.com/office/drawing/2015/10/21/chartex" xmlns:cx3="http://schemas.microsoft.com/office/drawing/2016/5/9/chartex" xmlns:cx4="http://schemas.microsoft.com/office/drawing/2016/5/10/chartex" xmlns:cx5="http://schemas.microsoft.com/office/drawing/2016/5/11/chartex" xmlns:cx6="http://schemas.microsoft.com/office/drawing/2016/5/12/chartex" xmlns:cx7="http://schemas.microsoft.com/office/drawing/2016/5/13/chartex" xmlns:cx8="http://schemas.microsoft.com/office/drawing/2016/5/14/chartex" xmlns:mc="http://schemas.openxmlformats.org/markup-compatibility/2006" xmlns:aink="http://schemas.microsoft.com/office/drawing/2016/ink" xmlns:am3d="http://schemas.microsoft.com/office/drawing/2017/model3d" xmlns:o="urn:schemas-microsoft-com:office:office" xmlns:oel="http://schemas.microsoft.com/office/2019/extlst" xmlns:r="http://schemas.openxmlformats.org/officeDocument/2006/relationships" xmlns:m="http://schemas.openxmlformats.org/officeDocument/2006/math" xmlns:v="urn:schemas-microsoft-com:vml" xmlns:wp14="http://schemas.microsoft.com/office/word/2010/wordprocessingDrawing" xmlns:wp="http://schemas.openxmlformats.org/drawingml/2006/wordprocessingDrawing" xmlns:w10="urn:schemas-microsoft-com:office:word" xmlns:w="http://schemas.openxmlformats.org/wordprocessingml/2006/main" xmlns:w14="http://schemas.microsoft.com/office/word/2010/wordml" xmlns:w15="http://schemas.microsoft.com/office/word/2012/wordml" xmlns:w16cex="http://schemas.microsoft.com/office/word/2018/wordml/cex" xmlns:w16cid="http://schemas.microsoft.com/office/word/2016/wordml/cid" xmlns:w16="http://schemas.microsoft.com/office/word/2018/wordml" xmlns:w16du="http://schemas.microsoft.com/office/word/2023/wordml/word16du" xmlns:w16sdtdh="http://schemas.microsoft.com/office/word/2020/wordml/sdtdatahash" xmlns:w16sdtfl="http://schemas.microsoft.com/office/word/2024/wordml/sdtformatlock" xmlns:w16se="http://schemas.microsoft.com/office/word/2015/wordml/symex" xmlns:wpg="http://schemas.microsoft.com/office/word/2010/wordprocessingGroup" xmlns:wpi="http://schemas.microsoft.com/office/word/2010/wordprocessingInk" xmlns:wne="http://schemas.microsoft.com/office/word/2006/wordml" xmlns:wps="http://schemas.microsoft.com/office/word/2010/wordprocessingShape" mc:Ignorable="w14 w15 w16se w16cid w16 w16cex w16sdtdh w16sdtfl w16du wp14">
+<w:glossaryDocument xmlns:wpc="http://schemas.microsoft.com/office/word/2010/wordprocessingCanvas" xmlns:cx="http://schemas.microsoft.com/office/drawing/2014/chartex" xmlns:cx1="http://schemas.microsoft.com/office/drawing/2015/9/8/chartex" xmlns:cx2="http://schemas.microsoft.com/office/drawing/2015/10/21/chartex" xmlns:cx3="http://schemas.microsoft.com/office/drawing/2016/5/9/chartex" xmlns:cx4="http://schemas.microsoft.com/office/drawing/2016/5/10/chartex" xmlns:cx5="http://schemas.microsoft.com/office/drawing/2016/5/11/chartex" xmlns:cx6="http://schemas.microsoft.com/office/drawing/2016/5/12/chartex" xmlns:cx7="http://schemas.microsoft.com/office/drawing/2016/5/13/chartex" xmlns:cx8="http://schemas.microsoft.com/office/drawing/2016/5/14/chartex" xmlns:mc="http://schemas.openxmlformats.org/markup-compatibility/2006" xmlns:aink="http://schemas.microsoft.com/office/drawing/2016/ink" xmlns:am3d="http://schemas.microsoft.com/office/drawing/2017/model3d" xmlns:o="urn:schemas-microsoft-com:office:office" xmlns:oel="http://schemas.microsoft.com/office/2019/extlst" xmlns:r="http://schemas.openxmlformats.org/officeDocument/2006/relationships" xmlns:m="http://schemas.openxmlformats.org/officeDocument/2006/math" xmlns:v="urn:schemas-microsoft-com:vml" xmlns:wp14="http://schemas.microsoft.com/office/word/2010/wordprocessingDrawing" xmlns:wp="http://schemas.openxmlformats.org/drawingml/2006/wordprocessingDrawing" xmlns:w10="urn:schemas-microsoft-com:office:word" xmlns:w="http://schemas.openxmlformats.org/wordprocessingml/2006/main" xmlns:w14="http://schemas.microsoft.com/office/word/2010/wordml" xmlns:w15="http://schemas.microsoft.com/office/word/2012/wordml" xmlns:w16cex="http://schemas.microsoft.com/office/word/2018/wordml/cex" xmlns:w16cid="http://schemas.microsoft.com/office/word/2016/wordml/cid" xmlns:w16="http://schemas.microsoft.com/office/word/2018/wordml" xmlns:w16sdtdh="http://schemas.microsoft.com/office/word/2020/wordml/sdtdatahash" xmlns:w16se="http://schemas.microsoft.com/office/word/2015/wordml/symex" xmlns:wpg="http://schemas.microsoft.com/office/word/2010/wordprocessingGroup" xmlns:wpi="http://schemas.microsoft.com/office/word/2010/wordprocessingInk" xmlns:wne="http://schemas.microsoft.com/office/word/2006/wordml" xmlns:wps="http://schemas.microsoft.com/office/word/2010/wordprocessingShape" mc:Ignorable="w14 w15 w16se w16cid w16 w16cex w16sdtdh wp14">
   <w:docParts>
     <w:docPart>
       <w:docPartPr>
@@ -5978,7 +8170,7 @@
 </file>
 
 <file path=word/glossary/fontTable.xml><?xml version="1.0" encoding="utf-8"?>
-<w:fonts xmlns:mc="http://schemas.openxmlformats.org/markup-compatibility/2006" xmlns:r="http://schemas.openxmlformats.org/officeDocument/2006/relationships" xmlns:w="http://schemas.openxmlformats.org/wordprocessingml/2006/main" xmlns:w14="http://schemas.microsoft.com/office/word/2010/wordml" xmlns:w15="http://schemas.microsoft.com/office/word/2012/wordml" xmlns:w16cex="http://schemas.microsoft.com/office/word/2018/wordml/cex" xmlns:w16cid="http://schemas.microsoft.com/office/word/2016/wordml/cid" xmlns:w16="http://schemas.microsoft.com/office/word/2018/wordml" xmlns:w16du="http://schemas.microsoft.com/office/word/2023/wordml/word16du" xmlns:w16sdtdh="http://schemas.microsoft.com/office/word/2020/wordml/sdtdatahash" xmlns:w16sdtfl="http://schemas.microsoft.com/office/word/2024/wordml/sdtformatlock" xmlns:w16se="http://schemas.microsoft.com/office/word/2015/wordml/symex" mc:Ignorable="w14 w15 w16se w16cid w16 w16cex w16sdtdh w16sdtfl w16du">
+<w:fonts xmlns:mc="http://schemas.openxmlformats.org/markup-compatibility/2006" xmlns:r="http://schemas.openxmlformats.org/officeDocument/2006/relationships" xmlns:w="http://schemas.openxmlformats.org/wordprocessingml/2006/main" xmlns:w14="http://schemas.microsoft.com/office/word/2010/wordml" xmlns:w15="http://schemas.microsoft.com/office/word/2012/wordml" xmlns:w16cex="http://schemas.microsoft.com/office/word/2018/wordml/cex" xmlns:w16cid="http://schemas.microsoft.com/office/word/2016/wordml/cid" xmlns:w16="http://schemas.microsoft.com/office/word/2018/wordml" xmlns:w16sdtdh="http://schemas.microsoft.com/office/word/2020/wordml/sdtdatahash" xmlns:w16se="http://schemas.microsoft.com/office/word/2015/wordml/symex" mc:Ignorable="w14 w15 w16se w16cid w16 w16cex w16sdtdh">
   <w:font w:name="Symbol">
     <w:panose1 w:val="05050102010706020507"/>
     <w:charset w:val="02"/>
@@ -6040,18 +8232,11 @@
     <w:pitch w:val="variable"/>
     <w:sig w:usb0="E4002EFF" w:usb1="C200247B" w:usb2="00000009" w:usb3="00000000" w:csb0="000001FF" w:csb1="00000000"/>
   </w:font>
-  <w:font w:name="Calibri Light">
-    <w:panose1 w:val="020F0302020204030204"/>
-    <w:charset w:val="00"/>
-    <w:family w:val="swiss"/>
-    <w:pitch w:val="variable"/>
-    <w:sig w:usb0="E4002EFF" w:usb1="C200247B" w:usb2="00000009" w:usb3="00000000" w:csb0="000001FF" w:csb1="00000000"/>
-  </w:font>
 </w:fonts>
 </file>
 
 <file path=word/glossary/settings.xml><?xml version="1.0" encoding="utf-8"?>
-<w:settings xmlns:mc="http://schemas.openxmlformats.org/markup-compatibility/2006" xmlns:o="urn:schemas-microsoft-com:office:office" xmlns:r="http://schemas.openxmlformats.org/officeDocument/2006/relationships" xmlns:m="http://schemas.openxmlformats.org/officeDocument/2006/math" xmlns:v="urn:schemas-microsoft-com:vml" xmlns:w10="urn:schemas-microsoft-com:office:word" xmlns:w="http://schemas.openxmlformats.org/wordprocessingml/2006/main" xmlns:w14="http://schemas.microsoft.com/office/word/2010/wordml" xmlns:w15="http://schemas.microsoft.com/office/word/2012/wordml" xmlns:w16cex="http://schemas.microsoft.com/office/word/2018/wordml/cex" xmlns:w16cid="http://schemas.microsoft.com/office/word/2016/wordml/cid" xmlns:w16="http://schemas.microsoft.com/office/word/2018/wordml" xmlns:w16du="http://schemas.microsoft.com/office/word/2023/wordml/word16du" xmlns:w16sdtdh="http://schemas.microsoft.com/office/word/2020/wordml/sdtdatahash" xmlns:w16sdtfl="http://schemas.microsoft.com/office/word/2024/wordml/sdtformatlock" xmlns:w16se="http://schemas.microsoft.com/office/word/2015/wordml/symex" xmlns:sl="http://schemas.openxmlformats.org/schemaLibrary/2006/main" mc:Ignorable="w14 w15 w16se w16cid w16 w16cex w16sdtdh w16sdtfl w16du">
+<w:settings xmlns:mc="http://schemas.openxmlformats.org/markup-compatibility/2006" xmlns:o="urn:schemas-microsoft-com:office:office" xmlns:r="http://schemas.openxmlformats.org/officeDocument/2006/relationships" xmlns:m="http://schemas.openxmlformats.org/officeDocument/2006/math" xmlns:v="urn:schemas-microsoft-com:vml" xmlns:w10="urn:schemas-microsoft-com:office:word" xmlns:w="http://schemas.openxmlformats.org/wordprocessingml/2006/main" xmlns:w14="http://schemas.microsoft.com/office/word/2010/wordml" xmlns:w15="http://schemas.microsoft.com/office/word/2012/wordml" xmlns:w16cex="http://schemas.microsoft.com/office/word/2018/wordml/cex" xmlns:w16cid="http://schemas.microsoft.com/office/word/2016/wordml/cid" xmlns:w16="http://schemas.microsoft.com/office/word/2018/wordml" xmlns:w16sdtdh="http://schemas.microsoft.com/office/word/2020/wordml/sdtdatahash" xmlns:w16se="http://schemas.microsoft.com/office/word/2015/wordml/symex" xmlns:sl="http://schemas.openxmlformats.org/schemaLibrary/2006/main" mc:Ignorable="w14 w15 w16se w16cid w16 w16cex w16sdtdh">
   <w:view w:val="normal"/>
   <w:defaultTabStop w:val="708"/>
   <w:hyphenationZone w:val="283"/>
@@ -6068,12 +8253,20 @@
   <w:rsids>
     <w:rsidRoot w:val="009D6C4A"/>
     <w:rsid w:val="000309D9"/>
+    <w:rsid w:val="001A749F"/>
     <w:rsid w:val="001E6126"/>
     <w:rsid w:val="002A7640"/>
+    <w:rsid w:val="00511BC8"/>
     <w:rsid w:val="005F05A4"/>
     <w:rsid w:val="006B62CD"/>
     <w:rsid w:val="006F5ECB"/>
+    <w:rsid w:val="00853B21"/>
+    <w:rsid w:val="008C7631"/>
     <w:rsid w:val="009D6C4A"/>
+    <w:rsid w:val="00A635BC"/>
+    <w:rsid w:val="00AA1219"/>
+    <w:rsid w:val="00EE35BE"/>
+    <w:rsid w:val="00F60196"/>
     <w:rsid w:val="00F96DDE"/>
   </w:rsids>
   <m:mathPr>
@@ -6098,7 +8291,7 @@
 </file>
 
 <file path=word/glossary/styles.xml><?xml version="1.0" encoding="utf-8"?>
-<w:styles xmlns:mc="http://schemas.openxmlformats.org/markup-compatibility/2006" xmlns:r="http://schemas.openxmlformats.org/officeDocument/2006/relationships" xmlns:w="http://schemas.openxmlformats.org/wordprocessingml/2006/main" xmlns:w14="http://schemas.microsoft.com/office/word/2010/wordml" xmlns:w15="http://schemas.microsoft.com/office/word/2012/wordml" xmlns:w16cex="http://schemas.microsoft.com/office/word/2018/wordml/cex" xmlns:w16cid="http://schemas.microsoft.com/office/word/2016/wordml/cid" xmlns:w16="http://schemas.microsoft.com/office/word/2018/wordml" xmlns:w16du="http://schemas.microsoft.com/office/word/2023/wordml/word16du" xmlns:w16sdtdh="http://schemas.microsoft.com/office/word/2020/wordml/sdtdatahash" xmlns:w16sdtfl="http://schemas.microsoft.com/office/word/2024/wordml/sdtformatlock" xmlns:w16se="http://schemas.microsoft.com/office/word/2015/wordml/symex" mc:Ignorable="w14 w15 w16se w16cid w16 w16cex w16sdtdh w16sdtfl w16du">
+<w:styles xmlns:mc="http://schemas.openxmlformats.org/markup-compatibility/2006" xmlns:r="http://schemas.openxmlformats.org/officeDocument/2006/relationships" xmlns:w="http://schemas.openxmlformats.org/wordprocessingml/2006/main" xmlns:w14="http://schemas.microsoft.com/office/word/2010/wordml" xmlns:w15="http://schemas.microsoft.com/office/word/2012/wordml" xmlns:w16cex="http://schemas.microsoft.com/office/word/2018/wordml/cex" xmlns:w16cid="http://schemas.microsoft.com/office/word/2016/wordml/cid" xmlns:w16="http://schemas.microsoft.com/office/word/2018/wordml" xmlns:w16sdtdh="http://schemas.microsoft.com/office/word/2020/wordml/sdtdatahash" xmlns:w16se="http://schemas.microsoft.com/office/word/2015/wordml/symex" mc:Ignorable="w14 w15 w16se w16cid w16 w16cex w16sdtdh">
   <w:docDefaults>
     <w:rPrDefault>
       <w:rPr>
@@ -6533,7 +8726,7 @@
 </file>
 
 <file path=word/glossary/webSettings.xml><?xml version="1.0" encoding="utf-8"?>
-<w:webSettings xmlns:mc="http://schemas.openxmlformats.org/markup-compatibility/2006" xmlns:r="http://schemas.openxmlformats.org/officeDocument/2006/relationships" xmlns:w="http://schemas.openxmlformats.org/wordprocessingml/2006/main" xmlns:w14="http://schemas.microsoft.com/office/word/2010/wordml" xmlns:w15="http://schemas.microsoft.com/office/word/2012/wordml" xmlns:w16cex="http://schemas.microsoft.com/office/word/2018/wordml/cex" xmlns:w16cid="http://schemas.microsoft.com/office/word/2016/wordml/cid" xmlns:w16="http://schemas.microsoft.com/office/word/2018/wordml" xmlns:w16du="http://schemas.microsoft.com/office/word/2023/wordml/word16du" xmlns:w16sdtdh="http://schemas.microsoft.com/office/word/2020/wordml/sdtdatahash" xmlns:w16sdtfl="http://schemas.microsoft.com/office/word/2024/wordml/sdtformatlock" xmlns:w16se="http://schemas.microsoft.com/office/word/2015/wordml/symex" mc:Ignorable="w14 w15 w16se w16cid w16 w16cex w16sdtdh w16sdtfl w16du">
+<w:webSettings xmlns:mc="http://schemas.openxmlformats.org/markup-compatibility/2006" xmlns:r="http://schemas.openxmlformats.org/officeDocument/2006/relationships" xmlns:w="http://schemas.openxmlformats.org/wordprocessingml/2006/main" xmlns:w14="http://schemas.microsoft.com/office/word/2010/wordml" xmlns:w15="http://schemas.microsoft.com/office/word/2012/wordml" xmlns:w16cex="http://schemas.microsoft.com/office/word/2018/wordml/cex" xmlns:w16cid="http://schemas.microsoft.com/office/word/2016/wordml/cid" xmlns:w16="http://schemas.microsoft.com/office/word/2018/wordml" xmlns:w16sdtdh="http://schemas.microsoft.com/office/word/2020/wordml/sdtdatahash" xmlns:w16se="http://schemas.microsoft.com/office/word/2015/wordml/symex" mc:Ignorable="w14 w15 w16se w16cid w16 w16cex w16sdtdh">
   <w:optimizeForBrowser/>
   <w:allowPNG/>
 </w:webSettings>

</xml_diff>

<commit_message>
Riportato il tutto su branch Main
</commit_message>
<xml_diff>
--- a/dati/Manuale Utente.docx
+++ b/dati/Manuale Utente.docx
@@ -1,6 +1,6 @@
 
 <file path=word/document.xml><?xml version="1.0" encoding="utf-8"?>
-<w:document xmlns:wpc="http://schemas.microsoft.com/office/word/2010/wordprocessingCanvas" xmlns:cx="http://schemas.microsoft.com/office/drawing/2014/chartex" xmlns:cx1="http://schemas.microsoft.com/office/drawing/2015/9/8/chartex" xmlns:cx2="http://schemas.microsoft.com/office/drawing/2015/10/21/chartex" xmlns:cx3="http://schemas.microsoft.com/office/drawing/2016/5/9/chartex" xmlns:cx4="http://schemas.microsoft.com/office/drawing/2016/5/10/chartex" xmlns:cx5="http://schemas.microsoft.com/office/drawing/2016/5/11/chartex" xmlns:cx6="http://schemas.microsoft.com/office/drawing/2016/5/12/chartex" xmlns:cx7="http://schemas.microsoft.com/office/drawing/2016/5/13/chartex" xmlns:cx8="http://schemas.microsoft.com/office/drawing/2016/5/14/chartex" xmlns:mc="http://schemas.openxmlformats.org/markup-compatibility/2006" xmlns:aink="http://schemas.microsoft.com/office/drawing/2016/ink" xmlns:am3d="http://schemas.microsoft.com/office/drawing/2017/model3d" xmlns:o="urn:schemas-microsoft-com:office:office" xmlns:oel="http://schemas.microsoft.com/office/2019/extlst" xmlns:r="http://schemas.openxmlformats.org/officeDocument/2006/relationships" xmlns:m="http://schemas.openxmlformats.org/officeDocument/2006/math" xmlns:v="urn:schemas-microsoft-com:vml" xmlns:wp14="http://schemas.microsoft.com/office/word/2010/wordprocessingDrawing" xmlns:wp="http://schemas.openxmlformats.org/drawingml/2006/wordprocessingDrawing" xmlns:w10="urn:schemas-microsoft-com:office:word" xmlns:w="http://schemas.openxmlformats.org/wordprocessingml/2006/main" xmlns:w14="http://schemas.microsoft.com/office/word/2010/wordml" xmlns:w15="http://schemas.microsoft.com/office/word/2012/wordml" xmlns:w16cex="http://schemas.microsoft.com/office/word/2018/wordml/cex" xmlns:w16cid="http://schemas.microsoft.com/office/word/2016/wordml/cid" xmlns:w16="http://schemas.microsoft.com/office/word/2018/wordml" xmlns:w16du="http://schemas.microsoft.com/office/word/2023/wordml/word16du" xmlns:w16sdtdh="http://schemas.microsoft.com/office/word/2020/wordml/sdtdatahash" xmlns:w16sdtfl="http://schemas.microsoft.com/office/word/2024/wordml/sdtformatlock" xmlns:w16se="http://schemas.microsoft.com/office/word/2015/wordml/symex" xmlns:wpg="http://schemas.microsoft.com/office/word/2010/wordprocessingGroup" xmlns:wpi="http://schemas.microsoft.com/office/word/2010/wordprocessingInk" xmlns:wne="http://schemas.microsoft.com/office/word/2006/wordml" xmlns:wps="http://schemas.microsoft.com/office/word/2010/wordprocessingShape" mc:Ignorable="w14 w15 w16se w16cid w16 w16cex w16sdtdh w16sdtfl w16du wp14">
+<w:document xmlns:wpc="http://schemas.microsoft.com/office/word/2010/wordprocessingCanvas" xmlns:cx="http://schemas.microsoft.com/office/drawing/2014/chartex" xmlns:cx1="http://schemas.microsoft.com/office/drawing/2015/9/8/chartex" xmlns:cx2="http://schemas.microsoft.com/office/drawing/2015/10/21/chartex" xmlns:cx3="http://schemas.microsoft.com/office/drawing/2016/5/9/chartex" xmlns:cx4="http://schemas.microsoft.com/office/drawing/2016/5/10/chartex" xmlns:cx5="http://schemas.microsoft.com/office/drawing/2016/5/11/chartex" xmlns:cx6="http://schemas.microsoft.com/office/drawing/2016/5/12/chartex" xmlns:cx7="http://schemas.microsoft.com/office/drawing/2016/5/13/chartex" xmlns:cx8="http://schemas.microsoft.com/office/drawing/2016/5/14/chartex" xmlns:mc="http://schemas.openxmlformats.org/markup-compatibility/2006" xmlns:aink="http://schemas.microsoft.com/office/drawing/2016/ink" xmlns:am3d="http://schemas.microsoft.com/office/drawing/2017/model3d" xmlns:o="urn:schemas-microsoft-com:office:office" xmlns:oel="http://schemas.microsoft.com/office/2019/extlst" xmlns:r="http://schemas.openxmlformats.org/officeDocument/2006/relationships" xmlns:m="http://schemas.openxmlformats.org/officeDocument/2006/math" xmlns:v="urn:schemas-microsoft-com:vml" xmlns:wp14="http://schemas.microsoft.com/office/word/2010/wordprocessingDrawing" xmlns:wp="http://schemas.openxmlformats.org/drawingml/2006/wordprocessingDrawing" xmlns:w10="urn:schemas-microsoft-com:office:word" xmlns:w="http://schemas.openxmlformats.org/wordprocessingml/2006/main" xmlns:w14="http://schemas.microsoft.com/office/word/2010/wordml" xmlns:w15="http://schemas.microsoft.com/office/word/2012/wordml" xmlns:w16cex="http://schemas.microsoft.com/office/word/2018/wordml/cex" xmlns:w16cid="http://schemas.microsoft.com/office/word/2016/wordml/cid" xmlns:w16="http://schemas.microsoft.com/office/word/2018/wordml" xmlns:w16sdtdh="http://schemas.microsoft.com/office/word/2020/wordml/sdtdatahash" xmlns:w16se="http://schemas.microsoft.com/office/word/2015/wordml/symex" xmlns:wpg="http://schemas.microsoft.com/office/word/2010/wordprocessingGroup" xmlns:wpi="http://schemas.microsoft.com/office/word/2010/wordprocessingInk" xmlns:wne="http://schemas.microsoft.com/office/word/2006/wordml" xmlns:wps="http://schemas.microsoft.com/office/word/2010/wordprocessingShape" mc:Ignorable="w14 w15 w16se w16cid w16 w16cex w16sdtdh wp14">
   <w:body>
     <w:sdt>
       <w:sdtPr>
@@ -56,7 +56,7 @@
           <w:r>
             <w:fldChar w:fldCharType="separate"/>
           </w:r>
-          <w:hyperlink w:anchor="_Toc189322894" w:history="1">
+          <w:hyperlink w:anchor="_Toc225612074" w:history="1">
             <w:r>
               <w:rPr>
                 <w:rStyle w:val="Collegamentoipertestuale"/>
@@ -83,7 +83,7 @@
                 <w:noProof/>
                 <w:webHidden/>
               </w:rPr>
-              <w:instrText xml:space="preserve"> PAGEREF _Toc189322894 \h </w:instrText>
+              <w:instrText xml:space="preserve"> PAGEREF _Toc225612074 \h </w:instrText>
             </w:r>
             <w:r>
               <w:rPr>
@@ -127,7 +127,7 @@
               <w:lang w:eastAsia="it-IT"/>
             </w:rPr>
           </w:pPr>
-          <w:hyperlink w:anchor="_Toc189322895" w:history="1">
+          <w:hyperlink w:anchor="_Toc225612075" w:history="1">
             <w:r>
               <w:rPr>
                 <w:rStyle w:val="Collegamentoipertestuale"/>
@@ -154,7 +154,7 @@
                 <w:noProof/>
                 <w:webHidden/>
               </w:rPr>
-              <w:instrText xml:space="preserve"> PAGEREF _Toc189322895 \h </w:instrText>
+              <w:instrText xml:space="preserve"> PAGEREF _Toc225612075 \h </w:instrText>
             </w:r>
             <w:r>
               <w:rPr>
@@ -198,7 +198,7 @@
               <w:lang w:eastAsia="it-IT"/>
             </w:rPr>
           </w:pPr>
-          <w:hyperlink w:anchor="_Toc189322896" w:history="1">
+          <w:hyperlink w:anchor="_Toc225612076" w:history="1">
             <w:r>
               <w:rPr>
                 <w:rStyle w:val="Collegamentoipertestuale"/>
@@ -225,7 +225,7 @@
                 <w:noProof/>
                 <w:webHidden/>
               </w:rPr>
-              <w:instrText xml:space="preserve"> PAGEREF _Toc189322896 \h </w:instrText>
+              <w:instrText xml:space="preserve"> PAGEREF _Toc225612076 \h </w:instrText>
             </w:r>
             <w:r>
               <w:rPr>
@@ -269,7 +269,7 @@
               <w:lang w:eastAsia="it-IT"/>
             </w:rPr>
           </w:pPr>
-          <w:hyperlink w:anchor="_Toc189322897" w:history="1">
+          <w:hyperlink w:anchor="_Toc225612077" w:history="1">
             <w:r>
               <w:rPr>
                 <w:rStyle w:val="Collegamentoipertestuale"/>
@@ -296,7 +296,7 @@
                 <w:noProof/>
                 <w:webHidden/>
               </w:rPr>
-              <w:instrText xml:space="preserve"> PAGEREF _Toc189322897 \h </w:instrText>
+              <w:instrText xml:space="preserve"> PAGEREF _Toc225612077 \h </w:instrText>
             </w:r>
             <w:r>
               <w:rPr>
@@ -340,7 +340,7 @@
               <w:lang w:eastAsia="it-IT"/>
             </w:rPr>
           </w:pPr>
-          <w:hyperlink w:anchor="_Toc189322898" w:history="1">
+          <w:hyperlink w:anchor="_Toc225612078" w:history="1">
             <w:r>
               <w:rPr>
                 <w:rStyle w:val="Collegamentoipertestuale"/>
@@ -367,7 +367,7 @@
                 <w:noProof/>
                 <w:webHidden/>
               </w:rPr>
-              <w:instrText xml:space="preserve"> PAGEREF _Toc189322898 \h </w:instrText>
+              <w:instrText xml:space="preserve"> PAGEREF _Toc225612078 \h </w:instrText>
             </w:r>
             <w:r>
               <w:rPr>
@@ -411,7 +411,7 @@
               <w:lang w:eastAsia="it-IT"/>
             </w:rPr>
           </w:pPr>
-          <w:hyperlink w:anchor="_Toc189322899" w:history="1">
+          <w:hyperlink w:anchor="_Toc225612079" w:history="1">
             <w:r>
               <w:rPr>
                 <w:rStyle w:val="Collegamentoipertestuale"/>
@@ -438,7 +438,7 @@
                 <w:noProof/>
                 <w:webHidden/>
               </w:rPr>
-              <w:instrText xml:space="preserve"> PAGEREF _Toc189322899 \h </w:instrText>
+              <w:instrText xml:space="preserve"> PAGEREF _Toc225612079 \h </w:instrText>
             </w:r>
             <w:r>
               <w:rPr>
@@ -482,13 +482,13 @@
               <w:lang w:eastAsia="it-IT"/>
             </w:rPr>
           </w:pPr>
-          <w:hyperlink w:anchor="_Toc189322900" w:history="1">
+          <w:hyperlink w:anchor="_Toc225612080" w:history="1">
             <w:r>
               <w:rPr>
                 <w:rStyle w:val="Collegamentoipertestuale"/>
                 <w:noProof/>
               </w:rPr>
-              <w:t>Import dei dati</w:t>
+              <w:t>File properties “Banca.properties”</w:t>
             </w:r>
             <w:r>
               <w:rPr>
@@ -509,7 +509,7 @@
                 <w:noProof/>
                 <w:webHidden/>
               </w:rPr>
-              <w:instrText xml:space="preserve"> PAGEREF _Toc189322900 \h </w:instrText>
+              <w:instrText xml:space="preserve"> PAGEREF _Toc225612080 \h </w:instrText>
             </w:r>
             <w:r>
               <w:rPr>
@@ -553,13 +553,13 @@
               <w:lang w:eastAsia="it-IT"/>
             </w:rPr>
           </w:pPr>
-          <w:hyperlink w:anchor="_Toc189322901" w:history="1">
+          <w:hyperlink w:anchor="_Toc225612081" w:history="1">
             <w:r>
               <w:rPr>
                 <w:rStyle w:val="Collegamentoipertestuale"/>
                 <w:noProof/>
               </w:rPr>
-              <w:t>Struttura direttorio di Backup files CSV</w:t>
+              <w:t>“Cardid” Codici Card Holders</w:t>
             </w:r>
             <w:r>
               <w:rPr>
@@ -580,7 +580,7 @@
                 <w:noProof/>
                 <w:webHidden/>
               </w:rPr>
-              <w:instrText xml:space="preserve"> PAGEREF _Toc189322901 \h </w:instrText>
+              <w:instrText xml:space="preserve"> PAGEREF _Toc225612081 \h </w:instrText>
             </w:r>
             <w:r>
               <w:rPr>
@@ -601,6 +601,77 @@
                 <w:webHidden/>
               </w:rPr>
               <w:t>8</w:t>
+            </w:r>
+            <w:r>
+              <w:rPr>
+                <w:noProof/>
+                <w:webHidden/>
+              </w:rPr>
+              <w:fldChar w:fldCharType="end"/>
+            </w:r>
+          </w:hyperlink>
+        </w:p>
+        <w:p>
+          <w:pPr>
+            <w:pStyle w:val="Sommario1"/>
+            <w:tabs>
+              <w:tab w:val="right" w:leader="dot" w:pos="9628"/>
+            </w:tabs>
+            <w:rPr>
+              <w:rFonts w:asciiTheme="minorHAnsi" w:eastAsiaTheme="minorEastAsia" w:hAnsiTheme="minorHAnsi"/>
+              <w:noProof/>
+              <w:sz w:val="24"/>
+              <w:lang w:eastAsia="it-IT"/>
+            </w:rPr>
+          </w:pPr>
+          <w:hyperlink w:anchor="_Toc225612082" w:history="1">
+            <w:r>
+              <w:rPr>
+                <w:rStyle w:val="Collegamentoipertestuale"/>
+                <w:noProof/>
+              </w:rPr>
+              <w:t>Import dei dati</w:t>
+            </w:r>
+            <w:r>
+              <w:rPr>
+                <w:noProof/>
+                <w:webHidden/>
+              </w:rPr>
+              <w:tab/>
+            </w:r>
+            <w:r>
+              <w:rPr>
+                <w:noProof/>
+                <w:webHidden/>
+              </w:rPr>
+              <w:fldChar w:fldCharType="begin"/>
+            </w:r>
+            <w:r>
+              <w:rPr>
+                <w:noProof/>
+                <w:webHidden/>
+              </w:rPr>
+              <w:instrText xml:space="preserve"> PAGEREF _Toc225612082 \h </w:instrText>
+            </w:r>
+            <w:r>
+              <w:rPr>
+                <w:noProof/>
+                <w:webHidden/>
+              </w:rPr>
+            </w:r>
+            <w:r>
+              <w:rPr>
+                <w:noProof/>
+                <w:webHidden/>
+              </w:rPr>
+              <w:fldChar w:fldCharType="separate"/>
+            </w:r>
+            <w:r>
+              <w:rPr>
+                <w:noProof/>
+                <w:webHidden/>
+              </w:rPr>
+              <w:t>9</w:t>
             </w:r>
             <w:r>
               <w:rPr>
@@ -624,13 +695,13 @@
               <w:lang w:eastAsia="it-IT"/>
             </w:rPr>
           </w:pPr>
-          <w:hyperlink w:anchor="_Toc189322902" w:history="1">
+          <w:hyperlink w:anchor="_Toc225612083" w:history="1">
             <w:r>
               <w:rPr>
                 <w:rStyle w:val="Collegamentoipertestuale"/>
                 <w:noProof/>
               </w:rPr>
-              <w:t>Import dei files</w:t>
+              <w:t>Struttura direttorio di Backup files CSV</w:t>
             </w:r>
             <w:r>
               <w:rPr>
@@ -651,7 +722,7 @@
                 <w:noProof/>
                 <w:webHidden/>
               </w:rPr>
-              <w:instrText xml:space="preserve"> PAGEREF _Toc189322902 \h </w:instrText>
+              <w:instrText xml:space="preserve"> PAGEREF _Toc225612083 \h </w:instrText>
             </w:r>
             <w:r>
               <w:rPr>
@@ -695,12 +766,83 @@
               <w:lang w:eastAsia="it-IT"/>
             </w:rPr>
           </w:pPr>
-          <w:hyperlink w:anchor="_Toc189322903" w:history="1">
+          <w:hyperlink w:anchor="_Toc225612084" w:history="1">
             <w:r>
               <w:rPr>
                 <w:rStyle w:val="Collegamentoipertestuale"/>
                 <w:noProof/>
               </w:rPr>
+              <w:t>Import dei files</w:t>
+            </w:r>
+            <w:r>
+              <w:rPr>
+                <w:noProof/>
+                <w:webHidden/>
+              </w:rPr>
+              <w:tab/>
+            </w:r>
+            <w:r>
+              <w:rPr>
+                <w:noProof/>
+                <w:webHidden/>
+              </w:rPr>
+              <w:fldChar w:fldCharType="begin"/>
+            </w:r>
+            <w:r>
+              <w:rPr>
+                <w:noProof/>
+                <w:webHidden/>
+              </w:rPr>
+              <w:instrText xml:space="preserve"> PAGEREF _Toc225612084 \h </w:instrText>
+            </w:r>
+            <w:r>
+              <w:rPr>
+                <w:noProof/>
+                <w:webHidden/>
+              </w:rPr>
+            </w:r>
+            <w:r>
+              <w:rPr>
+                <w:noProof/>
+                <w:webHidden/>
+              </w:rPr>
+              <w:fldChar w:fldCharType="separate"/>
+            </w:r>
+            <w:r>
+              <w:rPr>
+                <w:noProof/>
+                <w:webHidden/>
+              </w:rPr>
+              <w:t>10</w:t>
+            </w:r>
+            <w:r>
+              <w:rPr>
+                <w:noProof/>
+                <w:webHidden/>
+              </w:rPr>
+              <w:fldChar w:fldCharType="end"/>
+            </w:r>
+          </w:hyperlink>
+        </w:p>
+        <w:p>
+          <w:pPr>
+            <w:pStyle w:val="Sommario2"/>
+            <w:tabs>
+              <w:tab w:val="right" w:leader="dot" w:pos="9628"/>
+            </w:tabs>
+            <w:rPr>
+              <w:rFonts w:asciiTheme="minorHAnsi" w:eastAsiaTheme="minorEastAsia" w:hAnsiTheme="minorHAnsi"/>
+              <w:noProof/>
+              <w:sz w:val="24"/>
+              <w:lang w:eastAsia="it-IT"/>
+            </w:rPr>
+          </w:pPr>
+          <w:hyperlink w:anchor="_Toc225612085" w:history="1">
+            <w:r>
+              <w:rPr>
+                <w:rStyle w:val="Collegamentoipertestuale"/>
+                <w:noProof/>
+              </w:rPr>
               <w:t>Comunicazioni di Log</w:t>
             </w:r>
             <w:r>
@@ -722,7 +864,7 @@
                 <w:noProof/>
                 <w:webHidden/>
               </w:rPr>
-              <w:instrText xml:space="preserve"> PAGEREF _Toc189322903 \h </w:instrText>
+              <w:instrText xml:space="preserve"> PAGEREF _Toc225612085 \h </w:instrText>
             </w:r>
             <w:r>
               <w:rPr>
@@ -742,7 +884,7 @@
                 <w:noProof/>
                 <w:webHidden/>
               </w:rPr>
-              <w:t>9</w:t>
+              <w:t>10</w:t>
             </w:r>
             <w:r>
               <w:rPr>
@@ -766,12 +908,83 @@
               <w:lang w:eastAsia="it-IT"/>
             </w:rPr>
           </w:pPr>
-          <w:hyperlink w:anchor="_Toc189322904" w:history="1">
+          <w:hyperlink w:anchor="_Toc225612086" w:history="1">
             <w:r>
               <w:rPr>
                 <w:rStyle w:val="Collegamentoipertestuale"/>
                 <w:noProof/>
               </w:rPr>
+              <w:t>Import codici Statistici</w:t>
+            </w:r>
+            <w:r>
+              <w:rPr>
+                <w:noProof/>
+                <w:webHidden/>
+              </w:rPr>
+              <w:tab/>
+            </w:r>
+            <w:r>
+              <w:rPr>
+                <w:noProof/>
+                <w:webHidden/>
+              </w:rPr>
+              <w:fldChar w:fldCharType="begin"/>
+            </w:r>
+            <w:r>
+              <w:rPr>
+                <w:noProof/>
+                <w:webHidden/>
+              </w:rPr>
+              <w:instrText xml:space="preserve"> PAGEREF _Toc225612086 \h </w:instrText>
+            </w:r>
+            <w:r>
+              <w:rPr>
+                <w:noProof/>
+                <w:webHidden/>
+              </w:rPr>
+            </w:r>
+            <w:r>
+              <w:rPr>
+                <w:noProof/>
+                <w:webHidden/>
+              </w:rPr>
+              <w:fldChar w:fldCharType="separate"/>
+            </w:r>
+            <w:r>
+              <w:rPr>
+                <w:noProof/>
+                <w:webHidden/>
+              </w:rPr>
+              <w:t>12</w:t>
+            </w:r>
+            <w:r>
+              <w:rPr>
+                <w:noProof/>
+                <w:webHidden/>
+              </w:rPr>
+              <w:fldChar w:fldCharType="end"/>
+            </w:r>
+          </w:hyperlink>
+        </w:p>
+        <w:p>
+          <w:pPr>
+            <w:pStyle w:val="Sommario1"/>
+            <w:tabs>
+              <w:tab w:val="right" w:leader="dot" w:pos="9628"/>
+            </w:tabs>
+            <w:rPr>
+              <w:rFonts w:asciiTheme="minorHAnsi" w:eastAsiaTheme="minorEastAsia" w:hAnsiTheme="minorHAnsi"/>
+              <w:noProof/>
+              <w:sz w:val="24"/>
+              <w:lang w:eastAsia="it-IT"/>
+            </w:rPr>
+          </w:pPr>
+          <w:hyperlink w:anchor="_Toc225612087" w:history="1">
+            <w:r>
+              <w:rPr>
+                <w:rStyle w:val="Collegamentoipertestuale"/>
+                <w:noProof/>
+              </w:rPr>
               <w:t>Indovina Codici Statistici</w:t>
             </w:r>
             <w:r>
@@ -793,7 +1006,7 @@
                 <w:noProof/>
                 <w:webHidden/>
               </w:rPr>
-              <w:instrText xml:space="preserve"> PAGEREF _Toc189322904 \h </w:instrText>
+              <w:instrText xml:space="preserve"> PAGEREF _Toc225612087 \h </w:instrText>
             </w:r>
             <w:r>
               <w:rPr>
@@ -813,7 +1026,7 @@
                 <w:noProof/>
                 <w:webHidden/>
               </w:rPr>
-              <w:t>11</w:t>
+              <w:t>13</w:t>
             </w:r>
             <w:r>
               <w:rPr>
@@ -837,7 +1050,7 @@
               <w:lang w:eastAsia="it-IT"/>
             </w:rPr>
           </w:pPr>
-          <w:hyperlink w:anchor="_Toc189322905" w:history="1">
+          <w:hyperlink w:anchor="_Toc225612088" w:history="1">
             <w:r>
               <w:rPr>
                 <w:rStyle w:val="Collegamentoipertestuale"/>
@@ -864,7 +1077,7 @@
                 <w:noProof/>
                 <w:webHidden/>
               </w:rPr>
-              <w:instrText xml:space="preserve"> PAGEREF _Toc189322905 \h </w:instrText>
+              <w:instrText xml:space="preserve"> PAGEREF _Toc225612088 \h </w:instrText>
             </w:r>
             <w:r>
               <w:rPr>
@@ -884,7 +1097,7 @@
                 <w:noProof/>
                 <w:webHidden/>
               </w:rPr>
-              <w:t>11</w:t>
+              <w:t>13</w:t>
             </w:r>
             <w:r>
               <w:rPr>
@@ -908,7 +1121,7 @@
               <w:lang w:eastAsia="it-IT"/>
             </w:rPr>
           </w:pPr>
-          <w:hyperlink w:anchor="_Toc189322906" w:history="1">
+          <w:hyperlink w:anchor="_Toc225612089" w:history="1">
             <w:r>
               <w:rPr>
                 <w:rStyle w:val="Collegamentoipertestuale"/>
@@ -935,7 +1148,7 @@
                 <w:noProof/>
                 <w:webHidden/>
               </w:rPr>
-              <w:instrText xml:space="preserve"> PAGEREF _Toc189322906 \h </w:instrText>
+              <w:instrText xml:space="preserve"> PAGEREF _Toc225612089 \h </w:instrText>
             </w:r>
             <w:r>
               <w:rPr>
@@ -955,7 +1168,7 @@
                 <w:noProof/>
                 <w:webHidden/>
               </w:rPr>
-              <w:t>12</w:t>
+              <w:t>14</w:t>
             </w:r>
             <w:r>
               <w:rPr>
@@ -994,7 +1207,7 @@
       <w:pPr>
         <w:pStyle w:val="Titolo1"/>
       </w:pPr>
-      <w:bookmarkStart w:id="0" w:name="_Toc189322894"/>
+      <w:bookmarkStart w:id="0" w:name="_Toc225612074"/>
       <w:r>
         <w:lastRenderedPageBreak/>
         <w:t>Preliminari</w:t>
@@ -1005,7 +1218,7 @@
       <w:pPr>
         <w:pStyle w:val="Titolo2"/>
       </w:pPr>
-      <w:bookmarkStart w:id="1" w:name="_Toc189322895"/>
+      <w:bookmarkStart w:id="1" w:name="_Toc225612075"/>
       <w:r>
         <w:t>Convenzione sui nomi dei files CSV</w:t>
       </w:r>
@@ -1032,24 +1245,84 @@
           <w:ilvl w:val="0"/>
           <w:numId w:val="6"/>
         </w:numPr>
-      </w:pPr>
-      <w:r>
-        <w:t xml:space="preserve">Id della sorgente (es: BSI, </w:t>
+        <w:rPr>
+          <w:lang w:val="es-ES"/>
+        </w:rPr>
+      </w:pPr>
+      <w:r>
+        <w:rPr>
+          <w:lang w:val="es-ES"/>
+        </w:rPr>
+        <w:t xml:space="preserve">Id </w:t>
       </w:r>
       <w:proofErr w:type="spellStart"/>
       <w:r>
+        <w:rPr>
+          <w:lang w:val="es-ES"/>
+        </w:rPr>
+        <w:t>della</w:t>
+      </w:r>
+      <w:proofErr w:type="spellEnd"/>
+      <w:r>
+        <w:rPr>
+          <w:lang w:val="es-ES"/>
+        </w:rPr>
+        <w:t xml:space="preserve"> </w:t>
+      </w:r>
+      <w:proofErr w:type="spellStart"/>
+      <w:r>
+        <w:rPr>
+          <w:lang w:val="es-ES"/>
+        </w:rPr>
+        <w:t>sorgente</w:t>
+      </w:r>
+      <w:proofErr w:type="spellEnd"/>
+      <w:r>
+        <w:rPr>
+          <w:lang w:val="es-ES"/>
+        </w:rPr>
+        <w:t xml:space="preserve"> (es: BSI, </w:t>
+      </w:r>
+      <w:proofErr w:type="spellStart"/>
+      <w:r>
+        <w:rPr>
+          <w:lang w:val="es-ES"/>
+        </w:rPr>
         <w:t>carisp</w:t>
       </w:r>
       <w:proofErr w:type="spellEnd"/>
       <w:r>
-        <w:t xml:space="preserve">, wise, </w:t>
+        <w:rPr>
+          <w:lang w:val="es-ES"/>
+        </w:rPr>
+        <w:t xml:space="preserve">, </w:t>
       </w:r>
       <w:proofErr w:type="spellStart"/>
       <w:r>
+        <w:rPr>
+          <w:lang w:val="es-ES"/>
+        </w:rPr>
+        <w:t>wise</w:t>
+      </w:r>
+      <w:proofErr w:type="spellEnd"/>
+      <w:r>
+        <w:rPr>
+          <w:lang w:val="es-ES"/>
+        </w:rPr>
+        <w:t xml:space="preserve">, </w:t>
+      </w:r>
+      <w:proofErr w:type="spellStart"/>
+      <w:r>
+        <w:rPr>
+          <w:lang w:val="es-ES"/>
+        </w:rPr>
         <w:t>etc</w:t>
       </w:r>
       <w:proofErr w:type="spellEnd"/>
       <w:r>
+        <w:rPr>
+          <w:lang w:val="es-ES"/>
+        </w:rPr>
         <w:t xml:space="preserve"> …)</w:t>
       </w:r>
     </w:p>
@@ -1234,6 +1507,38 @@
       <w:r>
         <w:t>) il titolare dell’estratto conto (se esiste)</w:t>
       </w:r>
+      <w:r>
+        <w:br/>
+        <w:t xml:space="preserve">es: </w:t>
+      </w:r>
+      <w:r>
+        <w:tab/>
+      </w:r>
+      <w:r>
+        <w:rPr>
+          <w:rFonts w:ascii="Consolas" w:hAnsi="Consolas"/>
+          <w:sz w:val="20"/>
+          <w:szCs w:val="22"/>
+        </w:rPr>
+        <w:t>SMAC\estrattoconto_SMAC_2522_</w:t>
+      </w:r>
+      <w:r>
+        <w:rPr>
+          <w:rFonts w:ascii="Consolas" w:hAnsi="Consolas"/>
+          <w:sz w:val="20"/>
+          <w:szCs w:val="22"/>
+          <w:highlight w:val="green"/>
+        </w:rPr>
+        <w:t>cla</w:t>
+      </w:r>
+      <w:r>
+        <w:rPr>
+          <w:rFonts w:ascii="Consolas" w:hAnsi="Consolas"/>
+          <w:sz w:val="20"/>
+          <w:szCs w:val="22"/>
+        </w:rPr>
+        <w:t>.csv</w:t>
+      </w:r>
     </w:p>
     <w:p>
       <w:r>
@@ -1270,23 +1575,7 @@
         <w:pStyle w:val="Esempio"/>
       </w:pPr>
       <w:r>
-        <w:t xml:space="preserve">Banca </w:t>
-      </w:r>
-      <w:proofErr w:type="spellStart"/>
-      <w:r>
-        <w:t>BSICredit</w:t>
-      </w:r>
-      <w:proofErr w:type="spellEnd"/>
-      <w:r>
-        <w:t>\</w:t>
-      </w:r>
-      <w:proofErr w:type="spellStart"/>
-      <w:r>
-        <w:t>estrattoconto_BSI_Credit</w:t>
-      </w:r>
-      <w:proofErr w:type="spellEnd"/>
-      <w:r>
-        <w:t xml:space="preserve"> 2024-00_cla.csv</w:t>
+        <w:t>Banca BSICredit\estrattoconto_BSI_Credit 2024-00_cla.csv</w:t>
       </w:r>
     </w:p>
     <w:p>
@@ -1310,23 +1599,7 @@
         <w:pStyle w:val="Esempio"/>
       </w:pPr>
       <w:r>
-        <w:t xml:space="preserve">banca </w:t>
-      </w:r>
-      <w:proofErr w:type="spellStart"/>
-      <w:r>
-        <w:t>CarispCredit</w:t>
-      </w:r>
-      <w:proofErr w:type="spellEnd"/>
-      <w:r>
-        <w:t>\</w:t>
-      </w:r>
-      <w:proofErr w:type="spellStart"/>
-      <w:r>
-        <w:t>estrattoconto_TPay</w:t>
-      </w:r>
-      <w:proofErr w:type="spellEnd"/>
-      <w:r>
-        <w:t xml:space="preserve"> 2021-06-26_cla.csv</w:t>
+        <w:t>banca CarispCredit\estrattoconto_TPay 2021-06-26_cla.csv</w:t>
       </w:r>
     </w:p>
     <w:p>
@@ -1334,23 +1607,7 @@
         <w:pStyle w:val="Esempio"/>
       </w:pPr>
       <w:r>
-        <w:t xml:space="preserve">banca </w:t>
-      </w:r>
-      <w:proofErr w:type="spellStart"/>
-      <w:r>
-        <w:t>CarispCredit</w:t>
-      </w:r>
-      <w:proofErr w:type="spellEnd"/>
-      <w:r>
-        <w:t>\</w:t>
-      </w:r>
-      <w:proofErr w:type="spellStart"/>
-      <w:r>
-        <w:t>TPay</w:t>
-      </w:r>
-      <w:proofErr w:type="spellEnd"/>
-      <w:r>
-        <w:t xml:space="preserve"> 20-07-2023_cla.xls</w:t>
+        <w:t>banca CarispCredit\TPay 20-07-2023_cla.xls</w:t>
       </w:r>
     </w:p>
     <w:p>
@@ -1365,13 +1622,8 @@
       <w:pPr>
         <w:pStyle w:val="Esempio"/>
       </w:pPr>
-      <w:proofErr w:type="spellStart"/>
-      <w:r>
-        <w:t>paypal</w:t>
-      </w:r>
-      <w:proofErr w:type="spellEnd"/>
-      <w:r>
-        <w:t>\Estrattoconto_paypal-202401.CSV</w:t>
+      <w:r>
+        <w:t>paypal\Estrattoconto_paypal-202401.CSV</w:t>
       </w:r>
     </w:p>
     <w:p>
@@ -1402,7 +1654,7 @@
       <w:pPr>
         <w:pStyle w:val="Titolo2"/>
       </w:pPr>
-      <w:bookmarkStart w:id="2" w:name="_Toc189322896"/>
+      <w:bookmarkStart w:id="2" w:name="_Toc225612076"/>
       <w:r>
         <w:lastRenderedPageBreak/>
         <w:t>Come verificare la runtime Java</w:t>
@@ -1546,7 +1798,7 @@
               </wp:anchor>
             </w:drawing>
           </mc:Choice>
-          <mc:Fallback>
+          <mc:Fallback xmlns:w16du="http://schemas.microsoft.com/office/word/2023/wordml/word16du" xmlns:w16sdtfl="http://schemas.microsoft.com/office/word/2024/wordml/sdtformatlock">
             <w:pict>
               <v:shapetype w14:anchorId="7E0913A7" id="_x0000_t75" coordsize="21600,21600" o:spt="75" o:preferrelative="t" path="m@4@5l@4@11@9@11@9@5xe" filled="f" stroked="f">
                 <v:stroke joinstyle="miter"/>
@@ -1610,7 +1862,7 @@
               </wp:anchor>
             </w:drawing>
           </mc:Choice>
-          <mc:Fallback>
+          <mc:Fallback xmlns:w16du="http://schemas.microsoft.com/office/word/2023/wordml/word16du" xmlns:w16sdtfl="http://schemas.microsoft.com/office/word/2024/wordml/sdtformatlock">
             <w:pict>
               <v:shape w14:anchorId="64E3F8A9" id="Input penna 4" o:spid="_x0000_s1026" type="#_x0000_t75" style="position:absolute;margin-left:157.35pt;margin-top:45.1pt;width:46.85pt;height:12.5pt;z-index:251663360;visibility:visible;mso-wrap-style:square;mso-wrap-distance-left:9pt;mso-wrap-distance-top:0;mso-wrap-distance-right:9pt;mso-wrap-distance-bottom:0;mso-position-horizontal:absolute;mso-position-horizontal-relative:text;mso-position-vertical:absolute;mso-position-vertical-relative:text" o:gfxdata="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">
                 <v:imagedata r:id="rId12" o:title=""/>
@@ -1749,7 +2001,7 @@
       <w:pPr>
         <w:pStyle w:val="Titolo2"/>
       </w:pPr>
-      <w:bookmarkStart w:id="3" w:name="_Toc189322897"/>
+      <w:bookmarkStart w:id="3" w:name="_Toc225612077"/>
       <w:r>
         <w:lastRenderedPageBreak/>
         <w:t>Verifica installazione di JavaFX</w:t>
@@ -1899,7 +2151,7 @@
       <w:pPr>
         <w:pStyle w:val="Titolo2"/>
       </w:pPr>
-      <w:bookmarkStart w:id="4" w:name="_Toc189322898"/>
+      <w:bookmarkStart w:id="4" w:name="_Toc225612078"/>
       <w:r>
         <w:t>Verifica delle variabili d’ambiente</w:t>
       </w:r>
@@ -2102,7 +2354,7 @@
       <w:pPr>
         <w:pStyle w:val="Titolo2"/>
       </w:pPr>
-      <w:bookmarkStart w:id="5" w:name="_Toc189322899"/>
+      <w:bookmarkStart w:id="5" w:name="_Toc225612079"/>
       <w:r>
         <w:t>Impostazione variabili d’ambiente</w:t>
       </w:r>
@@ -2230,7 +2482,7 @@
               </wp:anchor>
             </w:drawing>
           </mc:Choice>
-          <mc:Fallback>
+          <mc:Fallback xmlns:w16du="http://schemas.microsoft.com/office/word/2023/wordml/word16du" xmlns:w16sdtfl="http://schemas.microsoft.com/office/word/2024/wordml/sdtformatlock">
             <w:pict>
               <v:shape w14:anchorId="5FF5076F" id="Input penna 3" o:spid="_x0000_s1026" type="#_x0000_t75" style="position:absolute;margin-left:40.45pt;margin-top:33.7pt;width:71.25pt;height:25.6pt;z-index:251662336;visibility:visible;mso-wrap-style:square;mso-wrap-distance-left:9pt;mso-wrap-distance-top:0;mso-wrap-distance-right:9pt;mso-wrap-distance-bottom:0;mso-position-horizontal:absolute;mso-position-horizontal-relative:text;mso-position-vertical:absolute;mso-position-vertical-relative:text" o:gfxdata="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">
                 <v:imagedata r:id="rId18" o:title=""/>
@@ -2464,12 +2716,15 @@
     <w:p>
       <w:pPr>
         <w:pStyle w:val="Esempio"/>
-      </w:pPr>
-      <w:r>
-        <w:t xml:space="preserve">“JAVAFX_HOME” = </w:t>
-      </w:r>
-      <w:r>
-        <w:t>"C:\Program Files\Java\javafx-sdk-23.0.1"</w:t>
+        <w:rPr>
+          <w:lang w:val="fr-FR"/>
+        </w:rPr>
+      </w:pPr>
+      <w:r>
+        <w:rPr>
+          <w:lang w:val="fr-FR"/>
+        </w:rPr>
+        <w:t>“JAVAFX_HOME” = "C:\Program Files\Java\javafx-sdk-23.0.1"</w:t>
       </w:r>
     </w:p>
     <w:p>
@@ -2513,27 +2768,204 @@
         <w:t>Verifica delle variabili d’ambiente”</w:t>
       </w:r>
     </w:p>
+    <w:p>
+      <w:pPr>
+        <w:pStyle w:val="Titolo1"/>
+      </w:pPr>
+      <w:bookmarkStart w:id="6" w:name="_Toc225612080"/>
+      <w:r>
+        <w:lastRenderedPageBreak/>
+        <w:t>File properties “</w:t>
+      </w:r>
+      <w:proofErr w:type="spellStart"/>
+      <w:r>
+        <w:t>Banca.properties</w:t>
+      </w:r>
+      <w:proofErr w:type="spellEnd"/>
+      <w:r>
+        <w:t>”</w:t>
+      </w:r>
+      <w:bookmarkEnd w:id="6"/>
+    </w:p>
+    <w:p>
+      <w:r>
+        <w:t>Il file di properties “</w:t>
+      </w:r>
+      <w:proofErr w:type="spellStart"/>
+      <w:r>
+        <w:t>Banca.properties</w:t>
+      </w:r>
+      <w:proofErr w:type="spellEnd"/>
+      <w:r>
+        <w:t>” contiene varie categorie di valori della serie:</w:t>
+      </w:r>
+    </w:p>
+    <w:p>
+      <w:pPr>
+        <w:pStyle w:val="Esempio"/>
+      </w:pPr>
+      <w:r>
+        <w:tab/>
+        <w:t>key = value</w:t>
+      </w:r>
+    </w:p>
+    <w:p>
+      <w:r>
+        <w:t>esempio per la categoria “DB”:</w:t>
+      </w:r>
+    </w:p>
+    <w:p>
+      <w:pPr>
+        <w:pStyle w:val="Esempio"/>
+      </w:pPr>
+      <w:r>
+        <w:t>DB.Type=SQLite</w:t>
+      </w:r>
+    </w:p>
+    <w:p>
+      <w:r>
+        <w:t xml:space="preserve">Qui si specifica che per la categoria del </w:t>
+      </w:r>
+      <w:proofErr w:type="spellStart"/>
+      <w:r>
+        <w:rPr>
+          <w:i/>
+          <w:iCs/>
+        </w:rPr>
+        <w:t>DataBase</w:t>
+      </w:r>
+      <w:proofErr w:type="spellEnd"/>
+      <w:r>
+        <w:rPr>
+          <w:i/>
+          <w:iCs/>
+        </w:rPr>
+        <w:t xml:space="preserve"> </w:t>
+      </w:r>
+      <w:r>
+        <w:t>il tipo di motore è “</w:t>
+      </w:r>
+      <w:proofErr w:type="spellStart"/>
+      <w:r>
+        <w:t>SQLite</w:t>
+      </w:r>
+      <w:proofErr w:type="spellEnd"/>
+      <w:r>
+        <w:t>”. Vedi elenco categorie completo qui di seguito</w:t>
+      </w:r>
+    </w:p>
+    <w:p>
+      <w:pPr>
+        <w:pStyle w:val="Titolo2"/>
+      </w:pPr>
+      <w:bookmarkStart w:id="7" w:name="_Toc225612081"/>
+      <w:r>
+        <w:t>“Cardid” Codici Card Holders</w:t>
+      </w:r>
+      <w:bookmarkEnd w:id="7"/>
+    </w:p>
+    <w:p>
+      <w:r>
+        <w:t xml:space="preserve">Con questi valori si associa i codici forniti dagli enti </w:t>
+      </w:r>
+      <w:r>
+        <w:t>all’Holder</w:t>
+      </w:r>
+      <w:r>
+        <w:t xml:space="preserve"> fisico (persona fisica) a cui appartiene l’eventuale Carta di Credito/Debito. Esempio:</w:t>
+      </w:r>
+    </w:p>
+    <w:p>
+      <w:pPr>
+        <w:pStyle w:val="Esempio"/>
+      </w:pPr>
+      <w:r>
+        <w:t>cardid.assoc.001=84806;</w:t>
+      </w:r>
+      <w:r>
+        <w:t>cla</w:t>
+      </w:r>
+    </w:p>
+    <w:p>
+      <w:pPr>
+        <w:pStyle w:val="Esempio"/>
+      </w:pPr>
+      <w:r>
+        <w:t>cardid.assoc.002=85928;eug</w:t>
+      </w:r>
+    </w:p>
+    <w:p>
+      <w:r>
+        <w:t>Qui viene specificato che se trovo il codice “</w:t>
+      </w:r>
+      <w:r>
+        <w:t>84806</w:t>
+      </w:r>
+      <w:r>
+        <w:t>” allora la carta è di “</w:t>
+      </w:r>
+      <w:proofErr w:type="spellStart"/>
+      <w:r>
+        <w:t>cla</w:t>
+      </w:r>
+      <w:proofErr w:type="spellEnd"/>
+      <w:r>
+        <w:t>”, se trovo “</w:t>
+      </w:r>
+      <w:r>
+        <w:t>85928</w:t>
+      </w:r>
+      <w:r>
+        <w:t>” allora è di “</w:t>
+      </w:r>
+      <w:proofErr w:type="spellStart"/>
+      <w:r>
+        <w:t>eug</w:t>
+      </w:r>
+      <w:proofErr w:type="spellEnd"/>
+      <w:r>
+        <w:t>”</w:t>
+      </w:r>
+      <w:r>
+        <w:t>.</w:t>
+      </w:r>
+    </w:p>
+    <w:p>
+      <w:r>
+        <w:t xml:space="preserve">Nella </w:t>
+      </w:r>
+      <w:r>
+        <w:rPr>
+          <w:i/>
+          <w:iCs/>
+        </w:rPr>
+        <w:t>key</w:t>
+      </w:r>
+      <w:r>
+        <w:t xml:space="preserve"> il “.001”, “.002” è il progressivo di associazione di modo da creare una “key” univoca.</w:t>
+      </w:r>
+    </w:p>
     <w:p/>
     <w:p>
       <w:pPr>
         <w:pStyle w:val="Titolo1"/>
       </w:pPr>
-      <w:bookmarkStart w:id="6" w:name="_Toc189322900"/>
+      <w:bookmarkStart w:id="8" w:name="_Toc225612082"/>
       <w:r>
         <w:lastRenderedPageBreak/>
         <w:t>Import dei dati</w:t>
       </w:r>
-      <w:bookmarkEnd w:id="6"/>
+      <w:bookmarkEnd w:id="8"/>
     </w:p>
     <w:p>
       <w:pPr>
         <w:pStyle w:val="Titolo2"/>
       </w:pPr>
-      <w:bookmarkStart w:id="7" w:name="_Toc189322901"/>
+      <w:bookmarkStart w:id="9" w:name="_Toc225612083"/>
       <w:r>
         <w:t>Struttura direttorio di Backup files CSV</w:t>
       </w:r>
-      <w:bookmarkEnd w:id="7"/>
+      <w:bookmarkEnd w:id="9"/>
     </w:p>
     <w:p>
       <w:r>
@@ -2722,11 +3154,11 @@
       <w:pPr>
         <w:pStyle w:val="Titolo2"/>
       </w:pPr>
-      <w:bookmarkStart w:id="8" w:name="_Toc189322902"/>
+      <w:bookmarkStart w:id="10" w:name="_Toc225612084"/>
       <w:r>
         <w:t>Import dei files</w:t>
       </w:r>
-      <w:bookmarkEnd w:id="8"/>
+      <w:bookmarkEnd w:id="10"/>
     </w:p>
     <w:p>
       <w:r>
@@ -3130,13 +3562,60 @@
     </w:p>
     <w:p>
       <w:pPr>
+        <w:pStyle w:val="Titolo1"/>
+      </w:pPr>
+      <w:bookmarkStart w:id="11" w:name="_Toc225612085"/>
+      <w:r>
+        <w:lastRenderedPageBreak/>
+        <w:t>Imports dal WEB</w:t>
+      </w:r>
+    </w:p>
+    <w:p>
+      <w:pPr>
         <w:pStyle w:val="Titolo2"/>
       </w:pPr>
-      <w:bookmarkStart w:id="9" w:name="_Toc189322903"/>
-      <w:r>
+      <w:r>
+        <w:t>Import Cassa Risparmio</w:t>
+      </w:r>
+    </w:p>
+    <w:p>
+      <w:r>
+        <w:t xml:space="preserve">Andare sul sito: </w:t>
+      </w:r>
+      <w:hyperlink r:id="rId26" w:history="1">
+        <w:proofErr w:type="spellStart"/>
+        <w:r>
+          <w:rPr>
+            <w:rStyle w:val="Collegamentoipertestuale"/>
+          </w:rPr>
+          <w:t>Welly</w:t>
+        </w:r>
+        <w:proofErr w:type="spellEnd"/>
+      </w:hyperlink>
+    </w:p>
+    <w:p/>
+    <w:p>
+      <w:pPr>
+        <w:pStyle w:val="Titolo1"/>
+        <w:rPr>
+          <w:sz w:val="26"/>
+          <w:szCs w:val="26"/>
+        </w:rPr>
+      </w:pPr>
+      <w:r>
+        <w:lastRenderedPageBreak/>
+        <w:br w:type="page"/>
+      </w:r>
+    </w:p>
+    <w:p>
+      <w:pPr>
+        <w:pStyle w:val="Titolo2"/>
+      </w:pPr>
+      <w:r>
+        <w:lastRenderedPageBreak/>
         <w:t>Comunicazioni di Log</w:t>
       </w:r>
-      <w:bookmarkEnd w:id="9"/>
+      <w:bookmarkEnd w:id="11"/>
     </w:p>
     <w:p>
       <w:r>
@@ -3159,7 +3638,6 @@
         <w:pStyle w:val="immagine"/>
       </w:pPr>
       <w:r>
-        <w:lastRenderedPageBreak/>
         <w:drawing>
           <wp:inline distT="0" distB="0" distL="0" distR="0" wp14:anchorId="766E4D96" wp14:editId="03E52CE1">
             <wp:extent cx="6120130" cy="2268220"/>
@@ -3176,7 +3654,7 @@
                     <pic:cNvPicPr/>
                   </pic:nvPicPr>
                   <pic:blipFill>
-                    <a:blip r:embed="rId26"/>
+                    <a:blip r:embed="rId27"/>
                     <a:stretch>
                       <a:fillRect/>
                     </a:stretch>
@@ -3334,22 +3812,1575 @@
       <w:pPr>
         <w:pStyle w:val="Titolo1"/>
       </w:pPr>
-      <w:bookmarkStart w:id="10" w:name="_Toc189322904"/>
+      <w:bookmarkStart w:id="12" w:name="_Toc225612086"/>
+      <w:r>
+        <w:lastRenderedPageBreak/>
+        <w:t>Import codici Statistici</w:t>
+      </w:r>
+      <w:bookmarkEnd w:id="12"/>
+    </w:p>
+    <w:p>
+      <w:r>
+        <w:t xml:space="preserve">In fase iniziale è possibile importare i codici statistici costruiti a proprio piacere. Ovvio che quest’operazione è valida </w:t>
+      </w:r>
+      <w:r>
+        <w:rPr>
+          <w:b/>
+        </w:rPr>
+        <w:t>*SOLO*</w:t>
+      </w:r>
+      <w:r>
+        <w:t xml:space="preserve"> all’inizio della gestione con BANCA.</w:t>
+      </w:r>
+    </w:p>
+    <w:p>
+      <w:r>
+        <w:t xml:space="preserve">Infatti l’import dei codici Statistici </w:t>
+      </w:r>
+      <w:r>
+        <w:rPr>
+          <w:b/>
+        </w:rPr>
+        <w:t>implica l’azzeramento</w:t>
+      </w:r>
+      <w:r>
+        <w:t xml:space="preserve"> di classificazione statistica di tutti i movimenti</w:t>
+      </w:r>
+      <w:r>
+        <w:t xml:space="preserve"> già</w:t>
+      </w:r>
+      <w:r>
+        <w:t xml:space="preserve"> presenti! </w:t>
+      </w:r>
+      <w:r>
+        <w:br/>
+      </w:r>
+      <w:r>
+        <w:t xml:space="preserve">Dopo di questa operazione occorre ricominciare l’assegnazione </w:t>
+      </w:r>
+      <w:r>
+        <w:rPr>
+          <w:b/>
+        </w:rPr>
+        <w:t>da capo</w:t>
+      </w:r>
+      <w:r>
+        <w:t>!</w:t>
+      </w:r>
+    </w:p>
+    <w:p>
+      <w:r>
+        <w:t>Se siamo all’inizio possiamo costruire un fogli Excel che contenga le seguenti colonne:</w:t>
+      </w:r>
+    </w:p>
+    <w:p>
+      <w:pPr>
+        <w:pStyle w:val="Paragrafoelenco"/>
+        <w:numPr>
+          <w:ilvl w:val="0"/>
+          <w:numId w:val="13"/>
+        </w:numPr>
+      </w:pPr>
+      <w:r>
+        <w:rPr>
+          <w:b/>
+          <w:bCs/>
+        </w:rPr>
+        <w:t>cat1</w:t>
+      </w:r>
+      <w:r>
+        <w:t>: categoria con 1 solo codice</w:t>
+      </w:r>
+    </w:p>
+    <w:p>
+      <w:pPr>
+        <w:pStyle w:val="Paragrafoelenco"/>
+        <w:numPr>
+          <w:ilvl w:val="0"/>
+          <w:numId w:val="13"/>
+        </w:numPr>
+      </w:pPr>
+      <w:r>
+        <w:rPr>
+          <w:b/>
+          <w:bCs/>
+        </w:rPr>
+        <w:t>cat2</w:t>
+      </w:r>
+      <w:r>
+        <w:t>: categoria con 2 codici separato da punto</w:t>
+      </w:r>
+    </w:p>
+    <w:p>
+      <w:pPr>
+        <w:pStyle w:val="Paragrafoelenco"/>
+        <w:numPr>
+          <w:ilvl w:val="0"/>
+          <w:numId w:val="13"/>
+        </w:numPr>
+      </w:pPr>
+      <w:r>
+        <w:rPr>
+          <w:b/>
+          <w:bCs/>
+        </w:rPr>
+        <w:t>cat3</w:t>
+      </w:r>
+      <w:r>
+        <w:t>: categoria con 3 codici separato da 2 punti</w:t>
+      </w:r>
+    </w:p>
+    <w:p>
+      <w:pPr>
+        <w:pStyle w:val="Paragrafoelenco"/>
+        <w:numPr>
+          <w:ilvl w:val="0"/>
+          <w:numId w:val="13"/>
+        </w:numPr>
+      </w:pPr>
+      <w:r>
+        <w:rPr>
+          <w:b/>
+          <w:bCs/>
+        </w:rPr>
+        <w:t>Descrizione</w:t>
+      </w:r>
+      <w:r>
+        <w:t>: descrizione estesa del significato del codice statistico</w:t>
+      </w:r>
+    </w:p>
+    <w:p>
+      <w:r>
+        <w:t>Esempio</w:t>
+      </w:r>
+      <w:r>
+        <w:t xml:space="preserve"> di classificazione delle spese con codici</w:t>
+      </w:r>
+      <w:r>
+        <w:t>:</w:t>
+      </w:r>
+    </w:p>
+    <w:p/>
+    <w:tbl>
+      <w:tblPr>
+        <w:tblW w:w="8080" w:type="dxa"/>
+        <w:tblBorders>
+          <w:top w:val="single" w:sz="4" w:space="0" w:color="auto"/>
+          <w:left w:val="single" w:sz="4" w:space="0" w:color="auto"/>
+          <w:bottom w:val="single" w:sz="4" w:space="0" w:color="auto"/>
+          <w:right w:val="single" w:sz="4" w:space="0" w:color="auto"/>
+        </w:tblBorders>
+        <w:tblCellMar>
+          <w:left w:w="70" w:type="dxa"/>
+          <w:right w:w="70" w:type="dxa"/>
+        </w:tblCellMar>
+        <w:tblLook w:val="04A0" w:firstRow="1" w:lastRow="0" w:firstColumn="1" w:lastColumn="0" w:noHBand="0" w:noVBand="1"/>
+      </w:tblPr>
+      <w:tblGrid>
+        <w:gridCol w:w="529"/>
+        <w:gridCol w:w="642"/>
+        <w:gridCol w:w="921"/>
+        <w:gridCol w:w="6160"/>
+      </w:tblGrid>
+      <w:tr>
+        <w:trPr>
+          <w:trHeight w:val="300"/>
+        </w:trPr>
+        <w:tc>
+          <w:tcPr>
+            <w:tcW w:w="480" w:type="dxa"/>
+            <w:tcBorders>
+              <w:top w:val="single" w:sz="4" w:space="0" w:color="auto"/>
+              <w:bottom w:val="single" w:sz="4" w:space="0" w:color="auto"/>
+              <w:right w:val="single" w:sz="4" w:space="0" w:color="auto"/>
+            </w:tcBorders>
+            <w:noWrap/>
+            <w:vAlign w:val="bottom"/>
+            <w:hideMark/>
+          </w:tcPr>
+          <w:p>
+            <w:pPr>
+              <w:spacing w:before="0" w:after="0"/>
+              <w:contextualSpacing w:val="0"/>
+              <w:rPr>
+                <w:rFonts w:ascii="Calibri" w:eastAsia="Times New Roman" w:hAnsi="Calibri" w:cs="Calibri"/>
+                <w:b/>
+                <w:bCs/>
+                <w:color w:val="000000"/>
+                <w:kern w:val="0"/>
+                <w:szCs w:val="22"/>
+                <w:highlight w:val="lightGray"/>
+                <w:lang w:eastAsia="it-IT"/>
+                <w14:ligatures w14:val="none"/>
+              </w:rPr>
+            </w:pPr>
+            <w:r>
+              <w:rPr>
+                <w:rFonts w:ascii="Calibri" w:eastAsia="Times New Roman" w:hAnsi="Calibri" w:cs="Calibri"/>
+                <w:b/>
+                <w:bCs/>
+                <w:color w:val="000000"/>
+                <w:kern w:val="0"/>
+                <w:szCs w:val="22"/>
+                <w:highlight w:val="lightGray"/>
+                <w:lang w:eastAsia="it-IT"/>
+                <w14:ligatures w14:val="none"/>
+              </w:rPr>
+              <w:t>cat1</w:t>
+            </w:r>
+          </w:p>
+        </w:tc>
+        <w:tc>
+          <w:tcPr>
+            <w:tcW w:w="580" w:type="dxa"/>
+            <w:tcBorders>
+              <w:top w:val="single" w:sz="4" w:space="0" w:color="auto"/>
+              <w:left w:val="single" w:sz="4" w:space="0" w:color="auto"/>
+              <w:bottom w:val="single" w:sz="4" w:space="0" w:color="auto"/>
+              <w:right w:val="single" w:sz="4" w:space="0" w:color="auto"/>
+            </w:tcBorders>
+            <w:noWrap/>
+            <w:vAlign w:val="bottom"/>
+            <w:hideMark/>
+          </w:tcPr>
+          <w:p>
+            <w:pPr>
+              <w:spacing w:before="0" w:after="0"/>
+              <w:contextualSpacing w:val="0"/>
+              <w:rPr>
+                <w:rFonts w:ascii="Calibri" w:eastAsia="Times New Roman" w:hAnsi="Calibri" w:cs="Calibri"/>
+                <w:b/>
+                <w:bCs/>
+                <w:color w:val="000000"/>
+                <w:kern w:val="0"/>
+                <w:szCs w:val="22"/>
+                <w:highlight w:val="lightGray"/>
+                <w:lang w:eastAsia="it-IT"/>
+                <w14:ligatures w14:val="none"/>
+              </w:rPr>
+            </w:pPr>
+            <w:r>
+              <w:rPr>
+                <w:rFonts w:ascii="Calibri" w:eastAsia="Times New Roman" w:hAnsi="Calibri" w:cs="Calibri"/>
+                <w:b/>
+                <w:bCs/>
+                <w:color w:val="000000"/>
+                <w:kern w:val="0"/>
+                <w:szCs w:val="22"/>
+                <w:highlight w:val="lightGray"/>
+                <w:lang w:eastAsia="it-IT"/>
+                <w14:ligatures w14:val="none"/>
+              </w:rPr>
+              <w:t>cat2</w:t>
+            </w:r>
+          </w:p>
+        </w:tc>
+        <w:tc>
+          <w:tcPr>
+            <w:tcW w:w="860" w:type="dxa"/>
+            <w:tcBorders>
+              <w:top w:val="single" w:sz="4" w:space="0" w:color="auto"/>
+              <w:left w:val="single" w:sz="4" w:space="0" w:color="auto"/>
+              <w:bottom w:val="single" w:sz="4" w:space="0" w:color="auto"/>
+              <w:right w:val="single" w:sz="4" w:space="0" w:color="auto"/>
+            </w:tcBorders>
+            <w:noWrap/>
+            <w:vAlign w:val="bottom"/>
+            <w:hideMark/>
+          </w:tcPr>
+          <w:p>
+            <w:pPr>
+              <w:spacing w:before="0" w:after="0"/>
+              <w:contextualSpacing w:val="0"/>
+              <w:rPr>
+                <w:rFonts w:ascii="Calibri" w:eastAsia="Times New Roman" w:hAnsi="Calibri" w:cs="Calibri"/>
+                <w:b/>
+                <w:bCs/>
+                <w:color w:val="000000"/>
+                <w:kern w:val="0"/>
+                <w:szCs w:val="22"/>
+                <w:highlight w:val="lightGray"/>
+                <w:lang w:eastAsia="it-IT"/>
+                <w14:ligatures w14:val="none"/>
+              </w:rPr>
+            </w:pPr>
+            <w:r>
+              <w:rPr>
+                <w:rFonts w:ascii="Calibri" w:eastAsia="Times New Roman" w:hAnsi="Calibri" w:cs="Calibri"/>
+                <w:b/>
+                <w:bCs/>
+                <w:color w:val="000000"/>
+                <w:kern w:val="0"/>
+                <w:szCs w:val="22"/>
+                <w:highlight w:val="lightGray"/>
+                <w:lang w:eastAsia="it-IT"/>
+                <w14:ligatures w14:val="none"/>
+              </w:rPr>
+              <w:t>cat3</w:t>
+            </w:r>
+          </w:p>
+        </w:tc>
+        <w:tc>
+          <w:tcPr>
+            <w:tcW w:w="6160" w:type="dxa"/>
+            <w:tcBorders>
+              <w:top w:val="single" w:sz="4" w:space="0" w:color="auto"/>
+              <w:left w:val="single" w:sz="4" w:space="0" w:color="auto"/>
+              <w:bottom w:val="single" w:sz="4" w:space="0" w:color="auto"/>
+            </w:tcBorders>
+            <w:noWrap/>
+            <w:vAlign w:val="bottom"/>
+            <w:hideMark/>
+          </w:tcPr>
+          <w:p>
+            <w:pPr>
+              <w:spacing w:before="0" w:after="0"/>
+              <w:contextualSpacing w:val="0"/>
+              <w:rPr>
+                <w:rFonts w:ascii="Calibri" w:eastAsia="Times New Roman" w:hAnsi="Calibri" w:cs="Calibri"/>
+                <w:b/>
+                <w:bCs/>
+                <w:color w:val="000000"/>
+                <w:kern w:val="0"/>
+                <w:szCs w:val="22"/>
+                <w:highlight w:val="lightGray"/>
+                <w:lang w:eastAsia="it-IT"/>
+                <w14:ligatures w14:val="none"/>
+              </w:rPr>
+            </w:pPr>
+            <w:r>
+              <w:rPr>
+                <w:rFonts w:ascii="Calibri" w:eastAsia="Times New Roman" w:hAnsi="Calibri" w:cs="Calibri"/>
+                <w:b/>
+                <w:bCs/>
+                <w:color w:val="000000"/>
+                <w:kern w:val="0"/>
+                <w:szCs w:val="22"/>
+                <w:highlight w:val="lightGray"/>
+                <w:lang w:eastAsia="it-IT"/>
+                <w14:ligatures w14:val="none"/>
+              </w:rPr>
+              <w:t>Descrizione</w:t>
+            </w:r>
+          </w:p>
+        </w:tc>
+      </w:tr>
+      <w:tr>
+        <w:trPr>
+          <w:trHeight w:val="300"/>
+        </w:trPr>
+        <w:tc>
+          <w:tcPr>
+            <w:tcW w:w="480" w:type="dxa"/>
+            <w:tcBorders>
+              <w:top w:val="single" w:sz="4" w:space="0" w:color="auto"/>
+              <w:bottom w:val="nil"/>
+              <w:right w:val="single" w:sz="4" w:space="0" w:color="auto"/>
+            </w:tcBorders>
+            <w:noWrap/>
+            <w:vAlign w:val="bottom"/>
+            <w:hideMark/>
+          </w:tcPr>
+          <w:p>
+            <w:pPr>
+              <w:spacing w:before="0" w:after="0"/>
+              <w:contextualSpacing w:val="0"/>
+              <w:jc w:val="right"/>
+              <w:rPr>
+                <w:rFonts w:ascii="Calibri" w:eastAsia="Times New Roman" w:hAnsi="Calibri" w:cs="Calibri"/>
+                <w:color w:val="000000"/>
+                <w:kern w:val="0"/>
+                <w:szCs w:val="22"/>
+                <w:lang w:eastAsia="it-IT"/>
+                <w14:ligatures w14:val="none"/>
+              </w:rPr>
+            </w:pPr>
+            <w:r>
+              <w:rPr>
+                <w:rFonts w:ascii="Calibri" w:eastAsia="Times New Roman" w:hAnsi="Calibri" w:cs="Calibri"/>
+                <w:color w:val="000000"/>
+                <w:kern w:val="0"/>
+                <w:szCs w:val="22"/>
+                <w:lang w:eastAsia="it-IT"/>
+                <w14:ligatures w14:val="none"/>
+              </w:rPr>
+              <w:t>1</w:t>
+            </w:r>
+          </w:p>
+        </w:tc>
+        <w:tc>
+          <w:tcPr>
+            <w:tcW w:w="580" w:type="dxa"/>
+            <w:tcBorders>
+              <w:top w:val="single" w:sz="4" w:space="0" w:color="auto"/>
+              <w:left w:val="single" w:sz="4" w:space="0" w:color="auto"/>
+              <w:bottom w:val="nil"/>
+              <w:right w:val="single" w:sz="4" w:space="0" w:color="auto"/>
+            </w:tcBorders>
+            <w:noWrap/>
+            <w:vAlign w:val="bottom"/>
+            <w:hideMark/>
+          </w:tcPr>
+          <w:p>
+            <w:pPr>
+              <w:spacing w:before="0" w:after="0"/>
+              <w:contextualSpacing w:val="0"/>
+              <w:jc w:val="right"/>
+              <w:rPr>
+                <w:rFonts w:ascii="Calibri" w:eastAsia="Times New Roman" w:hAnsi="Calibri" w:cs="Calibri"/>
+                <w:color w:val="000000"/>
+                <w:kern w:val="0"/>
+                <w:szCs w:val="22"/>
+                <w:lang w:eastAsia="it-IT"/>
+                <w14:ligatures w14:val="none"/>
+              </w:rPr>
+            </w:pPr>
+          </w:p>
+        </w:tc>
+        <w:tc>
+          <w:tcPr>
+            <w:tcW w:w="860" w:type="dxa"/>
+            <w:tcBorders>
+              <w:top w:val="single" w:sz="4" w:space="0" w:color="auto"/>
+              <w:left w:val="single" w:sz="4" w:space="0" w:color="auto"/>
+              <w:bottom w:val="nil"/>
+              <w:right w:val="single" w:sz="4" w:space="0" w:color="auto"/>
+            </w:tcBorders>
+            <w:noWrap/>
+            <w:vAlign w:val="bottom"/>
+            <w:hideMark/>
+          </w:tcPr>
+          <w:p>
+            <w:pPr>
+              <w:spacing w:before="0" w:after="0"/>
+              <w:contextualSpacing w:val="0"/>
+              <w:rPr>
+                <w:rFonts w:ascii="Times New Roman" w:eastAsia="Times New Roman" w:hAnsi="Times New Roman" w:cs="Times New Roman"/>
+                <w:kern w:val="0"/>
+                <w:sz w:val="20"/>
+                <w:szCs w:val="20"/>
+                <w:lang w:eastAsia="it-IT"/>
+                <w14:ligatures w14:val="none"/>
+              </w:rPr>
+            </w:pPr>
+          </w:p>
+        </w:tc>
+        <w:tc>
+          <w:tcPr>
+            <w:tcW w:w="6160" w:type="dxa"/>
+            <w:tcBorders>
+              <w:top w:val="single" w:sz="4" w:space="0" w:color="auto"/>
+              <w:left w:val="single" w:sz="4" w:space="0" w:color="auto"/>
+            </w:tcBorders>
+            <w:noWrap/>
+            <w:vAlign w:val="bottom"/>
+            <w:hideMark/>
+          </w:tcPr>
+          <w:p>
+            <w:pPr>
+              <w:spacing w:before="0" w:after="0"/>
+              <w:contextualSpacing w:val="0"/>
+              <w:rPr>
+                <w:rFonts w:ascii="Calibri" w:eastAsia="Times New Roman" w:hAnsi="Calibri" w:cs="Calibri"/>
+                <w:color w:val="000000"/>
+                <w:kern w:val="0"/>
+                <w:szCs w:val="22"/>
+                <w:lang w:eastAsia="it-IT"/>
+                <w14:ligatures w14:val="none"/>
+              </w:rPr>
+            </w:pPr>
+            <w:r>
+              <w:rPr>
+                <w:rFonts w:ascii="Calibri" w:eastAsia="Times New Roman" w:hAnsi="Calibri" w:cs="Calibri"/>
+                <w:color w:val="000000"/>
+                <w:kern w:val="0"/>
+                <w:szCs w:val="22"/>
+                <w:lang w:eastAsia="it-IT"/>
+                <w14:ligatures w14:val="none"/>
+              </w:rPr>
+              <w:t>Alimentare</w:t>
+            </w:r>
+          </w:p>
+        </w:tc>
+      </w:tr>
+      <w:tr>
+        <w:trPr>
+          <w:trHeight w:val="300"/>
+        </w:trPr>
+        <w:tc>
+          <w:tcPr>
+            <w:tcW w:w="480" w:type="dxa"/>
+            <w:tcBorders>
+              <w:top w:val="nil"/>
+              <w:bottom w:val="nil"/>
+              <w:right w:val="single" w:sz="4" w:space="0" w:color="auto"/>
+            </w:tcBorders>
+            <w:noWrap/>
+            <w:vAlign w:val="bottom"/>
+            <w:hideMark/>
+          </w:tcPr>
+          <w:p>
+            <w:pPr>
+              <w:spacing w:before="0" w:after="0"/>
+              <w:contextualSpacing w:val="0"/>
+              <w:rPr>
+                <w:rFonts w:ascii="Calibri" w:eastAsia="Times New Roman" w:hAnsi="Calibri" w:cs="Calibri"/>
+                <w:color w:val="000000"/>
+                <w:kern w:val="0"/>
+                <w:szCs w:val="22"/>
+                <w:lang w:eastAsia="it-IT"/>
+                <w14:ligatures w14:val="none"/>
+              </w:rPr>
+            </w:pPr>
+          </w:p>
+        </w:tc>
+        <w:tc>
+          <w:tcPr>
+            <w:tcW w:w="580" w:type="dxa"/>
+            <w:tcBorders>
+              <w:top w:val="nil"/>
+              <w:left w:val="single" w:sz="4" w:space="0" w:color="auto"/>
+              <w:bottom w:val="nil"/>
+              <w:right w:val="single" w:sz="4" w:space="0" w:color="auto"/>
+            </w:tcBorders>
+            <w:noWrap/>
+            <w:vAlign w:val="bottom"/>
+            <w:hideMark/>
+          </w:tcPr>
+          <w:p>
+            <w:pPr>
+              <w:spacing w:before="0" w:after="0"/>
+              <w:contextualSpacing w:val="0"/>
+              <w:rPr>
+                <w:rFonts w:ascii="Calibri" w:eastAsia="Times New Roman" w:hAnsi="Calibri" w:cs="Calibri"/>
+                <w:color w:val="000000"/>
+                <w:kern w:val="0"/>
+                <w:szCs w:val="22"/>
+                <w:lang w:eastAsia="it-IT"/>
+                <w14:ligatures w14:val="none"/>
+              </w:rPr>
+            </w:pPr>
+            <w:r>
+              <w:rPr>
+                <w:rFonts w:ascii="Calibri" w:eastAsia="Times New Roman" w:hAnsi="Calibri" w:cs="Calibri"/>
+                <w:color w:val="000000"/>
+                <w:kern w:val="0"/>
+                <w:szCs w:val="22"/>
+                <w:lang w:eastAsia="it-IT"/>
+                <w14:ligatures w14:val="none"/>
+              </w:rPr>
+              <w:t>01.01</w:t>
+            </w:r>
+          </w:p>
+        </w:tc>
+        <w:tc>
+          <w:tcPr>
+            <w:tcW w:w="860" w:type="dxa"/>
+            <w:tcBorders>
+              <w:top w:val="nil"/>
+              <w:left w:val="single" w:sz="4" w:space="0" w:color="auto"/>
+              <w:bottom w:val="nil"/>
+              <w:right w:val="single" w:sz="4" w:space="0" w:color="auto"/>
+            </w:tcBorders>
+            <w:noWrap/>
+            <w:vAlign w:val="bottom"/>
+            <w:hideMark/>
+          </w:tcPr>
+          <w:p>
+            <w:pPr>
+              <w:spacing w:before="0" w:after="0"/>
+              <w:contextualSpacing w:val="0"/>
+              <w:rPr>
+                <w:rFonts w:ascii="Calibri" w:eastAsia="Times New Roman" w:hAnsi="Calibri" w:cs="Calibri"/>
+                <w:color w:val="000000"/>
+                <w:kern w:val="0"/>
+                <w:szCs w:val="22"/>
+                <w:lang w:eastAsia="it-IT"/>
+                <w14:ligatures w14:val="none"/>
+              </w:rPr>
+            </w:pPr>
+          </w:p>
+        </w:tc>
+        <w:tc>
+          <w:tcPr>
+            <w:tcW w:w="6160" w:type="dxa"/>
+            <w:tcBorders>
+              <w:left w:val="single" w:sz="4" w:space="0" w:color="auto"/>
+            </w:tcBorders>
+            <w:noWrap/>
+            <w:vAlign w:val="bottom"/>
+            <w:hideMark/>
+          </w:tcPr>
+          <w:p>
+            <w:pPr>
+              <w:spacing w:before="0" w:after="0"/>
+              <w:contextualSpacing w:val="0"/>
+              <w:rPr>
+                <w:rFonts w:ascii="Calibri" w:eastAsia="Times New Roman" w:hAnsi="Calibri" w:cs="Calibri"/>
+                <w:color w:val="000000"/>
+                <w:kern w:val="0"/>
+                <w:szCs w:val="22"/>
+                <w:lang w:eastAsia="it-IT"/>
+                <w14:ligatures w14:val="none"/>
+              </w:rPr>
+            </w:pPr>
+            <w:r>
+              <w:rPr>
+                <w:rFonts w:ascii="Calibri" w:eastAsia="Times New Roman" w:hAnsi="Calibri" w:cs="Calibri"/>
+                <w:color w:val="000000"/>
+                <w:kern w:val="0"/>
+                <w:szCs w:val="22"/>
+                <w:lang w:eastAsia="it-IT"/>
+                <w14:ligatures w14:val="none"/>
+              </w:rPr>
+              <w:t>Spese alimentari (</w:t>
+            </w:r>
+            <w:proofErr w:type="spellStart"/>
+            <w:r>
+              <w:rPr>
+                <w:rFonts w:ascii="Calibri" w:eastAsia="Times New Roman" w:hAnsi="Calibri" w:cs="Calibri"/>
+                <w:color w:val="000000"/>
+                <w:kern w:val="0"/>
+                <w:szCs w:val="22"/>
+                <w:lang w:eastAsia="it-IT"/>
+                <w14:ligatures w14:val="none"/>
+              </w:rPr>
+              <w:t>titancoop</w:t>
+            </w:r>
+            <w:proofErr w:type="spellEnd"/>
+            <w:r>
+              <w:rPr>
+                <w:rFonts w:ascii="Calibri" w:eastAsia="Times New Roman" w:hAnsi="Calibri" w:cs="Calibri"/>
+                <w:color w:val="000000"/>
+                <w:kern w:val="0"/>
+                <w:szCs w:val="22"/>
+                <w:lang w:eastAsia="it-IT"/>
+                <w14:ligatures w14:val="none"/>
+              </w:rPr>
+              <w:t>, Baguette, etc..)</w:t>
+            </w:r>
+          </w:p>
+        </w:tc>
+      </w:tr>
+      <w:tr>
+        <w:trPr>
+          <w:trHeight w:val="300"/>
+        </w:trPr>
+        <w:tc>
+          <w:tcPr>
+            <w:tcW w:w="480" w:type="dxa"/>
+            <w:tcBorders>
+              <w:top w:val="nil"/>
+              <w:bottom w:val="nil"/>
+              <w:right w:val="single" w:sz="4" w:space="0" w:color="auto"/>
+            </w:tcBorders>
+            <w:noWrap/>
+            <w:vAlign w:val="bottom"/>
+            <w:hideMark/>
+          </w:tcPr>
+          <w:p>
+            <w:pPr>
+              <w:spacing w:before="0" w:after="0"/>
+              <w:contextualSpacing w:val="0"/>
+              <w:rPr>
+                <w:rFonts w:ascii="Calibri" w:eastAsia="Times New Roman" w:hAnsi="Calibri" w:cs="Calibri"/>
+                <w:color w:val="000000"/>
+                <w:kern w:val="0"/>
+                <w:szCs w:val="22"/>
+                <w:lang w:eastAsia="it-IT"/>
+                <w14:ligatures w14:val="none"/>
+              </w:rPr>
+            </w:pPr>
+          </w:p>
+        </w:tc>
+        <w:tc>
+          <w:tcPr>
+            <w:tcW w:w="580" w:type="dxa"/>
+            <w:tcBorders>
+              <w:top w:val="nil"/>
+              <w:left w:val="single" w:sz="4" w:space="0" w:color="auto"/>
+              <w:bottom w:val="nil"/>
+              <w:right w:val="single" w:sz="4" w:space="0" w:color="auto"/>
+            </w:tcBorders>
+            <w:noWrap/>
+            <w:vAlign w:val="bottom"/>
+            <w:hideMark/>
+          </w:tcPr>
+          <w:p>
+            <w:pPr>
+              <w:spacing w:before="0" w:after="0"/>
+              <w:contextualSpacing w:val="0"/>
+              <w:rPr>
+                <w:rFonts w:ascii="Calibri" w:eastAsia="Times New Roman" w:hAnsi="Calibri" w:cs="Calibri"/>
+                <w:color w:val="000000"/>
+                <w:kern w:val="0"/>
+                <w:szCs w:val="22"/>
+                <w:lang w:eastAsia="it-IT"/>
+                <w14:ligatures w14:val="none"/>
+              </w:rPr>
+            </w:pPr>
+            <w:r>
+              <w:rPr>
+                <w:rFonts w:ascii="Calibri" w:eastAsia="Times New Roman" w:hAnsi="Calibri" w:cs="Calibri"/>
+                <w:color w:val="000000"/>
+                <w:kern w:val="0"/>
+                <w:szCs w:val="22"/>
+                <w:lang w:eastAsia="it-IT"/>
+                <w14:ligatures w14:val="none"/>
+              </w:rPr>
+              <w:t>01.02</w:t>
+            </w:r>
+          </w:p>
+        </w:tc>
+        <w:tc>
+          <w:tcPr>
+            <w:tcW w:w="860" w:type="dxa"/>
+            <w:tcBorders>
+              <w:top w:val="nil"/>
+              <w:left w:val="single" w:sz="4" w:space="0" w:color="auto"/>
+              <w:bottom w:val="nil"/>
+              <w:right w:val="single" w:sz="4" w:space="0" w:color="auto"/>
+            </w:tcBorders>
+            <w:noWrap/>
+            <w:vAlign w:val="bottom"/>
+            <w:hideMark/>
+          </w:tcPr>
+          <w:p>
+            <w:pPr>
+              <w:spacing w:before="0" w:after="0"/>
+              <w:contextualSpacing w:val="0"/>
+              <w:rPr>
+                <w:rFonts w:ascii="Calibri" w:eastAsia="Times New Roman" w:hAnsi="Calibri" w:cs="Calibri"/>
+                <w:color w:val="000000"/>
+                <w:kern w:val="0"/>
+                <w:szCs w:val="22"/>
+                <w:lang w:eastAsia="it-IT"/>
+                <w14:ligatures w14:val="none"/>
+              </w:rPr>
+            </w:pPr>
+          </w:p>
+        </w:tc>
+        <w:tc>
+          <w:tcPr>
+            <w:tcW w:w="6160" w:type="dxa"/>
+            <w:tcBorders>
+              <w:left w:val="single" w:sz="4" w:space="0" w:color="auto"/>
+            </w:tcBorders>
+            <w:noWrap/>
+            <w:vAlign w:val="bottom"/>
+            <w:hideMark/>
+          </w:tcPr>
+          <w:p>
+            <w:pPr>
+              <w:spacing w:before="0" w:after="0"/>
+              <w:contextualSpacing w:val="0"/>
+              <w:rPr>
+                <w:rFonts w:ascii="Calibri" w:eastAsia="Times New Roman" w:hAnsi="Calibri" w:cs="Calibri"/>
+                <w:color w:val="000000"/>
+                <w:kern w:val="0"/>
+                <w:szCs w:val="22"/>
+                <w:lang w:eastAsia="it-IT"/>
+                <w14:ligatures w14:val="none"/>
+              </w:rPr>
+            </w:pPr>
+            <w:r>
+              <w:rPr>
+                <w:rFonts w:ascii="Calibri" w:eastAsia="Times New Roman" w:hAnsi="Calibri" w:cs="Calibri"/>
+                <w:color w:val="000000"/>
+                <w:kern w:val="0"/>
+                <w:szCs w:val="22"/>
+                <w:lang w:eastAsia="it-IT"/>
+                <w14:ligatures w14:val="none"/>
+              </w:rPr>
+              <w:t>cene e ristoranti</w:t>
+            </w:r>
+          </w:p>
+        </w:tc>
+      </w:tr>
+      <w:tr>
+        <w:trPr>
+          <w:trHeight w:val="300"/>
+        </w:trPr>
+        <w:tc>
+          <w:tcPr>
+            <w:tcW w:w="480" w:type="dxa"/>
+            <w:tcBorders>
+              <w:top w:val="nil"/>
+              <w:bottom w:val="nil"/>
+              <w:right w:val="single" w:sz="4" w:space="0" w:color="auto"/>
+            </w:tcBorders>
+            <w:noWrap/>
+            <w:vAlign w:val="bottom"/>
+            <w:hideMark/>
+          </w:tcPr>
+          <w:p>
+            <w:pPr>
+              <w:spacing w:before="0" w:after="0"/>
+              <w:contextualSpacing w:val="0"/>
+              <w:jc w:val="right"/>
+              <w:rPr>
+                <w:rFonts w:ascii="Calibri" w:eastAsia="Times New Roman" w:hAnsi="Calibri" w:cs="Calibri"/>
+                <w:color w:val="000000"/>
+                <w:kern w:val="0"/>
+                <w:szCs w:val="22"/>
+                <w:lang w:eastAsia="it-IT"/>
+                <w14:ligatures w14:val="none"/>
+              </w:rPr>
+            </w:pPr>
+            <w:r>
+              <w:rPr>
+                <w:rFonts w:ascii="Calibri" w:eastAsia="Times New Roman" w:hAnsi="Calibri" w:cs="Calibri"/>
+                <w:color w:val="000000"/>
+                <w:kern w:val="0"/>
+                <w:szCs w:val="22"/>
+                <w:lang w:eastAsia="it-IT"/>
+                <w14:ligatures w14:val="none"/>
+              </w:rPr>
+              <w:t>2</w:t>
+            </w:r>
+          </w:p>
+        </w:tc>
+        <w:tc>
+          <w:tcPr>
+            <w:tcW w:w="580" w:type="dxa"/>
+            <w:tcBorders>
+              <w:top w:val="nil"/>
+              <w:left w:val="single" w:sz="4" w:space="0" w:color="auto"/>
+              <w:bottom w:val="nil"/>
+              <w:right w:val="single" w:sz="4" w:space="0" w:color="auto"/>
+            </w:tcBorders>
+            <w:noWrap/>
+            <w:vAlign w:val="bottom"/>
+            <w:hideMark/>
+          </w:tcPr>
+          <w:p>
+            <w:pPr>
+              <w:spacing w:before="0" w:after="0"/>
+              <w:contextualSpacing w:val="0"/>
+              <w:jc w:val="right"/>
+              <w:rPr>
+                <w:rFonts w:ascii="Calibri" w:eastAsia="Times New Roman" w:hAnsi="Calibri" w:cs="Calibri"/>
+                <w:color w:val="000000"/>
+                <w:kern w:val="0"/>
+                <w:szCs w:val="22"/>
+                <w:lang w:eastAsia="it-IT"/>
+                <w14:ligatures w14:val="none"/>
+              </w:rPr>
+            </w:pPr>
+          </w:p>
+        </w:tc>
+        <w:tc>
+          <w:tcPr>
+            <w:tcW w:w="860" w:type="dxa"/>
+            <w:tcBorders>
+              <w:top w:val="nil"/>
+              <w:left w:val="single" w:sz="4" w:space="0" w:color="auto"/>
+              <w:bottom w:val="nil"/>
+              <w:right w:val="single" w:sz="4" w:space="0" w:color="auto"/>
+            </w:tcBorders>
+            <w:noWrap/>
+            <w:vAlign w:val="bottom"/>
+            <w:hideMark/>
+          </w:tcPr>
+          <w:p>
+            <w:pPr>
+              <w:spacing w:before="0" w:after="0"/>
+              <w:contextualSpacing w:val="0"/>
+              <w:rPr>
+                <w:rFonts w:ascii="Times New Roman" w:eastAsia="Times New Roman" w:hAnsi="Times New Roman" w:cs="Times New Roman"/>
+                <w:kern w:val="0"/>
+                <w:sz w:val="20"/>
+                <w:szCs w:val="20"/>
+                <w:lang w:eastAsia="it-IT"/>
+                <w14:ligatures w14:val="none"/>
+              </w:rPr>
+            </w:pPr>
+          </w:p>
+        </w:tc>
+        <w:tc>
+          <w:tcPr>
+            <w:tcW w:w="6160" w:type="dxa"/>
+            <w:tcBorders>
+              <w:left w:val="single" w:sz="4" w:space="0" w:color="auto"/>
+            </w:tcBorders>
+            <w:noWrap/>
+            <w:vAlign w:val="bottom"/>
+            <w:hideMark/>
+          </w:tcPr>
+          <w:p>
+            <w:pPr>
+              <w:spacing w:before="0" w:after="0"/>
+              <w:contextualSpacing w:val="0"/>
+              <w:rPr>
+                <w:rFonts w:ascii="Calibri" w:eastAsia="Times New Roman" w:hAnsi="Calibri" w:cs="Calibri"/>
+                <w:color w:val="000000"/>
+                <w:kern w:val="0"/>
+                <w:szCs w:val="22"/>
+                <w:lang w:eastAsia="it-IT"/>
+                <w14:ligatures w14:val="none"/>
+              </w:rPr>
+            </w:pPr>
+            <w:r>
+              <w:rPr>
+                <w:rFonts w:ascii="Calibri" w:eastAsia="Times New Roman" w:hAnsi="Calibri" w:cs="Calibri"/>
+                <w:color w:val="000000"/>
+                <w:kern w:val="0"/>
+                <w:szCs w:val="22"/>
+                <w:lang w:eastAsia="it-IT"/>
+                <w14:ligatures w14:val="none"/>
+              </w:rPr>
+              <w:t>Automezzi</w:t>
+            </w:r>
+          </w:p>
+        </w:tc>
+      </w:tr>
+      <w:tr>
+        <w:trPr>
+          <w:trHeight w:val="300"/>
+        </w:trPr>
+        <w:tc>
+          <w:tcPr>
+            <w:tcW w:w="480" w:type="dxa"/>
+            <w:tcBorders>
+              <w:top w:val="nil"/>
+              <w:bottom w:val="nil"/>
+              <w:right w:val="single" w:sz="4" w:space="0" w:color="auto"/>
+            </w:tcBorders>
+            <w:noWrap/>
+            <w:vAlign w:val="bottom"/>
+            <w:hideMark/>
+          </w:tcPr>
+          <w:p>
+            <w:pPr>
+              <w:spacing w:before="0" w:after="0"/>
+              <w:contextualSpacing w:val="0"/>
+              <w:rPr>
+                <w:rFonts w:ascii="Calibri" w:eastAsia="Times New Roman" w:hAnsi="Calibri" w:cs="Calibri"/>
+                <w:color w:val="000000"/>
+                <w:kern w:val="0"/>
+                <w:szCs w:val="22"/>
+                <w:lang w:eastAsia="it-IT"/>
+                <w14:ligatures w14:val="none"/>
+              </w:rPr>
+            </w:pPr>
+          </w:p>
+        </w:tc>
+        <w:tc>
+          <w:tcPr>
+            <w:tcW w:w="580" w:type="dxa"/>
+            <w:tcBorders>
+              <w:top w:val="nil"/>
+              <w:left w:val="single" w:sz="4" w:space="0" w:color="auto"/>
+              <w:bottom w:val="nil"/>
+              <w:right w:val="single" w:sz="4" w:space="0" w:color="auto"/>
+            </w:tcBorders>
+            <w:noWrap/>
+            <w:vAlign w:val="bottom"/>
+            <w:hideMark/>
+          </w:tcPr>
+          <w:p>
+            <w:pPr>
+              <w:spacing w:before="0" w:after="0"/>
+              <w:contextualSpacing w:val="0"/>
+              <w:rPr>
+                <w:rFonts w:ascii="Calibri" w:eastAsia="Times New Roman" w:hAnsi="Calibri" w:cs="Calibri"/>
+                <w:color w:val="000000"/>
+                <w:kern w:val="0"/>
+                <w:szCs w:val="22"/>
+                <w:lang w:eastAsia="it-IT"/>
+                <w14:ligatures w14:val="none"/>
+              </w:rPr>
+            </w:pPr>
+            <w:r>
+              <w:rPr>
+                <w:rFonts w:ascii="Calibri" w:eastAsia="Times New Roman" w:hAnsi="Calibri" w:cs="Calibri"/>
+                <w:color w:val="000000"/>
+                <w:kern w:val="0"/>
+                <w:szCs w:val="22"/>
+                <w:lang w:eastAsia="it-IT"/>
+                <w14:ligatures w14:val="none"/>
+              </w:rPr>
+              <w:t>02.01</w:t>
+            </w:r>
+          </w:p>
+        </w:tc>
+        <w:tc>
+          <w:tcPr>
+            <w:tcW w:w="860" w:type="dxa"/>
+            <w:tcBorders>
+              <w:top w:val="nil"/>
+              <w:left w:val="single" w:sz="4" w:space="0" w:color="auto"/>
+              <w:bottom w:val="nil"/>
+              <w:right w:val="single" w:sz="4" w:space="0" w:color="auto"/>
+            </w:tcBorders>
+            <w:noWrap/>
+            <w:vAlign w:val="bottom"/>
+            <w:hideMark/>
+          </w:tcPr>
+          <w:p>
+            <w:pPr>
+              <w:spacing w:before="0" w:after="0"/>
+              <w:contextualSpacing w:val="0"/>
+              <w:rPr>
+                <w:rFonts w:ascii="Calibri" w:eastAsia="Times New Roman" w:hAnsi="Calibri" w:cs="Calibri"/>
+                <w:color w:val="000000"/>
+                <w:kern w:val="0"/>
+                <w:szCs w:val="22"/>
+                <w:lang w:eastAsia="it-IT"/>
+                <w14:ligatures w14:val="none"/>
+              </w:rPr>
+            </w:pPr>
+          </w:p>
+        </w:tc>
+        <w:tc>
+          <w:tcPr>
+            <w:tcW w:w="6160" w:type="dxa"/>
+            <w:tcBorders>
+              <w:left w:val="single" w:sz="4" w:space="0" w:color="auto"/>
+            </w:tcBorders>
+            <w:noWrap/>
+            <w:vAlign w:val="bottom"/>
+            <w:hideMark/>
+          </w:tcPr>
+          <w:p>
+            <w:pPr>
+              <w:spacing w:before="0" w:after="0"/>
+              <w:contextualSpacing w:val="0"/>
+              <w:rPr>
+                <w:rFonts w:ascii="Calibri" w:eastAsia="Times New Roman" w:hAnsi="Calibri" w:cs="Calibri"/>
+                <w:color w:val="000000"/>
+                <w:kern w:val="0"/>
+                <w:szCs w:val="22"/>
+                <w:lang w:eastAsia="it-IT"/>
+                <w14:ligatures w14:val="none"/>
+              </w:rPr>
+            </w:pPr>
+            <w:r>
+              <w:rPr>
+                <w:rFonts w:ascii="Calibri" w:eastAsia="Times New Roman" w:hAnsi="Calibri" w:cs="Calibri"/>
+                <w:color w:val="000000"/>
+                <w:kern w:val="0"/>
+                <w:szCs w:val="22"/>
+                <w:lang w:eastAsia="it-IT"/>
+                <w14:ligatures w14:val="none"/>
+              </w:rPr>
+              <w:t>Auto AUDI</w:t>
+            </w:r>
+          </w:p>
+        </w:tc>
+      </w:tr>
+      <w:tr>
+        <w:trPr>
+          <w:trHeight w:val="300"/>
+        </w:trPr>
+        <w:tc>
+          <w:tcPr>
+            <w:tcW w:w="480" w:type="dxa"/>
+            <w:tcBorders>
+              <w:top w:val="nil"/>
+              <w:bottom w:val="nil"/>
+              <w:right w:val="single" w:sz="4" w:space="0" w:color="auto"/>
+            </w:tcBorders>
+            <w:noWrap/>
+            <w:vAlign w:val="bottom"/>
+            <w:hideMark/>
+          </w:tcPr>
+          <w:p>
+            <w:pPr>
+              <w:spacing w:before="0" w:after="0"/>
+              <w:contextualSpacing w:val="0"/>
+              <w:rPr>
+                <w:rFonts w:ascii="Calibri" w:eastAsia="Times New Roman" w:hAnsi="Calibri" w:cs="Calibri"/>
+                <w:color w:val="000000"/>
+                <w:kern w:val="0"/>
+                <w:szCs w:val="22"/>
+                <w:lang w:eastAsia="it-IT"/>
+                <w14:ligatures w14:val="none"/>
+              </w:rPr>
+            </w:pPr>
+          </w:p>
+        </w:tc>
+        <w:tc>
+          <w:tcPr>
+            <w:tcW w:w="580" w:type="dxa"/>
+            <w:tcBorders>
+              <w:top w:val="nil"/>
+              <w:left w:val="single" w:sz="4" w:space="0" w:color="auto"/>
+              <w:bottom w:val="nil"/>
+              <w:right w:val="single" w:sz="4" w:space="0" w:color="auto"/>
+            </w:tcBorders>
+            <w:noWrap/>
+            <w:vAlign w:val="bottom"/>
+            <w:hideMark/>
+          </w:tcPr>
+          <w:p>
+            <w:pPr>
+              <w:spacing w:before="0" w:after="0"/>
+              <w:contextualSpacing w:val="0"/>
+              <w:rPr>
+                <w:rFonts w:ascii="Times New Roman" w:eastAsia="Times New Roman" w:hAnsi="Times New Roman" w:cs="Times New Roman"/>
+                <w:kern w:val="0"/>
+                <w:sz w:val="20"/>
+                <w:szCs w:val="20"/>
+                <w:lang w:eastAsia="it-IT"/>
+                <w14:ligatures w14:val="none"/>
+              </w:rPr>
+            </w:pPr>
+          </w:p>
+        </w:tc>
+        <w:tc>
+          <w:tcPr>
+            <w:tcW w:w="860" w:type="dxa"/>
+            <w:tcBorders>
+              <w:top w:val="nil"/>
+              <w:left w:val="single" w:sz="4" w:space="0" w:color="auto"/>
+              <w:bottom w:val="nil"/>
+              <w:right w:val="single" w:sz="4" w:space="0" w:color="auto"/>
+            </w:tcBorders>
+            <w:noWrap/>
+            <w:vAlign w:val="bottom"/>
+            <w:hideMark/>
+          </w:tcPr>
+          <w:p>
+            <w:pPr>
+              <w:spacing w:before="0" w:after="0"/>
+              <w:contextualSpacing w:val="0"/>
+              <w:rPr>
+                <w:rFonts w:ascii="Calibri" w:eastAsia="Times New Roman" w:hAnsi="Calibri" w:cs="Calibri"/>
+                <w:color w:val="000000"/>
+                <w:kern w:val="0"/>
+                <w:szCs w:val="22"/>
+                <w:lang w:eastAsia="it-IT"/>
+                <w14:ligatures w14:val="none"/>
+              </w:rPr>
+            </w:pPr>
+            <w:r>
+              <w:rPr>
+                <w:rFonts w:ascii="Calibri" w:eastAsia="Times New Roman" w:hAnsi="Calibri" w:cs="Calibri"/>
+                <w:color w:val="000000"/>
+                <w:kern w:val="0"/>
+                <w:szCs w:val="22"/>
+                <w:lang w:eastAsia="it-IT"/>
+                <w14:ligatures w14:val="none"/>
+              </w:rPr>
+              <w:t>02.01.01</w:t>
+            </w:r>
+          </w:p>
+        </w:tc>
+        <w:tc>
+          <w:tcPr>
+            <w:tcW w:w="6160" w:type="dxa"/>
+            <w:tcBorders>
+              <w:left w:val="single" w:sz="4" w:space="0" w:color="auto"/>
+            </w:tcBorders>
+            <w:noWrap/>
+            <w:vAlign w:val="bottom"/>
+            <w:hideMark/>
+          </w:tcPr>
+          <w:p>
+            <w:pPr>
+              <w:spacing w:before="0" w:after="0"/>
+              <w:contextualSpacing w:val="0"/>
+              <w:rPr>
+                <w:rFonts w:ascii="Calibri" w:eastAsia="Times New Roman" w:hAnsi="Calibri" w:cs="Calibri"/>
+                <w:color w:val="000000"/>
+                <w:kern w:val="0"/>
+                <w:szCs w:val="22"/>
+                <w:lang w:eastAsia="it-IT"/>
+                <w14:ligatures w14:val="none"/>
+              </w:rPr>
+            </w:pPr>
+            <w:r>
+              <w:rPr>
+                <w:rFonts w:ascii="Calibri" w:eastAsia="Times New Roman" w:hAnsi="Calibri" w:cs="Calibri"/>
+                <w:color w:val="000000"/>
+                <w:kern w:val="0"/>
+                <w:szCs w:val="22"/>
+                <w:lang w:eastAsia="it-IT"/>
+                <w14:ligatures w14:val="none"/>
+              </w:rPr>
+              <w:t>Benzina e/o gasolio</w:t>
+            </w:r>
+          </w:p>
+        </w:tc>
+      </w:tr>
+      <w:tr>
+        <w:trPr>
+          <w:trHeight w:val="300"/>
+        </w:trPr>
+        <w:tc>
+          <w:tcPr>
+            <w:tcW w:w="480" w:type="dxa"/>
+            <w:tcBorders>
+              <w:top w:val="nil"/>
+              <w:bottom w:val="nil"/>
+              <w:right w:val="single" w:sz="4" w:space="0" w:color="auto"/>
+            </w:tcBorders>
+            <w:noWrap/>
+            <w:vAlign w:val="bottom"/>
+            <w:hideMark/>
+          </w:tcPr>
+          <w:p>
+            <w:pPr>
+              <w:spacing w:before="0" w:after="0"/>
+              <w:contextualSpacing w:val="0"/>
+              <w:rPr>
+                <w:rFonts w:ascii="Calibri" w:eastAsia="Times New Roman" w:hAnsi="Calibri" w:cs="Calibri"/>
+                <w:color w:val="000000"/>
+                <w:kern w:val="0"/>
+                <w:szCs w:val="22"/>
+                <w:lang w:eastAsia="it-IT"/>
+                <w14:ligatures w14:val="none"/>
+              </w:rPr>
+            </w:pPr>
+          </w:p>
+        </w:tc>
+        <w:tc>
+          <w:tcPr>
+            <w:tcW w:w="580" w:type="dxa"/>
+            <w:tcBorders>
+              <w:top w:val="nil"/>
+              <w:left w:val="single" w:sz="4" w:space="0" w:color="auto"/>
+              <w:bottom w:val="nil"/>
+              <w:right w:val="single" w:sz="4" w:space="0" w:color="auto"/>
+            </w:tcBorders>
+            <w:noWrap/>
+            <w:vAlign w:val="bottom"/>
+            <w:hideMark/>
+          </w:tcPr>
+          <w:p>
+            <w:pPr>
+              <w:spacing w:before="0" w:after="0"/>
+              <w:contextualSpacing w:val="0"/>
+              <w:rPr>
+                <w:rFonts w:ascii="Times New Roman" w:eastAsia="Times New Roman" w:hAnsi="Times New Roman" w:cs="Times New Roman"/>
+                <w:kern w:val="0"/>
+                <w:sz w:val="20"/>
+                <w:szCs w:val="20"/>
+                <w:lang w:eastAsia="it-IT"/>
+                <w14:ligatures w14:val="none"/>
+              </w:rPr>
+            </w:pPr>
+          </w:p>
+        </w:tc>
+        <w:tc>
+          <w:tcPr>
+            <w:tcW w:w="860" w:type="dxa"/>
+            <w:tcBorders>
+              <w:top w:val="nil"/>
+              <w:left w:val="single" w:sz="4" w:space="0" w:color="auto"/>
+              <w:bottom w:val="nil"/>
+              <w:right w:val="single" w:sz="4" w:space="0" w:color="auto"/>
+            </w:tcBorders>
+            <w:noWrap/>
+            <w:vAlign w:val="bottom"/>
+            <w:hideMark/>
+          </w:tcPr>
+          <w:p>
+            <w:pPr>
+              <w:spacing w:before="0" w:after="0"/>
+              <w:contextualSpacing w:val="0"/>
+              <w:rPr>
+                <w:rFonts w:ascii="Calibri" w:eastAsia="Times New Roman" w:hAnsi="Calibri" w:cs="Calibri"/>
+                <w:color w:val="000000"/>
+                <w:kern w:val="0"/>
+                <w:szCs w:val="22"/>
+                <w:lang w:eastAsia="it-IT"/>
+                <w14:ligatures w14:val="none"/>
+              </w:rPr>
+            </w:pPr>
+            <w:r>
+              <w:rPr>
+                <w:rFonts w:ascii="Calibri" w:eastAsia="Times New Roman" w:hAnsi="Calibri" w:cs="Calibri"/>
+                <w:color w:val="000000"/>
+                <w:kern w:val="0"/>
+                <w:szCs w:val="22"/>
+                <w:lang w:eastAsia="it-IT"/>
+                <w14:ligatures w14:val="none"/>
+              </w:rPr>
+              <w:t>02.01.03</w:t>
+            </w:r>
+          </w:p>
+        </w:tc>
+        <w:tc>
+          <w:tcPr>
+            <w:tcW w:w="6160" w:type="dxa"/>
+            <w:tcBorders>
+              <w:left w:val="single" w:sz="4" w:space="0" w:color="auto"/>
+            </w:tcBorders>
+            <w:noWrap/>
+            <w:vAlign w:val="bottom"/>
+            <w:hideMark/>
+          </w:tcPr>
+          <w:p>
+            <w:pPr>
+              <w:spacing w:before="0" w:after="0"/>
+              <w:contextualSpacing w:val="0"/>
+              <w:rPr>
+                <w:rFonts w:ascii="Calibri" w:eastAsia="Times New Roman" w:hAnsi="Calibri" w:cs="Calibri"/>
+                <w:color w:val="000000"/>
+                <w:kern w:val="0"/>
+                <w:szCs w:val="22"/>
+                <w:lang w:eastAsia="it-IT"/>
+                <w14:ligatures w14:val="none"/>
+              </w:rPr>
+            </w:pPr>
+            <w:r>
+              <w:rPr>
+                <w:rFonts w:ascii="Calibri" w:eastAsia="Times New Roman" w:hAnsi="Calibri" w:cs="Calibri"/>
+                <w:color w:val="000000"/>
+                <w:kern w:val="0"/>
+                <w:szCs w:val="22"/>
+                <w:lang w:eastAsia="it-IT"/>
+                <w14:ligatures w14:val="none"/>
+              </w:rPr>
+              <w:t>Revisione e/o bollo</w:t>
+            </w:r>
+          </w:p>
+        </w:tc>
+      </w:tr>
+      <w:tr>
+        <w:trPr>
+          <w:trHeight w:val="300"/>
+        </w:trPr>
+        <w:tc>
+          <w:tcPr>
+            <w:tcW w:w="480" w:type="dxa"/>
+            <w:tcBorders>
+              <w:top w:val="nil"/>
+              <w:bottom w:val="single" w:sz="4" w:space="0" w:color="auto"/>
+              <w:right w:val="single" w:sz="4" w:space="0" w:color="auto"/>
+            </w:tcBorders>
+            <w:noWrap/>
+            <w:vAlign w:val="bottom"/>
+            <w:hideMark/>
+          </w:tcPr>
+          <w:p>
+            <w:pPr>
+              <w:spacing w:before="0" w:after="0"/>
+              <w:contextualSpacing w:val="0"/>
+              <w:rPr>
+                <w:rFonts w:ascii="Calibri" w:eastAsia="Times New Roman" w:hAnsi="Calibri" w:cs="Calibri"/>
+                <w:color w:val="000000"/>
+                <w:kern w:val="0"/>
+                <w:szCs w:val="22"/>
+                <w:lang w:eastAsia="it-IT"/>
+                <w14:ligatures w14:val="none"/>
+              </w:rPr>
+            </w:pPr>
+          </w:p>
+        </w:tc>
+        <w:tc>
+          <w:tcPr>
+            <w:tcW w:w="580" w:type="dxa"/>
+            <w:tcBorders>
+              <w:top w:val="nil"/>
+              <w:left w:val="single" w:sz="4" w:space="0" w:color="auto"/>
+              <w:bottom w:val="single" w:sz="4" w:space="0" w:color="auto"/>
+              <w:right w:val="single" w:sz="4" w:space="0" w:color="auto"/>
+            </w:tcBorders>
+            <w:noWrap/>
+            <w:vAlign w:val="bottom"/>
+            <w:hideMark/>
+          </w:tcPr>
+          <w:p>
+            <w:pPr>
+              <w:spacing w:before="0" w:after="0"/>
+              <w:contextualSpacing w:val="0"/>
+              <w:rPr>
+                <w:rFonts w:ascii="Times New Roman" w:eastAsia="Times New Roman" w:hAnsi="Times New Roman" w:cs="Times New Roman"/>
+                <w:kern w:val="0"/>
+                <w:sz w:val="20"/>
+                <w:szCs w:val="20"/>
+                <w:lang w:eastAsia="it-IT"/>
+                <w14:ligatures w14:val="none"/>
+              </w:rPr>
+            </w:pPr>
+          </w:p>
+        </w:tc>
+        <w:tc>
+          <w:tcPr>
+            <w:tcW w:w="860" w:type="dxa"/>
+            <w:tcBorders>
+              <w:top w:val="nil"/>
+              <w:left w:val="single" w:sz="4" w:space="0" w:color="auto"/>
+              <w:bottom w:val="single" w:sz="4" w:space="0" w:color="auto"/>
+              <w:right w:val="single" w:sz="4" w:space="0" w:color="auto"/>
+            </w:tcBorders>
+            <w:noWrap/>
+            <w:vAlign w:val="bottom"/>
+            <w:hideMark/>
+          </w:tcPr>
+          <w:p>
+            <w:pPr>
+              <w:spacing w:before="0" w:after="0"/>
+              <w:contextualSpacing w:val="0"/>
+              <w:rPr>
+                <w:rFonts w:ascii="Calibri" w:eastAsia="Times New Roman" w:hAnsi="Calibri" w:cs="Calibri"/>
+                <w:color w:val="000000"/>
+                <w:kern w:val="0"/>
+                <w:szCs w:val="22"/>
+                <w:lang w:eastAsia="it-IT"/>
+                <w14:ligatures w14:val="none"/>
+              </w:rPr>
+            </w:pPr>
+            <w:r>
+              <w:rPr>
+                <w:rFonts w:ascii="Calibri" w:eastAsia="Times New Roman" w:hAnsi="Calibri" w:cs="Calibri"/>
+                <w:color w:val="000000"/>
+                <w:kern w:val="0"/>
+                <w:szCs w:val="22"/>
+                <w:lang w:eastAsia="it-IT"/>
+                <w14:ligatures w14:val="none"/>
+              </w:rPr>
+              <w:t>02.01.04</w:t>
+            </w:r>
+          </w:p>
+        </w:tc>
+        <w:tc>
+          <w:tcPr>
+            <w:tcW w:w="6160" w:type="dxa"/>
+            <w:tcBorders>
+              <w:left w:val="single" w:sz="4" w:space="0" w:color="auto"/>
+            </w:tcBorders>
+            <w:noWrap/>
+            <w:vAlign w:val="bottom"/>
+            <w:hideMark/>
+          </w:tcPr>
+          <w:p>
+            <w:pPr>
+              <w:spacing w:before="0" w:after="0"/>
+              <w:contextualSpacing w:val="0"/>
+              <w:rPr>
+                <w:rFonts w:ascii="Calibri" w:eastAsia="Times New Roman" w:hAnsi="Calibri" w:cs="Calibri"/>
+                <w:color w:val="000000"/>
+                <w:kern w:val="0"/>
+                <w:szCs w:val="22"/>
+                <w:lang w:eastAsia="it-IT"/>
+                <w14:ligatures w14:val="none"/>
+              </w:rPr>
+            </w:pPr>
+            <w:r>
+              <w:rPr>
+                <w:rFonts w:ascii="Calibri" w:eastAsia="Times New Roman" w:hAnsi="Calibri" w:cs="Calibri"/>
+                <w:color w:val="000000"/>
+                <w:kern w:val="0"/>
+                <w:szCs w:val="22"/>
+                <w:lang w:eastAsia="it-IT"/>
+                <w14:ligatures w14:val="none"/>
+              </w:rPr>
+              <w:t>tagliando</w:t>
+            </w:r>
+          </w:p>
+        </w:tc>
+      </w:tr>
+    </w:tbl>
+    <w:p>
+      <w:r>
+        <w:tab/>
+        <w:t>Etc …</w:t>
+      </w:r>
+    </w:p>
+    <w:p/>
+    <w:p>
+      <w:r>
+        <w:t>Questa funzione è presente all’interno del visualizzatore di codici statistici cliccando sul Tab (1) “Import”, vedi esempio:</w:t>
+      </w:r>
+    </w:p>
+    <w:p>
+      <w:pPr>
+        <w:pStyle w:val="immagine"/>
+      </w:pPr>
+      <w:r>
+        <w:drawing>
+          <wp:inline distT="0" distB="0" distL="0" distR="0" wp14:anchorId="56B64A87" wp14:editId="461E6448">
+            <wp:extent cx="6115050" cy="2105025"/>
+            <wp:effectExtent l="0" t="0" r="0" b="9525"/>
+            <wp:docPr id="950925996" name="Immagine 1"/>
+            <wp:cNvGraphicFramePr>
+              <a:graphicFrameLocks xmlns:a="http://schemas.openxmlformats.org/drawingml/2006/main" noChangeAspect="1"/>
+            </wp:cNvGraphicFramePr>
+            <a:graphic xmlns:a="http://schemas.openxmlformats.org/drawingml/2006/main">
+              <a:graphicData uri="http://schemas.openxmlformats.org/drawingml/2006/picture">
+                <pic:pic xmlns:pic="http://schemas.openxmlformats.org/drawingml/2006/picture">
+                  <pic:nvPicPr>
+                    <pic:cNvPr id="0" name="Picture 1"/>
+                    <pic:cNvPicPr>
+                      <a:picLocks noChangeAspect="1" noChangeArrowheads="1"/>
+                    </pic:cNvPicPr>
+                  </pic:nvPicPr>
+                  <pic:blipFill>
+                    <a:blip r:embed="rId28">
+                      <a:extLst>
+                        <a:ext uri="{28A0092B-C50C-407E-A947-70E740481C1C}">
+                          <a14:useLocalDpi xmlns:a14="http://schemas.microsoft.com/office/drawing/2010/main" val="0"/>
+                        </a:ext>
+                      </a:extLst>
+                    </a:blip>
+                    <a:srcRect/>
+                    <a:stretch>
+                      <a:fillRect/>
+                    </a:stretch>
+                  </pic:blipFill>
+                  <pic:spPr bwMode="auto">
+                    <a:xfrm>
+                      <a:off x="0" y="0"/>
+                      <a:ext cx="6115050" cy="2105025"/>
+                    </a:xfrm>
+                    <a:prstGeom prst="rect">
+                      <a:avLst/>
+                    </a:prstGeom>
+                    <a:noFill/>
+                    <a:ln>
+                      <a:noFill/>
+                    </a:ln>
+                  </pic:spPr>
+                </pic:pic>
+              </a:graphicData>
+            </a:graphic>
+          </wp:inline>
+        </w:drawing>
+      </w:r>
+    </w:p>
+    <w:p>
+      <w:r>
+        <w:t>Dopo aver completato la redazione dei nostri codici statistici e salvato il foglio Excel in un direttorio a piacere: possiamo selezionarlo con BANCA cliccando sul bottone “Cerca…” dopo di ché possiamo eseguire l’</w:t>
+      </w:r>
+      <w:r>
+        <w:rPr>
+          <w:b/>
+        </w:rPr>
+        <w:t>import</w:t>
+      </w:r>
+      <w:r>
+        <w:t xml:space="preserve"> cliccando sul bottone (2) “import” (che diventerà abilitato dopo aver selezionato il file).</w:t>
+      </w:r>
+    </w:p>
+    <w:p>
+      <w:r>
+        <w:t>Verranno emessi dei messaggi di warning se il programma rileva che esistono già delle assegnazioni di codici. E’ vostra scelta, a questo punto, interrompere oppure proseguire.</w:t>
+      </w:r>
+    </w:p>
+    <w:p>
+      <w:pPr>
+        <w:pStyle w:val="Titolo1"/>
+      </w:pPr>
+      <w:bookmarkStart w:id="13" w:name="_Toc225612087"/>
       <w:r>
         <w:lastRenderedPageBreak/>
         <w:t>Indovina Codici Statistici</w:t>
       </w:r>
-      <w:bookmarkEnd w:id="10"/>
+      <w:bookmarkEnd w:id="13"/>
     </w:p>
     <w:p>
       <w:pPr>
         <w:pStyle w:val="Titolo2"/>
       </w:pPr>
-      <w:bookmarkStart w:id="11" w:name="_Toc189322905"/>
+      <w:bookmarkStart w:id="14" w:name="_Toc225612088"/>
       <w:r>
         <w:t>Ricerca Codici Statistici in base alla descrizione</w:t>
       </w:r>
-      <w:bookmarkEnd w:id="11"/>
+      <w:bookmarkEnd w:id="14"/>
     </w:p>
     <w:p>
       <w:r>
@@ -3365,11 +5396,11 @@
       <w:r>
         <w:t xml:space="preserve"> (</w:t>
       </w:r>
-      <w:bookmarkStart w:id="12" w:name="_Hlk189320140"/>
+      <w:bookmarkStart w:id="15" w:name="_Hlk189320140"/>
       <w:r>
         <w:t>CdSt</w:t>
       </w:r>
-      <w:bookmarkEnd w:id="12"/>
+      <w:bookmarkEnd w:id="15"/>
       <w:r>
         <w:t xml:space="preserve">) utilizza algoritmi dell’intelligenza artificiale (AI) della branca specifica della LLM (Large Language Model). In particolare, qui, viene utilizzato per </w:t>
       </w:r>
@@ -3517,7 +5548,7 @@
                     </pic:cNvPicPr>
                   </pic:nvPicPr>
                   <pic:blipFill>
-                    <a:blip r:embed="rId27">
+                    <a:blip r:embed="rId29">
                       <a:extLst>
                         <a:ext uri="{28A0092B-C50C-407E-A947-70E740481C1C}">
                           <a14:useLocalDpi xmlns:a14="http://schemas.microsoft.com/office/drawing/2010/main" val="0"/>
@@ -3601,7 +5632,7 @@
                     <pic:cNvPicPr/>
                   </pic:nvPicPr>
                   <pic:blipFill>
-                    <a:blip r:embed="rId28"/>
+                    <a:blip r:embed="rId30"/>
                     <a:stretch>
                       <a:fillRect/>
                     </a:stretch>
@@ -3631,12 +5662,12 @@
       <w:pPr>
         <w:pStyle w:val="Titolo2"/>
       </w:pPr>
-      <w:bookmarkStart w:id="13" w:name="_Toc189322906"/>
+      <w:bookmarkStart w:id="16" w:name="_Toc225612089"/>
       <w:r>
         <w:lastRenderedPageBreak/>
         <w:t>Assegnazioni particolari</w:t>
       </w:r>
-      <w:bookmarkEnd w:id="13"/>
+      <w:bookmarkEnd w:id="16"/>
     </w:p>
     <w:p>
       <w:r>
@@ -3684,7 +5715,7 @@
                     <pic:cNvPicPr/>
                   </pic:nvPicPr>
                   <pic:blipFill>
-                    <a:blip r:embed="rId29"/>
+                    <a:blip r:embed="rId31"/>
                     <a:stretch>
                       <a:fillRect/>
                     </a:stretch>
@@ -3740,7 +5771,7 @@
                     </pic:cNvPicPr>
                   </pic:nvPicPr>
                   <pic:blipFill>
-                    <a:blip r:embed="rId30">
+                    <a:blip r:embed="rId32">
                       <a:extLst>
                         <a:ext uri="{28A0092B-C50C-407E-A947-70E740481C1C}">
                           <a14:useLocalDpi xmlns:a14="http://schemas.microsoft.com/office/drawing/2010/main" val="0"/>
@@ -3808,7 +5839,7 @@
                     </pic:cNvPicPr>
                   </pic:nvPicPr>
                   <pic:blipFill>
-                    <a:blip r:embed="rId31">
+                    <a:blip r:embed="rId33">
                       <a:extLst>
                         <a:ext uri="{28A0092B-C50C-407E-A947-70E740481C1C}">
                           <a14:useLocalDpi xmlns:a14="http://schemas.microsoft.com/office/drawing/2010/main" val="0"/>
@@ -3884,7 +5915,7 @@
     <w:p/>
     <w:p/>
     <w:sectPr>
-      <w:footerReference w:type="default" r:id="rId32"/>
+      <w:footerReference w:type="default" r:id="rId34"/>
       <w:pgSz w:w="11906" w:h="16838"/>
       <w:pgMar w:top="1417" w:right="1134" w:bottom="1134" w:left="1134" w:header="708" w:footer="708" w:gutter="0"/>
       <w:cols w:space="708"/>
@@ -3895,7 +5926,7 @@
 </file>
 
 <file path=word/endnotes.xml><?xml version="1.0" encoding="utf-8"?>
-<w:endnotes xmlns:wpc="http://schemas.microsoft.com/office/word/2010/wordprocessingCanvas" xmlns:cx="http://schemas.microsoft.com/office/drawing/2014/chartex" xmlns:cx1="http://schemas.microsoft.com/office/drawing/2015/9/8/chartex" xmlns:cx2="http://schemas.microsoft.com/office/drawing/2015/10/21/chartex" xmlns:cx3="http://schemas.microsoft.com/office/drawing/2016/5/9/chartex" xmlns:cx4="http://schemas.microsoft.com/office/drawing/2016/5/10/chartex" xmlns:cx5="http://schemas.microsoft.com/office/drawing/2016/5/11/chartex" xmlns:cx6="http://schemas.microsoft.com/office/drawing/2016/5/12/chartex" xmlns:cx7="http://schemas.microsoft.com/office/drawing/2016/5/13/chartex" xmlns:cx8="http://schemas.microsoft.com/office/drawing/2016/5/14/chartex" xmlns:mc="http://schemas.openxmlformats.org/markup-compatibility/2006" xmlns:aink="http://schemas.microsoft.com/office/drawing/2016/ink" xmlns:am3d="http://schemas.microsoft.com/office/drawing/2017/model3d" xmlns:o="urn:schemas-microsoft-com:office:office" xmlns:oel="http://schemas.microsoft.com/office/2019/extlst" xmlns:r="http://schemas.openxmlformats.org/officeDocument/2006/relationships" xmlns:m="http://schemas.openxmlformats.org/officeDocument/2006/math" xmlns:v="urn:schemas-microsoft-com:vml" xmlns:wp14="http://schemas.microsoft.com/office/word/2010/wordprocessingDrawing" xmlns:wp="http://schemas.openxmlformats.org/drawingml/2006/wordprocessingDrawing" xmlns:w10="urn:schemas-microsoft-com:office:word" xmlns:w="http://schemas.openxmlformats.org/wordprocessingml/2006/main" xmlns:w14="http://schemas.microsoft.com/office/word/2010/wordml" xmlns:w15="http://schemas.microsoft.com/office/word/2012/wordml" xmlns:w16cex="http://schemas.microsoft.com/office/word/2018/wordml/cex" xmlns:w16cid="http://schemas.microsoft.com/office/word/2016/wordml/cid" xmlns:w16="http://schemas.microsoft.com/office/word/2018/wordml" xmlns:w16du="http://schemas.microsoft.com/office/word/2023/wordml/word16du" xmlns:w16sdtdh="http://schemas.microsoft.com/office/word/2020/wordml/sdtdatahash" xmlns:w16sdtfl="http://schemas.microsoft.com/office/word/2024/wordml/sdtformatlock" xmlns:w16se="http://schemas.microsoft.com/office/word/2015/wordml/symex" xmlns:wpg="http://schemas.microsoft.com/office/word/2010/wordprocessingGroup" xmlns:wpi="http://schemas.microsoft.com/office/word/2010/wordprocessingInk" xmlns:wne="http://schemas.microsoft.com/office/word/2006/wordml" xmlns:wps="http://schemas.microsoft.com/office/word/2010/wordprocessingShape" mc:Ignorable="w14 w15 w16se w16cid w16 w16cex w16sdtdh w16sdtfl w16du wp14">
+<w:endnotes xmlns:wpc="http://schemas.microsoft.com/office/word/2010/wordprocessingCanvas" xmlns:cx="http://schemas.microsoft.com/office/drawing/2014/chartex" xmlns:cx1="http://schemas.microsoft.com/office/drawing/2015/9/8/chartex" xmlns:cx2="http://schemas.microsoft.com/office/drawing/2015/10/21/chartex" xmlns:cx3="http://schemas.microsoft.com/office/drawing/2016/5/9/chartex" xmlns:cx4="http://schemas.microsoft.com/office/drawing/2016/5/10/chartex" xmlns:cx5="http://schemas.microsoft.com/office/drawing/2016/5/11/chartex" xmlns:cx6="http://schemas.microsoft.com/office/drawing/2016/5/12/chartex" xmlns:cx7="http://schemas.microsoft.com/office/drawing/2016/5/13/chartex" xmlns:cx8="http://schemas.microsoft.com/office/drawing/2016/5/14/chartex" xmlns:mc="http://schemas.openxmlformats.org/markup-compatibility/2006" xmlns:aink="http://schemas.microsoft.com/office/drawing/2016/ink" xmlns:am3d="http://schemas.microsoft.com/office/drawing/2017/model3d" xmlns:o="urn:schemas-microsoft-com:office:office" xmlns:oel="http://schemas.microsoft.com/office/2019/extlst" xmlns:r="http://schemas.openxmlformats.org/officeDocument/2006/relationships" xmlns:m="http://schemas.openxmlformats.org/officeDocument/2006/math" xmlns:v="urn:schemas-microsoft-com:vml" xmlns:wp14="http://schemas.microsoft.com/office/word/2010/wordprocessingDrawing" xmlns:wp="http://schemas.openxmlformats.org/drawingml/2006/wordprocessingDrawing" xmlns:w10="urn:schemas-microsoft-com:office:word" xmlns:w="http://schemas.openxmlformats.org/wordprocessingml/2006/main" xmlns:w14="http://schemas.microsoft.com/office/word/2010/wordml" xmlns:w15="http://schemas.microsoft.com/office/word/2012/wordml" xmlns:w16cex="http://schemas.microsoft.com/office/word/2018/wordml/cex" xmlns:w16cid="http://schemas.microsoft.com/office/word/2016/wordml/cid" xmlns:w16="http://schemas.microsoft.com/office/word/2018/wordml" xmlns:w16sdtdh="http://schemas.microsoft.com/office/word/2020/wordml/sdtdatahash" xmlns:w16se="http://schemas.microsoft.com/office/word/2015/wordml/symex" xmlns:wpg="http://schemas.microsoft.com/office/word/2010/wordprocessingGroup" xmlns:wpi="http://schemas.microsoft.com/office/word/2010/wordprocessingInk" xmlns:wne="http://schemas.microsoft.com/office/word/2006/wordml" xmlns:wps="http://schemas.microsoft.com/office/word/2010/wordprocessingShape" mc:Ignorable="w14 w15 w16se w16cid w16 w16cex w16sdtdh wp14">
   <w:endnote w:type="separator" w:id="-1">
     <w:p>
       <w:pPr>
@@ -3920,7 +5951,7 @@
 </file>
 
 <file path=word/footer1.xml><?xml version="1.0" encoding="utf-8"?>
-<w:ftr xmlns:wpc="http://schemas.microsoft.com/office/word/2010/wordprocessingCanvas" xmlns:cx="http://schemas.microsoft.com/office/drawing/2014/chartex" xmlns:cx1="http://schemas.microsoft.com/office/drawing/2015/9/8/chartex" xmlns:cx2="http://schemas.microsoft.com/office/drawing/2015/10/21/chartex" xmlns:cx3="http://schemas.microsoft.com/office/drawing/2016/5/9/chartex" xmlns:cx4="http://schemas.microsoft.com/office/drawing/2016/5/10/chartex" xmlns:cx5="http://schemas.microsoft.com/office/drawing/2016/5/11/chartex" xmlns:cx6="http://schemas.microsoft.com/office/drawing/2016/5/12/chartex" xmlns:cx7="http://schemas.microsoft.com/office/drawing/2016/5/13/chartex" xmlns:cx8="http://schemas.microsoft.com/office/drawing/2016/5/14/chartex" xmlns:mc="http://schemas.openxmlformats.org/markup-compatibility/2006" xmlns:aink="http://schemas.microsoft.com/office/drawing/2016/ink" xmlns:am3d="http://schemas.microsoft.com/office/drawing/2017/model3d" xmlns:o="urn:schemas-microsoft-com:office:office" xmlns:oel="http://schemas.microsoft.com/office/2019/extlst" xmlns:r="http://schemas.openxmlformats.org/officeDocument/2006/relationships" xmlns:m="http://schemas.openxmlformats.org/officeDocument/2006/math" xmlns:v="urn:schemas-microsoft-com:vml" xmlns:wp14="http://schemas.microsoft.com/office/word/2010/wordprocessingDrawing" xmlns:wp="http://schemas.openxmlformats.org/drawingml/2006/wordprocessingDrawing" xmlns:w10="urn:schemas-microsoft-com:office:word" xmlns:w="http://schemas.openxmlformats.org/wordprocessingml/2006/main" xmlns:w14="http://schemas.microsoft.com/office/word/2010/wordml" xmlns:w15="http://schemas.microsoft.com/office/word/2012/wordml" xmlns:w16cex="http://schemas.microsoft.com/office/word/2018/wordml/cex" xmlns:w16cid="http://schemas.microsoft.com/office/word/2016/wordml/cid" xmlns:w16="http://schemas.microsoft.com/office/word/2018/wordml" xmlns:w16du="http://schemas.microsoft.com/office/word/2023/wordml/word16du" xmlns:w16sdtdh="http://schemas.microsoft.com/office/word/2020/wordml/sdtdatahash" xmlns:w16sdtfl="http://schemas.microsoft.com/office/word/2024/wordml/sdtformatlock" xmlns:w16se="http://schemas.microsoft.com/office/word/2015/wordml/symex" xmlns:wpg="http://schemas.microsoft.com/office/word/2010/wordprocessingGroup" xmlns:wpi="http://schemas.microsoft.com/office/word/2010/wordprocessingInk" xmlns:wne="http://schemas.microsoft.com/office/word/2006/wordml" xmlns:wps="http://schemas.microsoft.com/office/word/2010/wordprocessingShape" mc:Ignorable="w14 w15 w16se w16cid w16 w16cex w16sdtdh w16sdtfl w16du wp14">
+<w:ftr xmlns:wpc="http://schemas.microsoft.com/office/word/2010/wordprocessingCanvas" xmlns:cx="http://schemas.microsoft.com/office/drawing/2014/chartex" xmlns:cx1="http://schemas.microsoft.com/office/drawing/2015/9/8/chartex" xmlns:cx2="http://schemas.microsoft.com/office/drawing/2015/10/21/chartex" xmlns:cx3="http://schemas.microsoft.com/office/drawing/2016/5/9/chartex" xmlns:cx4="http://schemas.microsoft.com/office/drawing/2016/5/10/chartex" xmlns:cx5="http://schemas.microsoft.com/office/drawing/2016/5/11/chartex" xmlns:cx6="http://schemas.microsoft.com/office/drawing/2016/5/12/chartex" xmlns:cx7="http://schemas.microsoft.com/office/drawing/2016/5/13/chartex" xmlns:cx8="http://schemas.microsoft.com/office/drawing/2016/5/14/chartex" xmlns:mc="http://schemas.openxmlformats.org/markup-compatibility/2006" xmlns:aink="http://schemas.microsoft.com/office/drawing/2016/ink" xmlns:am3d="http://schemas.microsoft.com/office/drawing/2017/model3d" xmlns:o="urn:schemas-microsoft-com:office:office" xmlns:oel="http://schemas.microsoft.com/office/2019/extlst" xmlns:r="http://schemas.openxmlformats.org/officeDocument/2006/relationships" xmlns:m="http://schemas.openxmlformats.org/officeDocument/2006/math" xmlns:v="urn:schemas-microsoft-com:vml" xmlns:wp14="http://schemas.microsoft.com/office/word/2010/wordprocessingDrawing" xmlns:wp="http://schemas.openxmlformats.org/drawingml/2006/wordprocessingDrawing" xmlns:w10="urn:schemas-microsoft-com:office:word" xmlns:w="http://schemas.openxmlformats.org/wordprocessingml/2006/main" xmlns:w14="http://schemas.microsoft.com/office/word/2010/wordml" xmlns:w15="http://schemas.microsoft.com/office/word/2012/wordml" xmlns:w16cex="http://schemas.microsoft.com/office/word/2018/wordml/cex" xmlns:w16cid="http://schemas.microsoft.com/office/word/2016/wordml/cid" xmlns:w16="http://schemas.microsoft.com/office/word/2018/wordml" xmlns:w16sdtdh="http://schemas.microsoft.com/office/word/2020/wordml/sdtdatahash" xmlns:w16se="http://schemas.microsoft.com/office/word/2015/wordml/symex" xmlns:wpg="http://schemas.microsoft.com/office/word/2010/wordprocessingGroup" xmlns:wpi="http://schemas.microsoft.com/office/word/2010/wordprocessingInk" xmlns:wne="http://schemas.microsoft.com/office/word/2006/wordml" xmlns:wps="http://schemas.microsoft.com/office/word/2010/wordprocessingShape" mc:Ignorable="w14 w15 w16se w16cid w16 w16cex w16sdtdh wp14">
   <w:p>
     <w:pPr>
       <w:rPr>
@@ -4027,7 +6058,7 @@
 </file>
 
 <file path=word/footnotes.xml><?xml version="1.0" encoding="utf-8"?>
-<w:footnotes xmlns:wpc="http://schemas.microsoft.com/office/word/2010/wordprocessingCanvas" xmlns:cx="http://schemas.microsoft.com/office/drawing/2014/chartex" xmlns:cx1="http://schemas.microsoft.com/office/drawing/2015/9/8/chartex" xmlns:cx2="http://schemas.microsoft.com/office/drawing/2015/10/21/chartex" xmlns:cx3="http://schemas.microsoft.com/office/drawing/2016/5/9/chartex" xmlns:cx4="http://schemas.microsoft.com/office/drawing/2016/5/10/chartex" xmlns:cx5="http://schemas.microsoft.com/office/drawing/2016/5/11/chartex" xmlns:cx6="http://schemas.microsoft.com/office/drawing/2016/5/12/chartex" xmlns:cx7="http://schemas.microsoft.com/office/drawing/2016/5/13/chartex" xmlns:cx8="http://schemas.microsoft.com/office/drawing/2016/5/14/chartex" xmlns:mc="http://schemas.openxmlformats.org/markup-compatibility/2006" xmlns:aink="http://schemas.microsoft.com/office/drawing/2016/ink" xmlns:am3d="http://schemas.microsoft.com/office/drawing/2017/model3d" xmlns:o="urn:schemas-microsoft-com:office:office" xmlns:oel="http://schemas.microsoft.com/office/2019/extlst" xmlns:r="http://schemas.openxmlformats.org/officeDocument/2006/relationships" xmlns:m="http://schemas.openxmlformats.org/officeDocument/2006/math" xmlns:v="urn:schemas-microsoft-com:vml" xmlns:wp14="http://schemas.microsoft.com/office/word/2010/wordprocessingDrawing" xmlns:wp="http://schemas.openxmlformats.org/drawingml/2006/wordprocessingDrawing" xmlns:w10="urn:schemas-microsoft-com:office:word" xmlns:w="http://schemas.openxmlformats.org/wordprocessingml/2006/main" xmlns:w14="http://schemas.microsoft.com/office/word/2010/wordml" xmlns:w15="http://schemas.microsoft.com/office/word/2012/wordml" xmlns:w16cex="http://schemas.microsoft.com/office/word/2018/wordml/cex" xmlns:w16cid="http://schemas.microsoft.com/office/word/2016/wordml/cid" xmlns:w16="http://schemas.microsoft.com/office/word/2018/wordml" xmlns:w16du="http://schemas.microsoft.com/office/word/2023/wordml/word16du" xmlns:w16sdtdh="http://schemas.microsoft.com/office/word/2020/wordml/sdtdatahash" xmlns:w16sdtfl="http://schemas.microsoft.com/office/word/2024/wordml/sdtformatlock" xmlns:w16se="http://schemas.microsoft.com/office/word/2015/wordml/symex" xmlns:wpg="http://schemas.microsoft.com/office/word/2010/wordprocessingGroup" xmlns:wpi="http://schemas.microsoft.com/office/word/2010/wordprocessingInk" xmlns:wne="http://schemas.microsoft.com/office/word/2006/wordml" xmlns:wps="http://schemas.microsoft.com/office/word/2010/wordprocessingShape" mc:Ignorable="w14 w15 w16se w16cid w16 w16cex w16sdtdh w16sdtfl w16du wp14">
+<w:footnotes xmlns:wpc="http://schemas.microsoft.com/office/word/2010/wordprocessingCanvas" xmlns:cx="http://schemas.microsoft.com/office/drawing/2014/chartex" xmlns:cx1="http://schemas.microsoft.com/office/drawing/2015/9/8/chartex" xmlns:cx2="http://schemas.microsoft.com/office/drawing/2015/10/21/chartex" xmlns:cx3="http://schemas.microsoft.com/office/drawing/2016/5/9/chartex" xmlns:cx4="http://schemas.microsoft.com/office/drawing/2016/5/10/chartex" xmlns:cx5="http://schemas.microsoft.com/office/drawing/2016/5/11/chartex" xmlns:cx6="http://schemas.microsoft.com/office/drawing/2016/5/12/chartex" xmlns:cx7="http://schemas.microsoft.com/office/drawing/2016/5/13/chartex" xmlns:cx8="http://schemas.microsoft.com/office/drawing/2016/5/14/chartex" xmlns:mc="http://schemas.openxmlformats.org/markup-compatibility/2006" xmlns:aink="http://schemas.microsoft.com/office/drawing/2016/ink" xmlns:am3d="http://schemas.microsoft.com/office/drawing/2017/model3d" xmlns:o="urn:schemas-microsoft-com:office:office" xmlns:oel="http://schemas.microsoft.com/office/2019/extlst" xmlns:r="http://schemas.openxmlformats.org/officeDocument/2006/relationships" xmlns:m="http://schemas.openxmlformats.org/officeDocument/2006/math" xmlns:v="urn:schemas-microsoft-com:vml" xmlns:wp14="http://schemas.microsoft.com/office/word/2010/wordprocessingDrawing" xmlns:wp="http://schemas.openxmlformats.org/drawingml/2006/wordprocessingDrawing" xmlns:w10="urn:schemas-microsoft-com:office:word" xmlns:w="http://schemas.openxmlformats.org/wordprocessingml/2006/main" xmlns:w14="http://schemas.microsoft.com/office/word/2010/wordml" xmlns:w15="http://schemas.microsoft.com/office/word/2012/wordml" xmlns:w16cex="http://schemas.microsoft.com/office/word/2018/wordml/cex" xmlns:w16cid="http://schemas.microsoft.com/office/word/2016/wordml/cid" xmlns:w16="http://schemas.microsoft.com/office/word/2018/wordml" xmlns:w16sdtdh="http://schemas.microsoft.com/office/word/2020/wordml/sdtdatahash" xmlns:w16se="http://schemas.microsoft.com/office/word/2015/wordml/symex" xmlns:wpg="http://schemas.microsoft.com/office/word/2010/wordprocessingGroup" xmlns:wpi="http://schemas.microsoft.com/office/word/2010/wordprocessingInk" xmlns:wne="http://schemas.microsoft.com/office/word/2006/wordml" xmlns:wps="http://schemas.microsoft.com/office/word/2010/wordprocessingShape" mc:Ignorable="w14 w15 w16se w16cid w16 w16cex w16sdtdh wp14">
   <w:footnote w:type="separator" w:id="-1">
     <w:p>
       <w:pPr>
@@ -4052,7 +6083,7 @@
 </file>
 
 <file path=word/numbering.xml><?xml version="1.0" encoding="utf-8"?>
-<w:numbering xmlns:wpc="http://schemas.microsoft.com/office/word/2010/wordprocessingCanvas" xmlns:cx="http://schemas.microsoft.com/office/drawing/2014/chartex" xmlns:cx1="http://schemas.microsoft.com/office/drawing/2015/9/8/chartex" xmlns:cx2="http://schemas.microsoft.com/office/drawing/2015/10/21/chartex" xmlns:cx3="http://schemas.microsoft.com/office/drawing/2016/5/9/chartex" xmlns:cx4="http://schemas.microsoft.com/office/drawing/2016/5/10/chartex" xmlns:cx5="http://schemas.microsoft.com/office/drawing/2016/5/11/chartex" xmlns:cx6="http://schemas.microsoft.com/office/drawing/2016/5/12/chartex" xmlns:cx7="http://schemas.microsoft.com/office/drawing/2016/5/13/chartex" xmlns:cx8="http://schemas.microsoft.com/office/drawing/2016/5/14/chartex" xmlns:mc="http://schemas.openxmlformats.org/markup-compatibility/2006" xmlns:aink="http://schemas.microsoft.com/office/drawing/2016/ink" xmlns:am3d="http://schemas.microsoft.com/office/drawing/2017/model3d" xmlns:o="urn:schemas-microsoft-com:office:office" xmlns:oel="http://schemas.microsoft.com/office/2019/extlst" xmlns:r="http://schemas.openxmlformats.org/officeDocument/2006/relationships" xmlns:m="http://schemas.openxmlformats.org/officeDocument/2006/math" xmlns:v="urn:schemas-microsoft-com:vml" xmlns:wp14="http://schemas.microsoft.com/office/word/2010/wordprocessingDrawing" xmlns:wp="http://schemas.openxmlformats.org/drawingml/2006/wordprocessingDrawing" xmlns:w10="urn:schemas-microsoft-com:office:word" xmlns:w="http://schemas.openxmlformats.org/wordprocessingml/2006/main" xmlns:w14="http://schemas.microsoft.com/office/word/2010/wordml" xmlns:w15="http://schemas.microsoft.com/office/word/2012/wordml" xmlns:w16cex="http://schemas.microsoft.com/office/word/2018/wordml/cex" xmlns:w16cid="http://schemas.microsoft.com/office/word/2016/wordml/cid" xmlns:w16="http://schemas.microsoft.com/office/word/2018/wordml" xmlns:w16du="http://schemas.microsoft.com/office/word/2023/wordml/word16du" xmlns:w16sdtdh="http://schemas.microsoft.com/office/word/2020/wordml/sdtdatahash" xmlns:w16sdtfl="http://schemas.microsoft.com/office/word/2024/wordml/sdtformatlock" xmlns:w16se="http://schemas.microsoft.com/office/word/2015/wordml/symex" xmlns:wpg="http://schemas.microsoft.com/office/word/2010/wordprocessingGroup" xmlns:wpi="http://schemas.microsoft.com/office/word/2010/wordprocessingInk" xmlns:wne="http://schemas.microsoft.com/office/word/2006/wordml" xmlns:wps="http://schemas.microsoft.com/office/word/2010/wordprocessingShape" mc:Ignorable="w14 w15 w16se w16cid w16 w16cex w16sdtdh w16sdtfl w16du wp14">
+<w:numbering xmlns:wpc="http://schemas.microsoft.com/office/word/2010/wordprocessingCanvas" xmlns:cx="http://schemas.microsoft.com/office/drawing/2014/chartex" xmlns:cx1="http://schemas.microsoft.com/office/drawing/2015/9/8/chartex" xmlns:cx2="http://schemas.microsoft.com/office/drawing/2015/10/21/chartex" xmlns:cx3="http://schemas.microsoft.com/office/drawing/2016/5/9/chartex" xmlns:cx4="http://schemas.microsoft.com/office/drawing/2016/5/10/chartex" xmlns:cx5="http://schemas.microsoft.com/office/drawing/2016/5/11/chartex" xmlns:cx6="http://schemas.microsoft.com/office/drawing/2016/5/12/chartex" xmlns:cx7="http://schemas.microsoft.com/office/drawing/2016/5/13/chartex" xmlns:cx8="http://schemas.microsoft.com/office/drawing/2016/5/14/chartex" xmlns:mc="http://schemas.openxmlformats.org/markup-compatibility/2006" xmlns:aink="http://schemas.microsoft.com/office/drawing/2016/ink" xmlns:am3d="http://schemas.microsoft.com/office/drawing/2017/model3d" xmlns:o="urn:schemas-microsoft-com:office:office" xmlns:oel="http://schemas.microsoft.com/office/2019/extlst" xmlns:r="http://schemas.openxmlformats.org/officeDocument/2006/relationships" xmlns:m="http://schemas.openxmlformats.org/officeDocument/2006/math" xmlns:v="urn:schemas-microsoft-com:vml" xmlns:wp14="http://schemas.microsoft.com/office/word/2010/wordprocessingDrawing" xmlns:wp="http://schemas.openxmlformats.org/drawingml/2006/wordprocessingDrawing" xmlns:w10="urn:schemas-microsoft-com:office:word" xmlns:w="http://schemas.openxmlformats.org/wordprocessingml/2006/main" xmlns:w14="http://schemas.microsoft.com/office/word/2010/wordml" xmlns:w15="http://schemas.microsoft.com/office/word/2012/wordml" xmlns:w16cex="http://schemas.microsoft.com/office/word/2018/wordml/cex" xmlns:w16cid="http://schemas.microsoft.com/office/word/2016/wordml/cid" xmlns:w16="http://schemas.microsoft.com/office/word/2018/wordml" xmlns:w16sdtdh="http://schemas.microsoft.com/office/word/2020/wordml/sdtdatahash" xmlns:w16se="http://schemas.microsoft.com/office/word/2015/wordml/symex" xmlns:wpg="http://schemas.microsoft.com/office/word/2010/wordprocessingGroup" xmlns:wpi="http://schemas.microsoft.com/office/word/2010/wordprocessingInk" xmlns:wne="http://schemas.microsoft.com/office/word/2006/wordml" xmlns:wps="http://schemas.microsoft.com/office/word/2010/wordprocessingShape" mc:Ignorable="w14 w15 w16se w16cid w16 w16cex w16sdtdh wp14">
   <w:abstractNum w:abstractNumId="0" w15:restartNumberingAfterBreak="0">
     <w:nsid w:val="09134145"/>
     <w:multiLevelType w:val="hybridMultilevel"/>
@@ -4366,6 +6397,119 @@
     </w:lvl>
   </w:abstractNum>
   <w:abstractNum w:abstractNumId="3" w15:restartNumberingAfterBreak="0">
+    <w:nsid w:val="0EC54157"/>
+    <w:multiLevelType w:val="hybridMultilevel"/>
+    <w:tmpl w:val="DC6EEAD8"/>
+    <w:lvl w:ilvl="0" w:tplc="04100001">
+      <w:start w:val="1"/>
+      <w:numFmt w:val="bullet"/>
+      <w:lvlText w:val=""/>
+      <w:lvlJc w:val="left"/>
+      <w:pPr>
+        <w:ind w:left="720" w:hanging="360"/>
+      </w:pPr>
+      <w:rPr>
+        <w:rFonts w:ascii="Symbol" w:hAnsi="Symbol" w:hint="default"/>
+      </w:rPr>
+    </w:lvl>
+    <w:lvl w:ilvl="1" w:tplc="04100003" w:tentative="1">
+      <w:start w:val="1"/>
+      <w:numFmt w:val="bullet"/>
+      <w:lvlText w:val="o"/>
+      <w:lvlJc w:val="left"/>
+      <w:pPr>
+        <w:ind w:left="1440" w:hanging="360"/>
+      </w:pPr>
+      <w:rPr>
+        <w:rFonts w:ascii="Courier New" w:hAnsi="Courier New" w:cs="Courier New" w:hint="default"/>
+      </w:rPr>
+    </w:lvl>
+    <w:lvl w:ilvl="2" w:tplc="04100005" w:tentative="1">
+      <w:start w:val="1"/>
+      <w:numFmt w:val="bullet"/>
+      <w:lvlText w:val=""/>
+      <w:lvlJc w:val="left"/>
+      <w:pPr>
+        <w:ind w:left="2160" w:hanging="360"/>
+      </w:pPr>
+      <w:rPr>
+        <w:rFonts w:ascii="Wingdings" w:hAnsi="Wingdings" w:hint="default"/>
+      </w:rPr>
+    </w:lvl>
+    <w:lvl w:ilvl="3" w:tplc="04100001" w:tentative="1">
+      <w:start w:val="1"/>
+      <w:numFmt w:val="bullet"/>
+      <w:lvlText w:val=""/>
+      <w:lvlJc w:val="left"/>
+      <w:pPr>
+        <w:ind w:left="2880" w:hanging="360"/>
+      </w:pPr>
+      <w:rPr>
+        <w:rFonts w:ascii="Symbol" w:hAnsi="Symbol" w:hint="default"/>
+      </w:rPr>
+    </w:lvl>
+    <w:lvl w:ilvl="4" w:tplc="04100003" w:tentative="1">
+      <w:start w:val="1"/>
+      <w:numFmt w:val="bullet"/>
+      <w:lvlText w:val="o"/>
+      <w:lvlJc w:val="left"/>
+      <w:pPr>
+        <w:ind w:left="3600" w:hanging="360"/>
+      </w:pPr>
+      <w:rPr>
+        <w:rFonts w:ascii="Courier New" w:hAnsi="Courier New" w:cs="Courier New" w:hint="default"/>
+      </w:rPr>
+    </w:lvl>
+    <w:lvl w:ilvl="5" w:tplc="04100005" w:tentative="1">
+      <w:start w:val="1"/>
+      <w:numFmt w:val="bullet"/>
+      <w:lvlText w:val=""/>
+      <w:lvlJc w:val="left"/>
+      <w:pPr>
+        <w:ind w:left="4320" w:hanging="360"/>
+      </w:pPr>
+      <w:rPr>
+        <w:rFonts w:ascii="Wingdings" w:hAnsi="Wingdings" w:hint="default"/>
+      </w:rPr>
+    </w:lvl>
+    <w:lvl w:ilvl="6" w:tplc="04100001" w:tentative="1">
+      <w:start w:val="1"/>
+      <w:numFmt w:val="bullet"/>
+      <w:lvlText w:val=""/>
+      <w:lvlJc w:val="left"/>
+      <w:pPr>
+        <w:ind w:left="5040" w:hanging="360"/>
+      </w:pPr>
+      <w:rPr>
+        <w:rFonts w:ascii="Symbol" w:hAnsi="Symbol" w:hint="default"/>
+      </w:rPr>
+    </w:lvl>
+    <w:lvl w:ilvl="7" w:tplc="04100003" w:tentative="1">
+      <w:start w:val="1"/>
+      <w:numFmt w:val="bullet"/>
+      <w:lvlText w:val="o"/>
+      <w:lvlJc w:val="left"/>
+      <w:pPr>
+        <w:ind w:left="5760" w:hanging="360"/>
+      </w:pPr>
+      <w:rPr>
+        <w:rFonts w:ascii="Courier New" w:hAnsi="Courier New" w:cs="Courier New" w:hint="default"/>
+      </w:rPr>
+    </w:lvl>
+    <w:lvl w:ilvl="8" w:tplc="04100005" w:tentative="1">
+      <w:start w:val="1"/>
+      <w:numFmt w:val="bullet"/>
+      <w:lvlText w:val=""/>
+      <w:lvlJc w:val="left"/>
+      <w:pPr>
+        <w:ind w:left="6480" w:hanging="360"/>
+      </w:pPr>
+      <w:rPr>
+        <w:rFonts w:ascii="Wingdings" w:hAnsi="Wingdings" w:hint="default"/>
+      </w:rPr>
+    </w:lvl>
+  </w:abstractNum>
+  <w:abstractNum w:abstractNumId="4" w15:restartNumberingAfterBreak="0">
     <w:nsid w:val="11342EAF"/>
     <w:multiLevelType w:val="hybridMultilevel"/>
     <w:tmpl w:val="5FC8D1C8"/>
@@ -4478,7 +6622,7 @@
       </w:rPr>
     </w:lvl>
   </w:abstractNum>
-  <w:abstractNum w:abstractNumId="4" w15:restartNumberingAfterBreak="0">
+  <w:abstractNum w:abstractNumId="5" w15:restartNumberingAfterBreak="0">
     <w:nsid w:val="12A7350F"/>
     <w:multiLevelType w:val="hybridMultilevel"/>
     <w:tmpl w:val="756E8FD4"/>
@@ -4564,7 +6708,7 @@
       </w:pPr>
     </w:lvl>
   </w:abstractNum>
-  <w:abstractNum w:abstractNumId="5" w15:restartNumberingAfterBreak="0">
+  <w:abstractNum w:abstractNumId="6" w15:restartNumberingAfterBreak="0">
     <w:nsid w:val="1613185D"/>
     <w:multiLevelType w:val="hybridMultilevel"/>
     <w:tmpl w:val="4ECC7E7C"/>
@@ -4650,7 +6794,7 @@
       </w:pPr>
     </w:lvl>
   </w:abstractNum>
-  <w:abstractNum w:abstractNumId="6" w15:restartNumberingAfterBreak="0">
+  <w:abstractNum w:abstractNumId="7" w15:restartNumberingAfterBreak="0">
     <w:nsid w:val="26681B65"/>
     <w:multiLevelType w:val="hybridMultilevel"/>
     <w:tmpl w:val="4E40627E"/>
@@ -4736,7 +6880,7 @@
       </w:pPr>
     </w:lvl>
   </w:abstractNum>
-  <w:abstractNum w:abstractNumId="7" w15:restartNumberingAfterBreak="0">
+  <w:abstractNum w:abstractNumId="8" w15:restartNumberingAfterBreak="0">
     <w:nsid w:val="48C0307B"/>
     <w:multiLevelType w:val="multilevel"/>
     <w:tmpl w:val="0410001F"/>
@@ -4849,7 +6993,7 @@
       </w:rPr>
     </w:lvl>
   </w:abstractNum>
-  <w:abstractNum w:abstractNumId="8" w15:restartNumberingAfterBreak="0">
+  <w:abstractNum w:abstractNumId="9" w15:restartNumberingAfterBreak="0">
     <w:nsid w:val="584774CD"/>
     <w:multiLevelType w:val="hybridMultilevel"/>
     <w:tmpl w:val="565A52C6"/>
@@ -4962,7 +7106,7 @@
       </w:rPr>
     </w:lvl>
   </w:abstractNum>
-  <w:abstractNum w:abstractNumId="9" w15:restartNumberingAfterBreak="0">
+  <w:abstractNum w:abstractNumId="10" w15:restartNumberingAfterBreak="0">
     <w:nsid w:val="6A4937C0"/>
     <w:multiLevelType w:val="hybridMultilevel"/>
     <w:tmpl w:val="0644C842"/>
@@ -5048,7 +7192,7 @@
       </w:pPr>
     </w:lvl>
   </w:abstractNum>
-  <w:abstractNum w:abstractNumId="10" w15:restartNumberingAfterBreak="0">
+  <w:abstractNum w:abstractNumId="11" w15:restartNumberingAfterBreak="0">
     <w:nsid w:val="6DB20639"/>
     <w:multiLevelType w:val="hybridMultilevel"/>
     <w:tmpl w:val="F0441AB8"/>
@@ -5161,7 +7305,7 @@
       </w:rPr>
     </w:lvl>
   </w:abstractNum>
-  <w:abstractNum w:abstractNumId="11" w15:restartNumberingAfterBreak="0">
+  <w:abstractNum w:abstractNumId="12" w15:restartNumberingAfterBreak="0">
     <w:nsid w:val="73735300"/>
     <w:multiLevelType w:val="hybridMultilevel"/>
     <w:tmpl w:val="C39838EA"/>
@@ -5248,13 +7392,13 @@
     </w:lvl>
   </w:abstractNum>
   <w:num w:numId="1" w16cid:durableId="1729955839">
-    <w:abstractNumId w:val="9"/>
+    <w:abstractNumId w:val="10"/>
   </w:num>
   <w:num w:numId="2" w16cid:durableId="882208912">
-    <w:abstractNumId w:val="4"/>
+    <w:abstractNumId w:val="5"/>
   </w:num>
   <w:num w:numId="3" w16cid:durableId="2118325385">
-    <w:abstractNumId w:val="11"/>
+    <w:abstractNumId w:val="12"/>
   </w:num>
   <w:num w:numId="4" w16cid:durableId="1805810936">
     <w:abstractNumId w:val="0"/>
@@ -5263,31 +7407,34 @@
     <w:abstractNumId w:val="2"/>
   </w:num>
   <w:num w:numId="6" w16cid:durableId="72164194">
-    <w:abstractNumId w:val="6"/>
+    <w:abstractNumId w:val="7"/>
   </w:num>
   <w:num w:numId="7" w16cid:durableId="696850630">
-    <w:abstractNumId w:val="3"/>
+    <w:abstractNumId w:val="4"/>
   </w:num>
   <w:num w:numId="8" w16cid:durableId="633408106">
-    <w:abstractNumId w:val="7"/>
+    <w:abstractNumId w:val="8"/>
   </w:num>
   <w:num w:numId="9" w16cid:durableId="907686083">
-    <w:abstractNumId w:val="10"/>
+    <w:abstractNumId w:val="11"/>
   </w:num>
   <w:num w:numId="10" w16cid:durableId="1810248850">
     <w:abstractNumId w:val="1"/>
   </w:num>
   <w:num w:numId="11" w16cid:durableId="1048803791">
-    <w:abstractNumId w:val="8"/>
+    <w:abstractNumId w:val="9"/>
   </w:num>
   <w:num w:numId="12" w16cid:durableId="636256198">
-    <w:abstractNumId w:val="5"/>
+    <w:abstractNumId w:val="6"/>
+  </w:num>
+  <w:num w:numId="13" w16cid:durableId="1321613549">
+    <w:abstractNumId w:val="3"/>
   </w:num>
 </w:numbering>
 </file>
 
 <file path=word/styles.xml><?xml version="1.0" encoding="utf-8"?>
-<w:styles xmlns:mc="http://schemas.openxmlformats.org/markup-compatibility/2006" xmlns:r="http://schemas.openxmlformats.org/officeDocument/2006/relationships" xmlns:w="http://schemas.openxmlformats.org/wordprocessingml/2006/main" xmlns:w14="http://schemas.microsoft.com/office/word/2010/wordml" xmlns:w15="http://schemas.microsoft.com/office/word/2012/wordml" xmlns:w16cex="http://schemas.microsoft.com/office/word/2018/wordml/cex" xmlns:w16cid="http://schemas.microsoft.com/office/word/2016/wordml/cid" xmlns:w16="http://schemas.microsoft.com/office/word/2018/wordml" xmlns:w16du="http://schemas.microsoft.com/office/word/2023/wordml/word16du" xmlns:w16sdtdh="http://schemas.microsoft.com/office/word/2020/wordml/sdtdatahash" xmlns:w16sdtfl="http://schemas.microsoft.com/office/word/2024/wordml/sdtformatlock" xmlns:w16se="http://schemas.microsoft.com/office/word/2015/wordml/symex" mc:Ignorable="w14 w15 w16se w16cid w16 w16cex w16sdtdh w16sdtfl w16du">
+<w:styles xmlns:mc="http://schemas.openxmlformats.org/markup-compatibility/2006" xmlns:r="http://schemas.openxmlformats.org/officeDocument/2006/relationships" xmlns:w="http://schemas.openxmlformats.org/wordprocessingml/2006/main" xmlns:w14="http://schemas.microsoft.com/office/word/2010/wordml" xmlns:w15="http://schemas.microsoft.com/office/word/2012/wordml" xmlns:w16cex="http://schemas.microsoft.com/office/word/2018/wordml/cex" xmlns:w16cid="http://schemas.microsoft.com/office/word/2016/wordml/cid" xmlns:w16="http://schemas.microsoft.com/office/word/2018/wordml" xmlns:w16sdtdh="http://schemas.microsoft.com/office/word/2020/wordml/sdtdatahash" xmlns:w16se="http://schemas.microsoft.com/office/word/2015/wordml/symex" mc:Ignorable="w14 w15 w16se w16cid w16 w16cex w16sdtdh">
   <w:docDefaults>
     <w:rPrDefault>
       <w:rPr>
@@ -5740,6 +7887,27 @@
       <w:szCs w:val="26"/>
     </w:rPr>
   </w:style>
+  <w:style w:type="paragraph" w:styleId="Titolo3">
+    <w:name w:val="heading 3"/>
+    <w:basedOn w:val="Normale"/>
+    <w:next w:val="Normale"/>
+    <w:link w:val="Titolo3Carattere"/>
+    <w:uiPriority w:val="9"/>
+    <w:unhideWhenUsed/>
+    <w:qFormat/>
+    <w:rsid w:val="0076072E"/>
+    <w:pPr>
+      <w:keepNext/>
+      <w:keepLines/>
+      <w:spacing w:before="40" w:after="0"/>
+      <w:outlineLvl w:val="2"/>
+    </w:pPr>
+    <w:rPr>
+      <w:rFonts w:asciiTheme="majorHAnsi" w:eastAsiaTheme="majorEastAsia" w:hAnsiTheme="majorHAnsi" w:cstheme="majorBidi"/>
+      <w:color w:val="0A2F40" w:themeColor="accent1" w:themeShade="7F"/>
+      <w:sz w:val="24"/>
+    </w:rPr>
+  </w:style>
   <w:style w:type="character" w:default="1" w:styleId="Carpredefinitoparagrafo">
     <w:name w:val="Default Paragraph Font"/>
     <w:uiPriority w:val="1"/>
@@ -5861,7 +8029,7 @@
     <w:name w:val="Esempio"/>
     <w:basedOn w:val="Normale"/>
     <w:qFormat/>
-    <w:rsid w:val="00401727"/>
+    <w:rsid w:val="009D0033"/>
     <w:pPr>
       <w:pBdr>
         <w:top w:val="single" w:sz="4" w:space="1" w:color="auto" w:shadow="1"/>
@@ -5873,6 +8041,7 @@
     </w:pPr>
     <w:rPr>
       <w:rFonts w:ascii="Courier New" w:hAnsi="Courier New"/>
+      <w:noProof/>
       <w:sz w:val="20"/>
     </w:rPr>
   </w:style>
@@ -5941,11 +8110,34 @@
       <w:sz w:val="22"/>
     </w:rPr>
   </w:style>
+  <w:style w:type="character" w:customStyle="1" w:styleId="Titolo3Carattere">
+    <w:name w:val="Titolo 3 Carattere"/>
+    <w:basedOn w:val="Carpredefinitoparagrafo"/>
+    <w:link w:val="Titolo3"/>
+    <w:uiPriority w:val="9"/>
+    <w:rsid w:val="0076072E"/>
+    <w:rPr>
+      <w:rFonts w:asciiTheme="majorHAnsi" w:eastAsiaTheme="majorEastAsia" w:hAnsiTheme="majorHAnsi" w:cstheme="majorBidi"/>
+      <w:color w:val="0A2F40" w:themeColor="accent1" w:themeShade="7F"/>
+    </w:rPr>
+  </w:style>
+  <w:style w:type="character" w:styleId="Menzionenonrisolta">
+    <w:name w:val="Unresolved Mention"/>
+    <w:basedOn w:val="Carpredefinitoparagrafo"/>
+    <w:uiPriority w:val="99"/>
+    <w:semiHidden/>
+    <w:unhideWhenUsed/>
+    <w:rsid w:val="00AB4308"/>
+    <w:rPr>
+      <w:color w:val="605E5C"/>
+      <w:shd w:val="clear" w:color="auto" w:fill="E1DFDD"/>
+    </w:rPr>
+  </w:style>
 </w:styles>
 </file>
 
 <file path=word/glossary/document.xml><?xml version="1.0" encoding="utf-8"?>
-<w:glossaryDocument xmlns:wpc="http://schemas.microsoft.com/office/word/2010/wordprocessingCanvas" xmlns:cx="http://schemas.microsoft.com/office/drawing/2014/chartex" xmlns:cx1="http://schemas.microsoft.com/office/drawing/2015/9/8/chartex" xmlns:cx2="http://schemas.microsoft.com/office/drawing/2015/10/21/chartex" xmlns:cx3="http://schemas.microsoft.com/office/drawing/2016/5/9/chartex" xmlns:cx4="http://schemas.microsoft.com/office/drawing/2016/5/10/chartex" xmlns:cx5="http://schemas.microsoft.com/office/drawing/2016/5/11/chartex" xmlns:cx6="http://schemas.microsoft.com/office/drawing/2016/5/12/chartex" xmlns:cx7="http://schemas.microsoft.com/office/drawing/2016/5/13/chartex" xmlns:cx8="http://schemas.microsoft.com/office/drawing/2016/5/14/chartex" xmlns:mc="http://schemas.openxmlformats.org/markup-compatibility/2006" xmlns:aink="http://schemas.microsoft.com/office/drawing/2016/ink" xmlns:am3d="http://schemas.microsoft.com/office/drawing/2017/model3d" xmlns:o="urn:schemas-microsoft-com:office:office" xmlns:oel="http://schemas.microsoft.com/office/2019/extlst" xmlns:r="http://schemas.openxmlformats.org/officeDocument/2006/relationships" xmlns:m="http://schemas.openxmlformats.org/officeDocument/2006/math" xmlns:v="urn:schemas-microsoft-com:vml" xmlns:wp14="http://schemas.microsoft.com/office/word/2010/wordprocessingDrawing" xmlns:wp="http://schemas.openxmlformats.org/drawingml/2006/wordprocessingDrawing" xmlns:w10="urn:schemas-microsoft-com:office:word" xmlns:w="http://schemas.openxmlformats.org/wordprocessingml/2006/main" xmlns:w14="http://schemas.microsoft.com/office/word/2010/wordml" xmlns:w15="http://schemas.microsoft.com/office/word/2012/wordml" xmlns:w16cex="http://schemas.microsoft.com/office/word/2018/wordml/cex" xmlns:w16cid="http://schemas.microsoft.com/office/word/2016/wordml/cid" xmlns:w16="http://schemas.microsoft.com/office/word/2018/wordml" xmlns:w16du="http://schemas.microsoft.com/office/word/2023/wordml/word16du" xmlns:w16sdtdh="http://schemas.microsoft.com/office/word/2020/wordml/sdtdatahash" xmlns:w16sdtfl="http://schemas.microsoft.com/office/word/2024/wordml/sdtformatlock" xmlns:w16se="http://schemas.microsoft.com/office/word/2015/wordml/symex" xmlns:wpg="http://schemas.microsoft.com/office/word/2010/wordprocessingGroup" xmlns:wpi="http://schemas.microsoft.com/office/word/2010/wordprocessingInk" xmlns:wne="http://schemas.microsoft.com/office/word/2006/wordml" xmlns:wps="http://schemas.microsoft.com/office/word/2010/wordprocessingShape" mc:Ignorable="w14 w15 w16se w16cid w16 w16cex w16sdtdh w16sdtfl w16du wp14">
+<w:glossaryDocument xmlns:wpc="http://schemas.microsoft.com/office/word/2010/wordprocessingCanvas" xmlns:cx="http://schemas.microsoft.com/office/drawing/2014/chartex" xmlns:cx1="http://schemas.microsoft.com/office/drawing/2015/9/8/chartex" xmlns:cx2="http://schemas.microsoft.com/office/drawing/2015/10/21/chartex" xmlns:cx3="http://schemas.microsoft.com/office/drawing/2016/5/9/chartex" xmlns:cx4="http://schemas.microsoft.com/office/drawing/2016/5/10/chartex" xmlns:cx5="http://schemas.microsoft.com/office/drawing/2016/5/11/chartex" xmlns:cx6="http://schemas.microsoft.com/office/drawing/2016/5/12/chartex" xmlns:cx7="http://schemas.microsoft.com/office/drawing/2016/5/13/chartex" xmlns:cx8="http://schemas.microsoft.com/office/drawing/2016/5/14/chartex" xmlns:mc="http://schemas.openxmlformats.org/markup-compatibility/2006" xmlns:aink="http://schemas.microsoft.com/office/drawing/2016/ink" xmlns:am3d="http://schemas.microsoft.com/office/drawing/2017/model3d" xmlns:o="urn:schemas-microsoft-com:office:office" xmlns:oel="http://schemas.microsoft.com/office/2019/extlst" xmlns:r="http://schemas.openxmlformats.org/officeDocument/2006/relationships" xmlns:m="http://schemas.openxmlformats.org/officeDocument/2006/math" xmlns:v="urn:schemas-microsoft-com:vml" xmlns:wp14="http://schemas.microsoft.com/office/word/2010/wordprocessingDrawing" xmlns:wp="http://schemas.openxmlformats.org/drawingml/2006/wordprocessingDrawing" xmlns:w10="urn:schemas-microsoft-com:office:word" xmlns:w="http://schemas.openxmlformats.org/wordprocessingml/2006/main" xmlns:w14="http://schemas.microsoft.com/office/word/2010/wordml" xmlns:w15="http://schemas.microsoft.com/office/word/2012/wordml" xmlns:w16cex="http://schemas.microsoft.com/office/word/2018/wordml/cex" xmlns:w16cid="http://schemas.microsoft.com/office/word/2016/wordml/cid" xmlns:w16="http://schemas.microsoft.com/office/word/2018/wordml" xmlns:w16sdtdh="http://schemas.microsoft.com/office/word/2020/wordml/sdtdatahash" xmlns:w16se="http://schemas.microsoft.com/office/word/2015/wordml/symex" xmlns:wpg="http://schemas.microsoft.com/office/word/2010/wordprocessingGroup" xmlns:wpi="http://schemas.microsoft.com/office/word/2010/wordprocessingInk" xmlns:wne="http://schemas.microsoft.com/office/word/2006/wordml" xmlns:wps="http://schemas.microsoft.com/office/word/2010/wordprocessingShape" mc:Ignorable="w14 w15 w16se w16cid w16 w16cex w16sdtdh wp14">
   <w:docParts>
     <w:docPart>
       <w:docPartPr>
@@ -5978,7 +8170,7 @@
 </file>
 
 <file path=word/glossary/fontTable.xml><?xml version="1.0" encoding="utf-8"?>
-<w:fonts xmlns:mc="http://schemas.openxmlformats.org/markup-compatibility/2006" xmlns:r="http://schemas.openxmlformats.org/officeDocument/2006/relationships" xmlns:w="http://schemas.openxmlformats.org/wordprocessingml/2006/main" xmlns:w14="http://schemas.microsoft.com/office/word/2010/wordml" xmlns:w15="http://schemas.microsoft.com/office/word/2012/wordml" xmlns:w16cex="http://schemas.microsoft.com/office/word/2018/wordml/cex" xmlns:w16cid="http://schemas.microsoft.com/office/word/2016/wordml/cid" xmlns:w16="http://schemas.microsoft.com/office/word/2018/wordml" xmlns:w16du="http://schemas.microsoft.com/office/word/2023/wordml/word16du" xmlns:w16sdtdh="http://schemas.microsoft.com/office/word/2020/wordml/sdtdatahash" xmlns:w16sdtfl="http://schemas.microsoft.com/office/word/2024/wordml/sdtformatlock" xmlns:w16se="http://schemas.microsoft.com/office/word/2015/wordml/symex" mc:Ignorable="w14 w15 w16se w16cid w16 w16cex w16sdtdh w16sdtfl w16du">
+<w:fonts xmlns:mc="http://schemas.openxmlformats.org/markup-compatibility/2006" xmlns:r="http://schemas.openxmlformats.org/officeDocument/2006/relationships" xmlns:w="http://schemas.openxmlformats.org/wordprocessingml/2006/main" xmlns:w14="http://schemas.microsoft.com/office/word/2010/wordml" xmlns:w15="http://schemas.microsoft.com/office/word/2012/wordml" xmlns:w16cex="http://schemas.microsoft.com/office/word/2018/wordml/cex" xmlns:w16cid="http://schemas.microsoft.com/office/word/2016/wordml/cid" xmlns:w16="http://schemas.microsoft.com/office/word/2018/wordml" xmlns:w16sdtdh="http://schemas.microsoft.com/office/word/2020/wordml/sdtdatahash" xmlns:w16se="http://schemas.microsoft.com/office/word/2015/wordml/symex" mc:Ignorable="w14 w15 w16se w16cid w16 w16cex w16sdtdh">
   <w:font w:name="Symbol">
     <w:panose1 w:val="05050102010706020507"/>
     <w:charset w:val="02"/>
@@ -6040,18 +8232,11 @@
     <w:pitch w:val="variable"/>
     <w:sig w:usb0="E4002EFF" w:usb1="C200247B" w:usb2="00000009" w:usb3="00000000" w:csb0="000001FF" w:csb1="00000000"/>
   </w:font>
-  <w:font w:name="Calibri Light">
-    <w:panose1 w:val="020F0302020204030204"/>
-    <w:charset w:val="00"/>
-    <w:family w:val="swiss"/>
-    <w:pitch w:val="variable"/>
-    <w:sig w:usb0="E4002EFF" w:usb1="C200247B" w:usb2="00000009" w:usb3="00000000" w:csb0="000001FF" w:csb1="00000000"/>
-  </w:font>
 </w:fonts>
 </file>
 
 <file path=word/glossary/settings.xml><?xml version="1.0" encoding="utf-8"?>
-<w:settings xmlns:mc="http://schemas.openxmlformats.org/markup-compatibility/2006" xmlns:o="urn:schemas-microsoft-com:office:office" xmlns:r="http://schemas.openxmlformats.org/officeDocument/2006/relationships" xmlns:m="http://schemas.openxmlformats.org/officeDocument/2006/math" xmlns:v="urn:schemas-microsoft-com:vml" xmlns:w10="urn:schemas-microsoft-com:office:word" xmlns:w="http://schemas.openxmlformats.org/wordprocessingml/2006/main" xmlns:w14="http://schemas.microsoft.com/office/word/2010/wordml" xmlns:w15="http://schemas.microsoft.com/office/word/2012/wordml" xmlns:w16cex="http://schemas.microsoft.com/office/word/2018/wordml/cex" xmlns:w16cid="http://schemas.microsoft.com/office/word/2016/wordml/cid" xmlns:w16="http://schemas.microsoft.com/office/word/2018/wordml" xmlns:w16du="http://schemas.microsoft.com/office/word/2023/wordml/word16du" xmlns:w16sdtdh="http://schemas.microsoft.com/office/word/2020/wordml/sdtdatahash" xmlns:w16sdtfl="http://schemas.microsoft.com/office/word/2024/wordml/sdtformatlock" xmlns:w16se="http://schemas.microsoft.com/office/word/2015/wordml/symex" xmlns:sl="http://schemas.openxmlformats.org/schemaLibrary/2006/main" mc:Ignorable="w14 w15 w16se w16cid w16 w16cex w16sdtdh w16sdtfl w16du">
+<w:settings xmlns:mc="http://schemas.openxmlformats.org/markup-compatibility/2006" xmlns:o="urn:schemas-microsoft-com:office:office" xmlns:r="http://schemas.openxmlformats.org/officeDocument/2006/relationships" xmlns:m="http://schemas.openxmlformats.org/officeDocument/2006/math" xmlns:v="urn:schemas-microsoft-com:vml" xmlns:w10="urn:schemas-microsoft-com:office:word" xmlns:w="http://schemas.openxmlformats.org/wordprocessingml/2006/main" xmlns:w14="http://schemas.microsoft.com/office/word/2010/wordml" xmlns:w15="http://schemas.microsoft.com/office/word/2012/wordml" xmlns:w16cex="http://schemas.microsoft.com/office/word/2018/wordml/cex" xmlns:w16cid="http://schemas.microsoft.com/office/word/2016/wordml/cid" xmlns:w16="http://schemas.microsoft.com/office/word/2018/wordml" xmlns:w16sdtdh="http://schemas.microsoft.com/office/word/2020/wordml/sdtdatahash" xmlns:w16se="http://schemas.microsoft.com/office/word/2015/wordml/symex" xmlns:sl="http://schemas.openxmlformats.org/schemaLibrary/2006/main" mc:Ignorable="w14 w15 w16se w16cid w16 w16cex w16sdtdh">
   <w:view w:val="normal"/>
   <w:defaultTabStop w:val="708"/>
   <w:hyphenationZone w:val="283"/>
@@ -6068,12 +8253,20 @@
   <w:rsids>
     <w:rsidRoot w:val="009D6C4A"/>
     <w:rsid w:val="000309D9"/>
+    <w:rsid w:val="001A749F"/>
     <w:rsid w:val="001E6126"/>
     <w:rsid w:val="002A7640"/>
+    <w:rsid w:val="00511BC8"/>
     <w:rsid w:val="005F05A4"/>
     <w:rsid w:val="006B62CD"/>
     <w:rsid w:val="006F5ECB"/>
+    <w:rsid w:val="00853B21"/>
+    <w:rsid w:val="008C7631"/>
     <w:rsid w:val="009D6C4A"/>
+    <w:rsid w:val="00A635BC"/>
+    <w:rsid w:val="00AA1219"/>
+    <w:rsid w:val="00EE35BE"/>
+    <w:rsid w:val="00F60196"/>
     <w:rsid w:val="00F96DDE"/>
   </w:rsids>
   <m:mathPr>
@@ -6098,7 +8291,7 @@
 </file>
 
 <file path=word/glossary/styles.xml><?xml version="1.0" encoding="utf-8"?>
-<w:styles xmlns:mc="http://schemas.openxmlformats.org/markup-compatibility/2006" xmlns:r="http://schemas.openxmlformats.org/officeDocument/2006/relationships" xmlns:w="http://schemas.openxmlformats.org/wordprocessingml/2006/main" xmlns:w14="http://schemas.microsoft.com/office/word/2010/wordml" xmlns:w15="http://schemas.microsoft.com/office/word/2012/wordml" xmlns:w16cex="http://schemas.microsoft.com/office/word/2018/wordml/cex" xmlns:w16cid="http://schemas.microsoft.com/office/word/2016/wordml/cid" xmlns:w16="http://schemas.microsoft.com/office/word/2018/wordml" xmlns:w16du="http://schemas.microsoft.com/office/word/2023/wordml/word16du" xmlns:w16sdtdh="http://schemas.microsoft.com/office/word/2020/wordml/sdtdatahash" xmlns:w16sdtfl="http://schemas.microsoft.com/office/word/2024/wordml/sdtformatlock" xmlns:w16se="http://schemas.microsoft.com/office/word/2015/wordml/symex" mc:Ignorable="w14 w15 w16se w16cid w16 w16cex w16sdtdh w16sdtfl w16du">
+<w:styles xmlns:mc="http://schemas.openxmlformats.org/markup-compatibility/2006" xmlns:r="http://schemas.openxmlformats.org/officeDocument/2006/relationships" xmlns:w="http://schemas.openxmlformats.org/wordprocessingml/2006/main" xmlns:w14="http://schemas.microsoft.com/office/word/2010/wordml" xmlns:w15="http://schemas.microsoft.com/office/word/2012/wordml" xmlns:w16cex="http://schemas.microsoft.com/office/word/2018/wordml/cex" xmlns:w16cid="http://schemas.microsoft.com/office/word/2016/wordml/cid" xmlns:w16="http://schemas.microsoft.com/office/word/2018/wordml" xmlns:w16sdtdh="http://schemas.microsoft.com/office/word/2020/wordml/sdtdatahash" xmlns:w16se="http://schemas.microsoft.com/office/word/2015/wordml/symex" mc:Ignorable="w14 w15 w16se w16cid w16 w16cex w16sdtdh">
   <w:docDefaults>
     <w:rPrDefault>
       <w:rPr>
@@ -6533,7 +8726,7 @@
 </file>
 
 <file path=word/glossary/webSettings.xml><?xml version="1.0" encoding="utf-8"?>
-<w:webSettings xmlns:mc="http://schemas.openxmlformats.org/markup-compatibility/2006" xmlns:r="http://schemas.openxmlformats.org/officeDocument/2006/relationships" xmlns:w="http://schemas.openxmlformats.org/wordprocessingml/2006/main" xmlns:w14="http://schemas.microsoft.com/office/word/2010/wordml" xmlns:w15="http://schemas.microsoft.com/office/word/2012/wordml" xmlns:w16cex="http://schemas.microsoft.com/office/word/2018/wordml/cex" xmlns:w16cid="http://schemas.microsoft.com/office/word/2016/wordml/cid" xmlns:w16="http://schemas.microsoft.com/office/word/2018/wordml" xmlns:w16du="http://schemas.microsoft.com/office/word/2023/wordml/word16du" xmlns:w16sdtdh="http://schemas.microsoft.com/office/word/2020/wordml/sdtdatahash" xmlns:w16sdtfl="http://schemas.microsoft.com/office/word/2024/wordml/sdtformatlock" xmlns:w16se="http://schemas.microsoft.com/office/word/2015/wordml/symex" mc:Ignorable="w14 w15 w16se w16cid w16 w16cex w16sdtdh w16sdtfl w16du">
+<w:webSettings xmlns:mc="http://schemas.openxmlformats.org/markup-compatibility/2006" xmlns:r="http://schemas.openxmlformats.org/officeDocument/2006/relationships" xmlns:w="http://schemas.openxmlformats.org/wordprocessingml/2006/main" xmlns:w14="http://schemas.microsoft.com/office/word/2010/wordml" xmlns:w15="http://schemas.microsoft.com/office/word/2012/wordml" xmlns:w16cex="http://schemas.microsoft.com/office/word/2018/wordml/cex" xmlns:w16cid="http://schemas.microsoft.com/office/word/2016/wordml/cid" xmlns:w16="http://schemas.microsoft.com/office/word/2018/wordml" xmlns:w16sdtdh="http://schemas.microsoft.com/office/word/2020/wordml/sdtdatahash" xmlns:w16se="http://schemas.microsoft.com/office/word/2015/wordml/symex" mc:Ignorable="w14 w15 w16se w16cid w16 w16cex w16sdtdh">
   <w:optimizeForBrowser/>
   <w:allowPNG/>
 </w:webSettings>

</xml_diff>